<commit_message>
edit try except part in other files .
</commit_message>
<xml_diff>
--- a/پروژه فردی پایانترم نیمسال دوم 1404.docx
+++ b/پروژه فردی پایانترم نیمسال دوم 1404.docx
@@ -42,7 +42,7 @@
                     </pic:cNvPicPr>
                   </pic:nvPicPr>
                   <pic:blipFill>
-                    <a:blip r:embed="rId7">
+                    <a:blip r:embed="rId8">
                       <a:extLst>
                         <a:ext uri="{28A0092B-C50C-407E-A947-70E740481C1C}">
                           <a14:useLocalDpi xmlns:a14="http://schemas.microsoft.com/office/drawing/2010/main" val="0"/>
@@ -171,6 +171,14 @@
         </w:rPr>
         <w:t>دانشجو : امین امانی</w:t>
       </w:r>
+      <w:r>
+        <w:rPr>
+          <w:rFonts w:hint="cs"/>
+          <w:rtl/>
+          <w:lang w:bidi="fa-IR"/>
+        </w:rPr>
+        <w:t xml:space="preserve"> . شماره دانشجویی : 404442076</w:t>
+      </w:r>
     </w:p>
     <w:p>
       <w:pPr>
@@ -227,13 +235,3226 @@
       <w:pPr>
         <w:jc w:val="right"/>
         <w:rPr>
-          <w:rFonts w:hint="cs"/>
-          <w:lang w:bidi="fa-IR"/>
-        </w:rPr>
-      </w:pPr>
+          <w:rtl/>
+          <w:lang w:bidi="fa-IR"/>
+        </w:rPr>
+      </w:pPr>
+      <w:r>
+        <w:rPr>
+          <w:rFonts w:hint="cs"/>
+          <w:rtl/>
+          <w:lang w:bidi="fa-IR"/>
+        </w:rPr>
+        <w:t>1 . ابتدا ایجاد ریپازیتوری تو اکانت گیت هابم .</w:t>
+      </w:r>
+    </w:p>
+    <w:p>
+      <w:pPr>
+        <w:jc w:val="right"/>
+        <w:rPr>
+          <w:rtl/>
+          <w:lang w:bidi="fa-IR"/>
+        </w:rPr>
+      </w:pPr>
+      <w:r>
+        <w:rPr>
+          <w:rFonts w:hint="cs"/>
+          <w:rtl/>
+          <w:lang w:bidi="fa-IR"/>
+        </w:rPr>
+        <w:t xml:space="preserve">2 . ایجاد فایل ها و فولدر های لازم داخل فولدر زیپازیتوری </w:t>
+      </w:r>
+      <w:r>
+        <w:rPr>
+          <w:rFonts w:hint="cs"/>
+          <w:rtl/>
+          <w:lang w:bidi="fa-IR"/>
+        </w:rPr>
+        <w:t xml:space="preserve"> . </w:t>
+      </w:r>
+    </w:p>
+    <w:p>
+      <w:pPr>
+        <w:jc w:val="right"/>
+        <w:rPr>
+          <w:rtl/>
+          <w:lang w:bidi="fa-IR"/>
+        </w:rPr>
+      </w:pPr>
+      <w:r>
+        <w:rPr>
+          <w:rFonts w:hint="cs"/>
+          <w:rtl/>
+          <w:lang w:bidi="fa-IR"/>
+        </w:rPr>
+        <w:t xml:space="preserve">3 . نوشتن کلاس اهنگ (سانگ) داخل فایل جدای پایتون برای تبدیل هر یک ار اهنگ های فایل به یک شی پایتون . </w:t>
+      </w:r>
+    </w:p>
+    <w:p>
+      <w:pPr>
+        <w:jc w:val="right"/>
+        <w:rPr>
+          <w:rtl/>
+          <w:lang w:bidi="fa-IR"/>
+        </w:rPr>
+      </w:pPr>
+      <w:r>
+        <w:rPr>
+          <w:rFonts w:hint="cs"/>
+          <w:rtl/>
+          <w:lang w:bidi="fa-IR"/>
+        </w:rPr>
+        <w:t>4 . اضافه کردن شروط معتبر بودن سه تا از متغیر ها با استفاده از پراپرتی و ستر و گتر در شی گرایی پایتون .</w:t>
+      </w:r>
+    </w:p>
+    <w:p>
+      <w:pPr>
+        <w:jc w:val="right"/>
+        <w:rPr>
+          <w:color w:val="FF0000"/>
+          <w:rtl/>
+          <w:lang w:bidi="fa-IR"/>
+        </w:rPr>
+      </w:pPr>
+      <w:r>
+        <w:rPr>
+          <w:rFonts w:hint="cs"/>
+          <w:color w:val="FF0000"/>
+          <w:rtl/>
+          <w:lang w:bidi="fa-IR"/>
+        </w:rPr>
+        <w:t>استفاده از پراپرتی تو این جا به دو دلیل : عدم استفاده از پارانتز موقع استفاده و اعتبارسنجی برای جلوگیری ار مقادیر نامعتبر.</w:t>
+      </w:r>
+    </w:p>
+    <w:p>
+      <w:pPr>
+        <w:jc w:val="right"/>
+        <w:rPr>
+          <w:rtl/>
+          <w:lang w:bidi="fa-IR"/>
+        </w:rPr>
+      </w:pPr>
+      <w:r>
+        <w:rPr>
+          <w:rFonts w:hint="cs"/>
+          <w:rtl/>
+          <w:lang w:bidi="fa-IR"/>
+        </w:rPr>
+        <w:t xml:space="preserve">5 . نوشتن کلاس دیتا لودر داخل فایل دیتا لودر برای خواندن دیتا از فایل موجود و اضافه کردن دیتا به اخر ان . </w:t>
+      </w:r>
+    </w:p>
+    <w:p>
+      <w:pPr>
+        <w:jc w:val="right"/>
+        <w:rPr>
+          <w:rtl/>
+          <w:lang w:bidi="fa-IR"/>
+        </w:rPr>
+      </w:pPr>
+      <w:r>
+        <w:rPr>
+          <w:rFonts w:hint="cs"/>
+          <w:rtl/>
+          <w:lang w:bidi="fa-IR"/>
+        </w:rPr>
+        <w:t xml:space="preserve">6 . </w:t>
+      </w:r>
+      <w:r>
+        <w:rPr>
+          <w:rFonts w:hint="cs"/>
+          <w:rtl/>
+          <w:lang w:bidi="fa-IR"/>
+        </w:rPr>
+        <w:t xml:space="preserve">اضافه کردن متدی برای خواندن فایل اهنگ ها و اضافه کردن ها به یک لیست در ان کلاس . </w:t>
+      </w:r>
+    </w:p>
+    <w:p>
+      <w:pPr>
+        <w:jc w:val="right"/>
+        <w:rPr>
+          <w:color w:val="000000" w:themeColor="text1"/>
+          <w:rtl/>
+          <w:lang w:bidi="fa-IR"/>
+        </w:rPr>
+      </w:pPr>
+      <w:r>
+        <w:rPr>
+          <w:rFonts w:hint="cs"/>
+          <w:rtl/>
+          <w:lang w:bidi="fa-IR"/>
+        </w:rPr>
+        <w:t xml:space="preserve">7. اضافه کردن متد دیگری به کلاس دیتا لودر برای اضافه کردن اهنگ (ترک) جدید به انتهای فایل اهنگ ها </w:t>
+      </w:r>
+      <w:r>
+        <w:rPr>
+          <w:rFonts w:hint="cs"/>
+          <w:rtl/>
+          <w:lang w:bidi="fa-IR"/>
+        </w:rPr>
+        <w:t xml:space="preserve"> </w:t>
+      </w:r>
+      <w:r>
+        <w:rPr>
+          <w:rFonts w:hint="cs"/>
+          <w:rtl/>
+          <w:lang w:bidi="fa-IR"/>
+        </w:rPr>
+        <w:t>.</w:t>
+      </w:r>
+      <w:r>
+        <w:rPr>
+          <w:rFonts w:hint="cs"/>
+          <w:color w:val="000000" w:themeColor="text1"/>
+          <w:rtl/>
+          <w:lang w:bidi="fa-IR"/>
+        </w:rPr>
+        <w:t xml:space="preserve"> باید توجه کنیم که اهنگی که به این تابع میدیم تا اضافه کنه به لیست اهنگ هامون از جنس کلاس سانگی که قبلا د</w:t>
+      </w:r>
+      <w:r>
+        <w:rPr>
+          <w:rFonts w:hint="cs"/>
+          <w:color w:val="000000" w:themeColor="text1"/>
+          <w:rtl/>
+          <w:lang w:bidi="fa-IR"/>
+        </w:rPr>
+        <w:t>ر</w:t>
+      </w:r>
+      <w:r>
+        <w:rPr>
+          <w:rFonts w:hint="cs"/>
+          <w:color w:val="000000" w:themeColor="text1"/>
+          <w:rtl/>
+          <w:lang w:bidi="fa-IR"/>
+        </w:rPr>
+        <w:t xml:space="preserve">ست کردیم باشه و اول مشخصات اهنگ رو بگیریم و سپس یه شی اهنگ بسازیم بعد این شی رو پاس بدیم به تابع مدنظرمون . </w:t>
+      </w:r>
+    </w:p>
+    <w:p>
+      <w:pPr>
+        <w:jc w:val="right"/>
+        <w:rPr>
+          <w:lang w:bidi="fa-IR"/>
+        </w:rPr>
+      </w:pPr>
+      <w:r>
+        <w:rPr>
+          <w:rFonts w:hint="cs"/>
+          <w:rtl/>
+          <w:lang w:bidi="fa-IR"/>
+        </w:rPr>
+        <w:t xml:space="preserve">8 . میتوانستم خواندن همه 100.000 اهنگ از فایل را با استفاده از جنریتور هم انجام بدم ولی از انجا که در ماژول های بعدی و مرحله های بعدی به همه اهنگ ها در یک جا نیاز خواهیم داشت برای محاسبه میانگین و میانه و دیگر ابزار لازم و ... استفاده از لیست معمولی برای ذخیره انها هم از لحاظ حافظه و هم از لحاظ زمان به صرفه تر بود . </w:t>
+      </w:r>
+    </w:p>
+    <w:p>
+      <w:pPr>
+        <w:pStyle w:val="ListParagraph"/>
+        <w:ind w:left="1080"/>
+        <w:jc w:val="right"/>
+        <w:rPr>
+          <w:color w:val="FF0000"/>
+          <w:rtl/>
+          <w:lang w:bidi="fa-IR"/>
+        </w:rPr>
+      </w:pPr>
+      <w:r>
+        <w:rPr>
+          <w:rFonts w:hint="cs"/>
+          <w:color w:val="FF0000"/>
+          <w:rtl/>
+          <w:lang w:bidi="fa-IR"/>
+        </w:rPr>
+        <w:t xml:space="preserve">***این رو هم اضافه کنم که خوندن و نوشتن تو این ماژول رو همش رو با استفاده از امکانات و توابع کتابخانه سی اس وی انجام دادم و هندل کردم . </w:t>
+      </w:r>
+    </w:p>
+    <w:p>
+      <w:pPr>
+        <w:pStyle w:val="ListParagraph"/>
+        <w:ind w:left="1080"/>
+        <w:jc w:val="right"/>
+        <w:rPr>
+          <w:color w:val="FF0000"/>
+          <w:lang w:bidi="fa-IR"/>
+        </w:rPr>
+      </w:pPr>
+    </w:p>
+    <w:p>
+      <w:pPr>
+        <w:pStyle w:val="ListParagraph"/>
+        <w:ind w:left="1080"/>
+        <w:jc w:val="right"/>
+        <w:rPr>
+          <w:color w:val="7030A0"/>
+          <w:rtl/>
+          <w:lang w:bidi="fa-IR"/>
+        </w:rPr>
+      </w:pPr>
+      <w:r>
+        <w:rPr>
+          <w:rFonts w:hint="cs"/>
+          <w:color w:val="7030A0"/>
+          <w:rtl/>
+          <w:lang w:bidi="fa-IR"/>
+        </w:rPr>
+        <w:t>***یه چیزی که بعدا متوجه شدم باید به کلاس دیتا لودر اضافه کنم : دو متد یکی برای ذخیره همه تغییراتی</w:t>
+      </w:r>
+      <w:r>
+        <w:rPr>
+          <w:rFonts w:hint="cs"/>
+          <w:color w:val="7030A0"/>
+          <w:rtl/>
+          <w:lang w:bidi="fa-IR"/>
+        </w:rPr>
+        <w:t xml:space="preserve"> که</w:t>
+      </w:r>
+      <w:r>
+        <w:rPr>
+          <w:rFonts w:hint="cs"/>
+          <w:color w:val="7030A0"/>
+          <w:rtl/>
+          <w:lang w:bidi="fa-IR"/>
+        </w:rPr>
+        <w:t xml:space="preserve"> تا یه جایی</w:t>
+      </w:r>
+      <w:r>
+        <w:rPr>
+          <w:rFonts w:hint="cs"/>
+          <w:color w:val="7030A0"/>
+          <w:rtl/>
+          <w:lang w:bidi="fa-IR"/>
+        </w:rPr>
+        <w:t xml:space="preserve">  </w:t>
+      </w:r>
+      <w:r>
+        <w:rPr>
+          <w:rFonts w:hint="cs"/>
+          <w:color w:val="7030A0"/>
+          <w:rtl/>
+          <w:lang w:bidi="fa-IR"/>
+        </w:rPr>
+        <w:t xml:space="preserve">که خودمون بخوایم روی داده هامون انجام دادیم که اضافش کردم که میاد یه فایل سی اس وی جدید باز میکنه و لیستی که از اهنگ هامون داریم رو با استفاده از کتابخونه سی اس وی توی فایل جدیدمون مینویسه . دومین متد هم برای ریست کردن دیتا هست . از اول پروژه برام سوال بود که مثلا یک کاربر داده ها رو یجوری مرتب میکنه بعد نمودار ایناش رو چاپ میکنه بعد میخواد دوباره با یه روش دیگه ای از اول داده ها رو مرتب کنه !!! این متد برای حل این مشکله و خیلی سادست . میاد لیستی که داریم رو خالی میکنه بعد دوباره اهنگ های اولیه تو فایل دیتاست مون رو میریزه تو لیست </w:t>
+      </w:r>
+      <w:r>
+        <w:rPr>
+          <w:rFonts w:hint="cs"/>
+          <w:color w:val="7030A0"/>
+          <w:rtl/>
+          <w:lang w:bidi="fa-IR"/>
+        </w:rPr>
+        <w:t>...</w:t>
+      </w:r>
+    </w:p>
+    <w:p>
+      <w:pPr>
+        <w:jc w:val="right"/>
+        <w:rPr>
+          <w:rtl/>
+          <w:lang w:bidi="fa-IR"/>
+        </w:rPr>
+      </w:pPr>
+      <w:r>
+        <w:rPr>
+          <w:rFonts w:hint="cs"/>
+          <w:rtl/>
+          <w:lang w:bidi="fa-IR"/>
+        </w:rPr>
+        <w:t xml:space="preserve">9 . </w:t>
+      </w:r>
+      <w:r>
+        <w:rPr>
+          <w:rFonts w:hint="cs"/>
+          <w:rtl/>
+          <w:lang w:bidi="fa-IR"/>
+        </w:rPr>
+        <w:t xml:space="preserve">شروع نوشتن ماژول دیتا کلینیر و در ابتدا یه فرم درختی براش ساختم تا بعدا یکی یکی شاخه ها رو تکمیل کنم . </w:t>
+      </w:r>
+    </w:p>
+    <w:p>
+      <w:pPr>
+        <w:jc w:val="right"/>
+        <w:rPr>
+          <w:rtl/>
+          <w:lang w:bidi="fa-IR"/>
+        </w:rPr>
+      </w:pPr>
+      <w:r>
+        <w:rPr>
+          <w:rFonts w:hint="cs"/>
+          <w:rtl/>
+          <w:lang w:bidi="fa-IR"/>
+        </w:rPr>
+        <w:t>10 . اولین کلاس تو این ماژول هیچ قابلتی نداره و فقط نمادین و انتزاعیه .</w:t>
+      </w:r>
+    </w:p>
+    <w:p>
+      <w:pPr>
+        <w:jc w:val="right"/>
+        <w:rPr>
+          <w:rtl/>
+          <w:lang w:bidi="fa-IR"/>
+        </w:rPr>
+      </w:pPr>
+      <w:r>
+        <w:rPr>
+          <w:rFonts w:hint="cs"/>
+          <w:rtl/>
+          <w:lang w:bidi="fa-IR"/>
+        </w:rPr>
+        <w:t xml:space="preserve">11 . دومین کلاس تو این ماژول برای پرکردن داده های گمشده با استفاده از میانگین هستش که اول اومدم روی لیستی که قراره به تنها متد این کلاس پاس بدیم حرکت کردم و اون ویژگی از اهنگ ها رو که میخوایم روش تحقیقات انجام بدیم رو هم پاس میدم به این متد بعد با استفاده از دو تابع جذاب و جالب اماده پایتون برای شی گرایی به مقادیر این ویژگی هر اهنگ دسترسی پیدا میکنیم و اگر </w:t>
+      </w:r>
+      <w:r>
+        <w:rPr>
+          <w:rFonts w:hint="cs"/>
+          <w:rtl/>
+          <w:lang w:bidi="fa-IR"/>
+        </w:rPr>
+        <w:lastRenderedPageBreak/>
+        <w:t xml:space="preserve">گمشده بود یعنی خالی یا عدد صفر یا رشته صفر بود در نظر نمیگیریمش ولی بقیه رو به یه لیست جدید اضاقه میکنیم بعد با استفاده از کتابخونه نامپای پایتون میانگین لیست جدید رو میگیریم بعد دوباره روی عناصر اولیه حرکت میکنیم و اگر همچنان مقدار اون ویژگی گمشده به حساب میومد اون میانگین بدست اومده رو جایگزین مقدارش میکنیم ... . </w:t>
+      </w:r>
+    </w:p>
+    <w:p>
+      <w:pPr>
+        <w:jc w:val="right"/>
+        <w:rPr>
+          <w:rtl/>
+          <w:lang w:bidi="fa-IR"/>
+        </w:rPr>
+      </w:pPr>
+      <w:r>
+        <w:rPr>
+          <w:rFonts w:hint="cs"/>
+          <w:rtl/>
+          <w:lang w:bidi="fa-IR"/>
+        </w:rPr>
+        <w:t xml:space="preserve">12 . همه کارهای بالا روبرای میانه هم عینا انجام میدیم ولی با این تفاوت که از تابع میانه نامپای بجای تابع میانگین نامپای استفاده میکنیم و سومین کلاس هم ساختش تو این ماژول تموم میشه ... . </w:t>
+      </w:r>
+    </w:p>
+    <w:p>
+      <w:pPr>
+        <w:jc w:val="right"/>
+        <w:rPr>
+          <w:rtl/>
+          <w:lang w:bidi="fa-IR"/>
+        </w:rPr>
+      </w:pPr>
+      <w:r>
+        <w:rPr>
+          <w:rFonts w:hint="cs"/>
+          <w:rtl/>
+          <w:lang w:bidi="fa-IR"/>
+        </w:rPr>
+        <w:t xml:space="preserve">13 . </w:t>
+      </w:r>
+      <w:r>
+        <w:rPr>
+          <w:rFonts w:hint="cs"/>
+          <w:color w:val="FF0000"/>
+          <w:rtl/>
+          <w:lang w:bidi="fa-IR"/>
+        </w:rPr>
+        <w:t xml:space="preserve">و اما شاید بتونم بگم چالش اول تو این پروژه این مرحلس : </w:t>
+      </w:r>
+      <w:r>
+        <w:rPr>
+          <w:rFonts w:hint="cs"/>
+          <w:rtl/>
+          <w:lang w:bidi="fa-IR"/>
+        </w:rPr>
+        <w:t>متدی تو بخش جایگذاری داده های گمشده با استفاده از ابزار و امکانات کتابخانه اسکی لرن و ماشین لرنینگ . خیلی سردر گم بودم که از کجا باید شروع کنم و چجوری شروع کنم اصلا چی هست ... که بعد از سرچ و تحقیق شروع به نوشتنش کردم هر چند کوتاه بود و بیشتر از چند خط نشد فعلا . تو شورع اومدم یه لیست</w:t>
+      </w:r>
+      <w:r>
+        <w:rPr>
+          <w:rFonts w:hint="cs"/>
+          <w:rtl/>
+          <w:lang w:bidi="fa-IR"/>
+        </w:rPr>
+        <w:t xml:space="preserve"> 9 تایی</w:t>
+      </w:r>
+      <w:r>
+        <w:rPr>
+          <w:rFonts w:hint="cs"/>
+          <w:rtl/>
+          <w:lang w:bidi="fa-IR"/>
+        </w:rPr>
+        <w:t xml:space="preserve"> از اسم ویژگی هایی که عدد</w:t>
+      </w:r>
+      <w:r>
+        <w:rPr>
+          <w:rFonts w:hint="cs"/>
+          <w:rtl/>
+          <w:lang w:bidi="fa-IR"/>
+        </w:rPr>
+        <w:t xml:space="preserve">ی هستن ساختم بعد یه ماتریس خالی تعریف کردم که قرار بود همه مقادیر اعم از عدد یا گمشده ها (رشته خالی یا عدد صفر یا رشته صفر . که به متغیر پوچ تو نامپای تبدیلشون کردم تا ماشین بفهمه این متغیر گمشدس و باید پرش کنه) بعد اومدم با دو تا فور تو در تو روی لیست اهنگام با ویژگی هاشون حرکت کردم و کاری که بالا گفتم رو </w:t>
+      </w:r>
+      <w:r>
+        <w:rPr>
+          <w:rFonts w:hint="cs"/>
+          <w:rtl/>
+          <w:lang w:bidi="fa-IR"/>
+        </w:rPr>
+        <w:t>انجا</w:t>
+      </w:r>
+      <w:r>
+        <w:rPr>
+          <w:rFonts w:hint="cs"/>
+          <w:rtl/>
+          <w:lang w:bidi="fa-IR"/>
+        </w:rPr>
+        <w:t xml:space="preserve">م دادم اینطوری که هر سطر تو ماتریس نهاییم بشه برا یه اهنگ چون که تو ماشین هر سطر باید یک شی باشه و هر ستون بشه یه ویژگی از اون اهنگ که اگه گمشده بود بجاش پوچ میزارم . </w:t>
+      </w:r>
+      <w:r>
+        <w:rPr>
+          <w:rFonts w:hint="cs"/>
+          <w:rtl/>
+          <w:lang w:bidi="fa-IR"/>
+        </w:rPr>
+        <w:t xml:space="preserve">خب بعدش اومدم ماشینمو ساختم و تو خط بعدی که مهمترین خط این متد هست با استفاده از متد فیت ترنسفرم به ماشینم یاد دادم که با استفاده از پنج تا از نزدیکترین همسایه ها داده های گمشده رو جایگذاری کنه . و بعد تو مرحله اخر اومدم یه ماتریس با استفاده ماشینم ساختم که ماتریس اولیه رو بهش ورودی دادم و تو ماتریس ساخته شده نهایی هیچ داده و متغیری پوچ یا همون گمشده نیست و همه مقدار دارن . و در نهایت دوباره با استفاده ار دو تا حلقه فور تو در تو روی ماتریس جدید حرکت کردم . مقادیر جدید رو توی لیست اهنگ هام که به این تابع ورودی داده بودم اپدیت کردم . </w:t>
+      </w:r>
+    </w:p>
+    <w:p>
+      <w:pPr>
+        <w:jc w:val="right"/>
+        <w:rPr>
+          <w:rtl/>
+          <w:lang w:bidi="fa-IR"/>
+        </w:rPr>
+      </w:pPr>
+      <w:r>
+        <w:rPr>
+          <w:rFonts w:hint="cs"/>
+          <w:rtl/>
+          <w:lang w:bidi="fa-IR"/>
+        </w:rPr>
+        <w:t>و اما بخش جالب تو این مرحله نقض چند ریختی تو شی گرایی پایتون بود چون که چه تو کلاس پایه و چه تو کلاس های قبلی به تنها متد این کلاس ها توی ورودی اسم ویژگی مدنظرمون رو میدادیم ولی تو اینجا که داریم با ماشین کار میکنیم نمیشد اسم ویژگی ورودی داد چون باید</w:t>
+      </w:r>
+      <w:r>
+        <w:rPr>
+          <w:rFonts w:hint="cs"/>
+          <w:rtl/>
+          <w:lang w:bidi="fa-IR"/>
+        </w:rPr>
+        <w:t xml:space="preserve"> روی</w:t>
+      </w:r>
+      <w:r>
+        <w:rPr>
+          <w:rFonts w:hint="cs"/>
+          <w:rtl/>
+          <w:lang w:bidi="fa-IR"/>
+        </w:rPr>
+        <w:t xml:space="preserve"> داده های گمشد</w:t>
+      </w:r>
+      <w:r>
+        <w:rPr>
+          <w:rFonts w:hint="cs"/>
+          <w:rtl/>
+          <w:lang w:bidi="fa-IR"/>
+        </w:rPr>
+        <w:t>ه</w:t>
+      </w:r>
+      <w:r>
+        <w:rPr>
+          <w:rFonts w:hint="cs"/>
+          <w:rtl/>
+          <w:lang w:bidi="fa-IR"/>
+        </w:rPr>
+        <w:t xml:space="preserve"> با ماشین عملیات ان</w:t>
+      </w:r>
+      <w:r>
+        <w:rPr>
+          <w:rFonts w:hint="cs"/>
+          <w:rtl/>
+          <w:lang w:bidi="fa-IR"/>
+        </w:rPr>
+        <w:t>ج</w:t>
+      </w:r>
+      <w:r>
+        <w:rPr>
+          <w:rFonts w:hint="cs"/>
+          <w:rtl/>
+          <w:lang w:bidi="fa-IR"/>
+        </w:rPr>
+        <w:t xml:space="preserve">ام بدیم و </w:t>
+      </w:r>
+      <w:r>
+        <w:rPr>
+          <w:rFonts w:hint="cs"/>
+          <w:rtl/>
+          <w:lang w:bidi="fa-IR"/>
+        </w:rPr>
+        <w:t>پنج</w:t>
+      </w:r>
+      <w:r>
+        <w:rPr>
+          <w:rFonts w:hint="cs"/>
+          <w:rtl/>
+          <w:lang w:bidi="fa-IR"/>
+        </w:rPr>
+        <w:t xml:space="preserve"> تا از نزدیکترین همسایه های یه اهنگ دارای داده گمشده تو برخی ویژگی ها رو پیدا کنیم و ماشین اون داده گمشده رو بدس</w:t>
+      </w:r>
+      <w:r>
+        <w:rPr>
+          <w:rFonts w:hint="cs"/>
+          <w:rtl/>
+          <w:lang w:bidi="fa-IR"/>
+        </w:rPr>
+        <w:t>ت</w:t>
+      </w:r>
+      <w:r>
+        <w:rPr>
+          <w:rFonts w:hint="cs"/>
+          <w:rtl/>
+          <w:lang w:bidi="fa-IR"/>
+        </w:rPr>
+        <w:t xml:space="preserve"> بیاره پس به همین خاطر برای تشخیص همسایه های نزدیک باید </w:t>
+      </w:r>
+      <w:r>
+        <w:rPr>
+          <w:rFonts w:hint="cs"/>
+          <w:rtl/>
+          <w:lang w:bidi="fa-IR"/>
+        </w:rPr>
+        <w:t>ه</w:t>
+      </w:r>
+      <w:r>
+        <w:rPr>
+          <w:rFonts w:hint="cs"/>
+          <w:rtl/>
+          <w:lang w:bidi="fa-IR"/>
+        </w:rPr>
+        <w:t xml:space="preserve">مه ویژگی های عددی رو در نظر بگیریم </w:t>
+      </w:r>
+      <w:r>
+        <w:rPr>
+          <w:rFonts w:hint="cs"/>
+          <w:rtl/>
+          <w:lang w:bidi="fa-IR"/>
+        </w:rPr>
+        <w:t xml:space="preserve">. </w:t>
+      </w:r>
+    </w:p>
+    <w:p>
+      <w:pPr>
+        <w:jc w:val="right"/>
+        <w:rPr>
+          <w:color w:val="000000" w:themeColor="text1"/>
+          <w:rtl/>
+          <w:lang w:bidi="fa-IR"/>
+        </w:rPr>
+      </w:pPr>
+      <w:r>
+        <w:rPr>
+          <w:rFonts w:hint="cs"/>
+          <w:rtl/>
+          <w:lang w:bidi="fa-IR"/>
+        </w:rPr>
+        <w:t xml:space="preserve">این </w:t>
+      </w:r>
+      <w:r>
+        <w:rPr>
+          <w:rFonts w:hint="cs"/>
+          <w:color w:val="FF0000"/>
+          <w:rtl/>
+          <w:lang w:bidi="fa-IR"/>
+        </w:rPr>
+        <w:t xml:space="preserve">ارور </w:t>
+      </w:r>
+      <w:r>
+        <w:rPr>
+          <w:rFonts w:hint="cs"/>
+          <w:color w:val="000000" w:themeColor="text1"/>
+          <w:rtl/>
+          <w:lang w:bidi="fa-IR"/>
+        </w:rPr>
+        <w:t xml:space="preserve">رو میداد : </w:t>
+      </w:r>
+    </w:p>
+    <w:p>
+      <w:pPr>
+        <w:jc w:val="right"/>
+        <w:rPr>
+          <w:rtl/>
+          <w:lang w:bidi="fa-IR"/>
+        </w:rPr>
+      </w:pPr>
+      <w:r>
+        <w:rPr>
+          <w:noProof/>
+        </w:rPr>
+        <w:drawing>
+          <wp:inline distT="0" distB="0" distL="0" distR="0" wp14:anchorId="179556C0" wp14:editId="06476C06">
+            <wp:extent cx="5943600" cy="837565"/>
+            <wp:effectExtent l="0" t="0" r="0" b="635"/>
+            <wp:docPr id="2" name="Picture 2"/>
+            <wp:cNvGraphicFramePr>
+              <a:graphicFrameLocks xmlns:a="http://schemas.openxmlformats.org/drawingml/2006/main" noChangeAspect="1"/>
+            </wp:cNvGraphicFramePr>
+            <a:graphic xmlns:a="http://schemas.openxmlformats.org/drawingml/2006/main">
+              <a:graphicData uri="http://schemas.openxmlformats.org/drawingml/2006/picture">
+                <pic:pic xmlns:pic="http://schemas.openxmlformats.org/drawingml/2006/picture">
+                  <pic:nvPicPr>
+                    <pic:cNvPr id="0" name="Picture 1"/>
+                    <pic:cNvPicPr>
+                      <a:picLocks noChangeAspect="1" noChangeArrowheads="1"/>
+                    </pic:cNvPicPr>
+                  </pic:nvPicPr>
+                  <pic:blipFill>
+                    <a:blip r:embed="rId9">
+                      <a:extLst>
+                        <a:ext uri="{28A0092B-C50C-407E-A947-70E740481C1C}">
+                          <a14:useLocalDpi xmlns:a14="http://schemas.microsoft.com/office/drawing/2010/main" val="0"/>
+                        </a:ext>
+                      </a:extLst>
+                    </a:blip>
+                    <a:srcRect/>
+                    <a:stretch>
+                      <a:fillRect/>
+                    </a:stretch>
+                  </pic:blipFill>
+                  <pic:spPr bwMode="auto">
+                    <a:xfrm>
+                      <a:off x="0" y="0"/>
+                      <a:ext cx="5943600" cy="837565"/>
+                    </a:xfrm>
+                    <a:prstGeom prst="rect">
+                      <a:avLst/>
+                    </a:prstGeom>
+                    <a:noFill/>
+                    <a:ln>
+                      <a:noFill/>
+                    </a:ln>
+                  </pic:spPr>
+                </pic:pic>
+              </a:graphicData>
+            </a:graphic>
+          </wp:inline>
+        </w:drawing>
+      </w:r>
+    </w:p>
+    <w:p>
+      <w:pPr>
+        <w:jc w:val="right"/>
+        <w:rPr>
+          <w:rtl/>
+          <w:lang w:bidi="fa-IR"/>
+        </w:rPr>
+      </w:pPr>
+      <w:r>
+        <w:rPr>
+          <w:rFonts w:hint="cs"/>
+          <w:rtl/>
+          <w:lang w:bidi="fa-IR"/>
+        </w:rPr>
+        <w:t>که از این راه حل استفاده کردم و حل شد :</w:t>
+      </w:r>
+    </w:p>
+    <w:p>
+      <w:pPr>
+        <w:jc w:val="right"/>
+        <w:rPr>
+          <w:lang w:bidi="fa-IR"/>
+        </w:rPr>
+      </w:pPr>
+      <w:r>
+        <w:rPr>
+          <w:noProof/>
+        </w:rPr>
+        <w:drawing>
+          <wp:inline distT="0" distB="0" distL="0" distR="0" wp14:anchorId="06DB2A78" wp14:editId="17A64C56">
+            <wp:extent cx="5394960" cy="525780"/>
+            <wp:effectExtent l="0" t="0" r="0" b="7620"/>
+            <wp:docPr id="3" name="Picture 3"/>
+            <wp:cNvGraphicFramePr>
+              <a:graphicFrameLocks xmlns:a="http://schemas.openxmlformats.org/drawingml/2006/main" noChangeAspect="1"/>
+            </wp:cNvGraphicFramePr>
+            <a:graphic xmlns:a="http://schemas.openxmlformats.org/drawingml/2006/main">
+              <a:graphicData uri="http://schemas.openxmlformats.org/drawingml/2006/picture">
+                <pic:pic xmlns:pic="http://schemas.openxmlformats.org/drawingml/2006/picture">
+                  <pic:nvPicPr>
+                    <pic:cNvPr id="0" name="Picture 3"/>
+                    <pic:cNvPicPr>
+                      <a:picLocks noChangeAspect="1" noChangeArrowheads="1"/>
+                    </pic:cNvPicPr>
+                  </pic:nvPicPr>
+                  <pic:blipFill>
+                    <a:blip r:embed="rId10">
+                      <a:extLst>
+                        <a:ext uri="{28A0092B-C50C-407E-A947-70E740481C1C}">
+                          <a14:useLocalDpi xmlns:a14="http://schemas.microsoft.com/office/drawing/2010/main" val="0"/>
+                        </a:ext>
+                      </a:extLst>
+                    </a:blip>
+                    <a:srcRect/>
+                    <a:stretch>
+                      <a:fillRect/>
+                    </a:stretch>
+                  </pic:blipFill>
+                  <pic:spPr bwMode="auto">
+                    <a:xfrm>
+                      <a:off x="0" y="0"/>
+                      <a:ext cx="5394960" cy="525780"/>
+                    </a:xfrm>
+                    <a:prstGeom prst="rect">
+                      <a:avLst/>
+                    </a:prstGeom>
+                    <a:noFill/>
+                    <a:ln>
+                      <a:noFill/>
+                    </a:ln>
+                  </pic:spPr>
+                </pic:pic>
+              </a:graphicData>
+            </a:graphic>
+          </wp:inline>
+        </w:drawing>
+      </w:r>
+    </w:p>
+    <w:p>
+      <w:pPr>
+        <w:rPr>
+          <w:lang w:bidi="fa-IR"/>
+        </w:rPr>
+      </w:pPr>
+      <w:r>
+        <w:rPr>
+          <w:rFonts w:hint="cs"/>
+          <w:rtl/>
+          <w:lang w:bidi="fa-IR"/>
+        </w:rPr>
+        <w:t xml:space="preserve">           </w:t>
+      </w:r>
+      <w:r>
+        <w:rPr>
+          <w:lang w:bidi="fa-IR"/>
+        </w:rPr>
+        <w:t>………………………………………………………………………………………………………………………………………………………</w:t>
+      </w:r>
+    </w:p>
+    <w:p>
+      <w:pPr>
+        <w:jc w:val="right"/>
+        <w:rPr>
+          <w:rtl/>
+          <w:lang w:bidi="fa-IR"/>
+        </w:rPr>
+      </w:pPr>
+      <w:r>
+        <w:rPr>
+          <w:rFonts w:hint="cs"/>
+          <w:rtl/>
+          <w:lang w:bidi="fa-IR"/>
+        </w:rPr>
+        <w:t xml:space="preserve">14 . خب حالا بخش مدیریت داده های پرت رو شروع میکنیم . کلاس والد یا همون کلاس پایه تو اینجا هم مث بخش قبلی فقط یه چیز نمادین و انتزاعی و ظاهریه و فقط دارای یک متد با بدنه خالی هستش . </w:t>
+      </w:r>
+    </w:p>
+    <w:p>
+      <w:pPr>
+        <w:jc w:val="right"/>
+        <w:rPr>
+          <w:rtl/>
+          <w:lang w:bidi="fa-IR"/>
+        </w:rPr>
+      </w:pPr>
+      <w:r>
+        <w:rPr>
+          <w:rFonts w:hint="cs"/>
+          <w:rtl/>
+          <w:lang w:bidi="fa-IR"/>
+        </w:rPr>
+        <w:t xml:space="preserve">15 . اولین زیر کلاس تو این بخش مربوط به مدیریت داده های پرت با استفاده از دامنه میان چارکی هستش . بخش خوندن و اپدیت کردن لیست اهنگ ها دقیقا شبیه کلاس ها و بخش های قبلی هست . به اینصورت که ابتدا </w:t>
+      </w:r>
+      <w:r>
+        <w:rPr>
+          <w:rFonts w:hint="cs"/>
+          <w:rtl/>
+          <w:lang w:bidi="fa-IR"/>
+        </w:rPr>
+        <w:t>یه لیست خالی میسازیم بعد روی لیست اهنگ ها حرکت میکنیم و اون ویژگی که به تنها متد کلاسمون پاس دادیم و میخونیم و به اون لیست خالی اضافه میکنیم . بعدا با استفاده از توابع اماده پکیج نامپای تو پایتون ابتدا چارک اول لیست و سپس چارک سوم لیست را بدست می اوریم . در متغیر های عددی ذخیره میکنیم سپس با تفاضل این دو مقدار از هم _ دامنه میان چارکی را بدست می اوریم . سپس عدد 1.5 را در دامنه ضرب میکنیم و ان را از چارک اول کم میکنیم تا شروع دا</w:t>
+      </w:r>
+      <w:r>
+        <w:rPr>
+          <w:rFonts w:hint="cs"/>
+          <w:rtl/>
+          <w:lang w:bidi="fa-IR"/>
+        </w:rPr>
+        <w:t>م</w:t>
+      </w:r>
+      <w:r>
+        <w:rPr>
+          <w:rFonts w:hint="cs"/>
+          <w:rtl/>
+          <w:lang w:bidi="fa-IR"/>
+        </w:rPr>
+        <w:t xml:space="preserve">نه یا همان حداقل مقدار مجاز بدست میاد . برای حداکثر مقدار مجاز هم چارک </w:t>
+      </w:r>
+      <w:r>
+        <w:rPr>
+          <w:rFonts w:hint="cs"/>
+          <w:rtl/>
+          <w:lang w:bidi="fa-IR"/>
+        </w:rPr>
+        <w:lastRenderedPageBreak/>
+        <w:t>سوم را علاوه ضرب</w:t>
+      </w:r>
+      <w:r>
+        <w:rPr>
+          <w:rFonts w:hint="cs"/>
+          <w:rtl/>
+          <w:lang w:bidi="fa-IR"/>
+        </w:rPr>
+        <w:t xml:space="preserve"> دامنه</w:t>
+      </w:r>
+      <w:r>
+        <w:rPr>
+          <w:rFonts w:hint="cs"/>
+          <w:rtl/>
+          <w:lang w:bidi="fa-IR"/>
+        </w:rPr>
+        <w:t xml:space="preserve"> د</w:t>
+      </w:r>
+      <w:r>
+        <w:rPr>
+          <w:rFonts w:hint="cs"/>
+          <w:rtl/>
+          <w:lang w:bidi="fa-IR"/>
+        </w:rPr>
+        <w:t>ر</w:t>
+      </w:r>
+      <w:r>
+        <w:rPr>
+          <w:rFonts w:hint="cs"/>
+          <w:rtl/>
+          <w:lang w:bidi="fa-IR"/>
+        </w:rPr>
+        <w:t xml:space="preserve"> عدد 1.5 و دامنه . بدست می اوریم . سپس دوباره با حلقه ها روی لیست اهنگ ها حرکت میکنیم و اگر ویژگی مدنظر تو یه اهنگ بیشتر از حداکثر مقدار مجاز بود داده پرت به حساب امده و ان را برابر با حداکثر مقدار مجاز قرار میدیم و یا اگر کمتر از حداقل مقدار مجاز بود داده پرت به حساب امده و  ان را برابر با حداقل مقدار مجاز قرار میدیم  . </w:t>
+      </w:r>
+    </w:p>
+    <w:p>
+      <w:pPr>
+        <w:jc w:val="right"/>
+        <w:rPr>
+          <w:rtl/>
+          <w:lang w:bidi="fa-IR"/>
+        </w:rPr>
+      </w:pPr>
+      <w:r>
+        <w:rPr>
+          <w:rFonts w:hint="cs"/>
+          <w:rtl/>
+          <w:lang w:bidi="fa-IR"/>
+        </w:rPr>
+        <w:t xml:space="preserve">16 . </w:t>
+      </w:r>
+      <w:r>
+        <w:rPr>
+          <w:rFonts w:hint="cs"/>
+          <w:rtl/>
+          <w:lang w:bidi="fa-IR"/>
+        </w:rPr>
+        <w:t xml:space="preserve">و اما یه بخش جذاب دیگه ... زیر کلاس دوم تو بخش مدیریت داده های پرت که با استفاده از چیزی بنام </w:t>
+      </w:r>
+      <w:r>
+        <w:rPr>
+          <w:rFonts w:hint="cs"/>
+          <w:color w:val="FF0000"/>
+          <w:rtl/>
+          <w:lang w:bidi="fa-IR"/>
+        </w:rPr>
+        <w:t>نمره استاندارد</w:t>
+      </w:r>
+      <w:r>
+        <w:rPr>
+          <w:rFonts w:hint="cs"/>
+          <w:rtl/>
+          <w:lang w:bidi="fa-IR"/>
+        </w:rPr>
+        <w:t xml:space="preserve"> انجام میشد نمیدونم اسمشو بذارم یه </w:t>
+      </w:r>
+      <w:r>
+        <w:rPr>
+          <w:rFonts w:hint="cs"/>
+          <w:color w:val="FF0000"/>
+          <w:rtl/>
+          <w:lang w:bidi="fa-IR"/>
+        </w:rPr>
+        <w:t>چالش</w:t>
+      </w:r>
+      <w:r>
+        <w:rPr>
+          <w:rFonts w:hint="cs"/>
+          <w:rtl/>
+          <w:lang w:bidi="fa-IR"/>
+        </w:rPr>
+        <w:t xml:space="preserve"> تو این پروژه یا نه ؟! چون هیچ چیزی از این روش نمیدونستم و بعد خوندن و سرچ و تحقیق در موردش چیز زیاد سخت و طاقت فرسایی به نظر نیومد بلکه جالب بود بنظرم ... اول یه خلاصه بگم که این روش چیه اصلا ؟؟</w:t>
+      </w:r>
+    </w:p>
+    <w:p>
+      <w:pPr>
+        <w:jc w:val="right"/>
+        <w:rPr>
+          <w:color w:val="538135" w:themeColor="accent6" w:themeShade="BF"/>
+          <w:rtl/>
+          <w:lang w:bidi="fa-IR"/>
+        </w:rPr>
+      </w:pPr>
+      <w:r>
+        <w:rPr>
+          <w:rFonts w:hint="cs"/>
+          <w:color w:val="0070C0"/>
+          <w:rtl/>
+          <w:lang w:bidi="fa-IR"/>
+        </w:rPr>
+        <w:t xml:space="preserve">معرفی خلاصه وار روش </w:t>
+      </w:r>
+      <w:r>
+        <w:rPr>
+          <w:rFonts w:hint="cs"/>
+          <w:color w:val="FF0000"/>
+          <w:rtl/>
+          <w:lang w:bidi="fa-IR"/>
+        </w:rPr>
+        <w:t xml:space="preserve">نمره استاندارد : </w:t>
+      </w:r>
+      <w:r>
+        <w:rPr>
+          <w:rFonts w:hint="cs"/>
+          <w:color w:val="538135" w:themeColor="accent6" w:themeShade="BF"/>
+          <w:rtl/>
+          <w:lang w:bidi="fa-IR"/>
+        </w:rPr>
+        <w:t xml:space="preserve">این روش یک ابزار اماری هوشمند برای سنجش میزان عجیب بودن بودن داده هاست در این روش ابتدا میانگین و انحراف معیار را حساب میکنیم </w:t>
+      </w:r>
+      <w:r>
+        <w:rPr>
+          <w:rFonts w:hint="cs"/>
+          <w:color w:val="538135" w:themeColor="accent6" w:themeShade="BF"/>
+          <w:rtl/>
+          <w:lang w:bidi="fa-IR"/>
+        </w:rPr>
+        <w:t xml:space="preserve">سپس طبق یک قانون جهانی امار مرز های بالا و پایین مجاز را روی فاصله سه برابری از انحراف معیار تنظیم میکند ( یا به عبارتی برای هر داده نمره استاندار ان را که از فرمول (داده - میانگین) تقسیم بر انحراف معیار بدست می اید را حساب میکنیم و اگر این عدد بین -3 و +3 بود یعنی داده پرت نیست در غیر این صورت داده پرت به حساب می اید ) و داده های پرت را به صورت خودکار به مرزهای قانونی تعیین شده کات و اصلاح میکند تا رفتار عجیب ان کل محاسبات و تحلیل های بعدی دیتابیس اسپاتیفای را خراب نکند ... من هم در این پروژه برای بهینه تر بودن و صرفه جویی در زمان و حافظه از محاسبه نمره استاندارد برای تک تک داده ها پرهیز کردم و با طرفین وسطین کردن فرمول ذکر شده بازه مجاز را با استفاده از اعداد -3 و +3 بدست اوردم . </w:t>
+      </w:r>
+    </w:p>
+    <w:p>
+      <w:pPr>
+        <w:jc w:val="right"/>
+        <w:rPr>
+          <w:color w:val="000000" w:themeColor="text1"/>
+          <w:rtl/>
+          <w:lang w:bidi="fa-IR"/>
+        </w:rPr>
+      </w:pPr>
+      <w:r>
+        <w:rPr>
+          <w:rFonts w:hint="cs"/>
+          <w:color w:val="000000" w:themeColor="text1"/>
+          <w:rtl/>
+          <w:lang w:bidi="fa-IR"/>
+        </w:rPr>
+        <w:t xml:space="preserve">خب حالا بعد از معرفی این روش به ادامه کارمون بپردازیم </w:t>
+      </w:r>
+      <w:r>
+        <w:rPr>
+          <w:rFonts w:hint="cs"/>
+          <w:color w:val="000000" w:themeColor="text1"/>
+          <w:rtl/>
+          <w:lang w:bidi="fa-IR"/>
+        </w:rPr>
+        <w:t xml:space="preserve">... بخش خوندن دیتا ها و داده ها و اپدیت کردن انها در لیست اولیه اهنگ ها دقیقا مثل زیر کلاس قبلی است </w:t>
+      </w:r>
+      <w:r>
+        <w:rPr>
+          <w:rFonts w:hint="cs"/>
+          <w:color w:val="000000" w:themeColor="text1"/>
+          <w:rtl/>
+          <w:lang w:bidi="fa-IR"/>
+        </w:rPr>
+        <w:t xml:space="preserve">. بقیه بخش ها هم مثل حالت قبل است فقط با این تفاوت که در کلاس حداقل و حداکثر مقدار مجاز را با استفاده از دامنه میان چارکی تعیین میکردیم ولی در این کلاس حداقل و حداکثر مقدار مجاز را با استفاده از فرمول نمره استاندارد که در بالا بهش اشاره کردم ( با استفاده از اعداد -3 و +3 ) تعیین میکنیم . </w:t>
+      </w:r>
+    </w:p>
+    <w:p>
+      <w:pPr>
+        <w:jc w:val="right"/>
+        <w:rPr>
+          <w:color w:val="000000" w:themeColor="text1"/>
+          <w:rtl/>
+          <w:lang w:bidi="fa-IR"/>
+        </w:rPr>
+      </w:pPr>
+      <w:r>
+        <w:rPr>
+          <w:rFonts w:hint="cs"/>
+          <w:color w:val="000000" w:themeColor="text1"/>
+          <w:rtl/>
+          <w:lang w:bidi="fa-IR"/>
+        </w:rPr>
+        <w:t xml:space="preserve">17 . </w:t>
+      </w:r>
+      <w:r>
+        <w:rPr>
+          <w:rFonts w:hint="cs"/>
+          <w:color w:val="000000" w:themeColor="text1"/>
+          <w:rtl/>
+          <w:lang w:bidi="fa-IR"/>
+        </w:rPr>
+        <w:t xml:space="preserve">خب نوبتی هم باشد نوبت رفتن به سراغ تکمیل فایل دیتا انالیز بود . تو بخش ما قراره دیتاست مون رو انالیز کنیم و چیز های اماری راجع بهش بدست اوریم و چند متد جدای دلخواه . تو این فایل من فقط یک کلاس بنام دیتاانالیز درست کردم که قراره متد های متعددی داشته باشه ... تنها متد جادویی تو این کلاس فقط کارش اینه که لیست اهنگ ها رو بگیره (اهنگ هایی که هر کدوم یک شی هستند) تا از تکرار این بخش تو متد های بعدی جلوگیری بشه . </w:t>
+      </w:r>
+    </w:p>
+    <w:p>
+      <w:pPr>
+        <w:jc w:val="right"/>
+        <w:rPr>
+          <w:color w:val="000000" w:themeColor="text1"/>
+          <w:rtl/>
+          <w:lang w:bidi="fa-IR"/>
+        </w:rPr>
+      </w:pPr>
+      <w:r>
+        <w:rPr>
+          <w:rFonts w:hint="cs"/>
+          <w:color w:val="000000" w:themeColor="text1"/>
+          <w:rtl/>
+          <w:lang w:bidi="fa-IR"/>
+        </w:rPr>
+        <w:t xml:space="preserve">18 . هفت متد اصلی اول تو این کلاس راجب محاسبات اماری داده ها بود . اول میخواستم تو این تحلیل هر کدوم از اونارو جدا جدا بنویسم بعد چون که خیلی شبیه هم بودند و فقط در دو یا چند فرمول و اسم تفاوت داشتند تصمیم گرفتم تصمیم همه اناه را در یک بخش اینجا بهتون توضیح بدم . اینجوریه که من هفت تا ویژگی مهم اماری داده ها رو بدست میارم : ( میانگین . میانه . واریانس . انحراف معیار . مد . ماکسیمم . مینیمم) . اول میایم تو ورودی تابع اسم ویژگی از اهنگ ها که میخوایم اینارو روشون حساب کنیم رو میگیریم بعد مثل همیشه روی لیست اهنگ ها حرکت میکنیم </w:t>
+      </w:r>
+      <w:r>
+        <w:rPr>
+          <w:rFonts w:hint="cs"/>
+          <w:color w:val="000000" w:themeColor="text1"/>
+          <w:rtl/>
+          <w:lang w:bidi="fa-IR"/>
+        </w:rPr>
+        <w:t xml:space="preserve">و اعداد مربوط به اون ویژگی ورودی داخل یه لیست میریزیم بعد لیست بوجود امده رو به ارری نامپای تبدیل میکنیم و بعد برای محاسبه متغیر های اماری از توابع اماده پکیج نامپای استفاده کردم . </w:t>
+      </w:r>
+    </w:p>
+    <w:p>
+      <w:pPr>
+        <w:jc w:val="right"/>
+        <w:rPr>
+          <w:color w:val="000000" w:themeColor="text1"/>
+          <w:rtl/>
+          <w:lang w:bidi="fa-IR"/>
+        </w:rPr>
+      </w:pPr>
+      <w:r>
+        <w:rPr>
+          <w:rFonts w:hint="cs"/>
+          <w:color w:val="000000" w:themeColor="text1"/>
+          <w:rtl/>
+          <w:lang w:bidi="fa-IR"/>
+        </w:rPr>
+        <w:t xml:space="preserve">19 . متد هشتم و نهم تو این فایل دو متد دلخواه برای </w:t>
+      </w:r>
+      <w:r>
+        <w:rPr>
+          <w:rFonts w:hint="cs"/>
+          <w:color w:val="000000" w:themeColor="text1"/>
+          <w:rtl/>
+          <w:lang w:bidi="fa-IR"/>
+        </w:rPr>
+        <w:t>فیلتر کردن اهنگ ها بودن اینطوری که یکیش فیلتر کردن توسط اسم هنرمند بود که اهنگ ها رو بر اساس اسم هنرمندی که کاربر ورودی میده هست و خروجیش یه لیست از اهنگ ها با هنرمند یکسان هست .</w:t>
+      </w:r>
+    </w:p>
+    <w:p>
+      <w:pPr>
+        <w:jc w:val="right"/>
+        <w:rPr>
+          <w:color w:val="000000" w:themeColor="text1"/>
+          <w:rtl/>
+          <w:lang w:bidi="fa-IR"/>
+        </w:rPr>
+      </w:pPr>
+      <w:r>
+        <w:rPr>
+          <w:rFonts w:hint="cs"/>
+          <w:color w:val="000000" w:themeColor="text1"/>
+          <w:rtl/>
+          <w:lang w:bidi="fa-IR"/>
+        </w:rPr>
+        <w:t xml:space="preserve">دومیش فیلتر کردن توسط ژانر بود که کاربر ژانر مورد علاقشو ورودی میداد و خروجی لیستی از همه اهنگ ها با اون  ژانر بود </w:t>
+      </w:r>
+    </w:p>
+    <w:p>
+      <w:pPr>
+        <w:ind w:left="360"/>
+        <w:jc w:val="right"/>
+        <w:rPr>
+          <w:color w:val="000000" w:themeColor="text1"/>
+          <w:rtl/>
+          <w:lang w:bidi="fa-IR"/>
+        </w:rPr>
+      </w:pPr>
+      <w:r>
+        <w:rPr>
+          <w:rFonts w:hint="cs"/>
+          <w:color w:val="000000" w:themeColor="text1"/>
+          <w:rtl/>
+          <w:lang w:bidi="fa-IR"/>
+        </w:rPr>
+        <w:t>*** میتوان تعداد اهنگ های خروجی  داخل لیست خروجی رو هم با یه ورودی دیگه به راحتی هندل کرد .</w:t>
+      </w:r>
+    </w:p>
+    <w:p>
+      <w:pPr>
+        <w:ind w:left="360"/>
+        <w:jc w:val="right"/>
+        <w:rPr>
+          <w:color w:val="000000" w:themeColor="text1"/>
+          <w:rtl/>
+          <w:lang w:bidi="fa-IR"/>
+        </w:rPr>
+      </w:pPr>
+      <w:r>
+        <w:rPr>
+          <w:rFonts w:hint="cs"/>
+          <w:color w:val="000000" w:themeColor="text1"/>
+          <w:rtl/>
+          <w:lang w:bidi="fa-IR"/>
+        </w:rPr>
+        <w:t xml:space="preserve">20 . </w:t>
+      </w:r>
+      <w:r>
+        <w:rPr>
+          <w:rFonts w:hint="cs"/>
+          <w:color w:val="000000" w:themeColor="text1"/>
+          <w:rtl/>
+          <w:lang w:bidi="fa-IR"/>
+        </w:rPr>
+        <w:t>متد بعدی راجب پیداکردن برترین اهنگ ها از لحاظ ویژگی که کاربر خودش ورودی میده به تعداد مدنظر کاربر . اینطوریه که تابع مون میاد لیست اهنگ هامون با استفاده از تابع اماده سورت نسبت به ویژگی مد نظر کاربر با استفاده از تابع ناشناس لامبدا از بزرگ به کوچک مرتب میکنه و میریزه داخل یه  لیست جدید بعد تعداد موردنظر کاربر رو از لیست جدید خروجی میده .</w:t>
+      </w:r>
+    </w:p>
+    <w:p>
+      <w:pPr>
+        <w:ind w:left="360"/>
+        <w:jc w:val="right"/>
+        <w:rPr>
+          <w:color w:val="000000" w:themeColor="text1"/>
+          <w:rtl/>
+          <w:lang w:bidi="fa-IR"/>
+        </w:rPr>
+      </w:pPr>
+      <w:r>
+        <w:rPr>
+          <w:rFonts w:hint="cs"/>
+          <w:color w:val="000000" w:themeColor="text1"/>
+          <w:rtl/>
+          <w:lang w:bidi="fa-IR"/>
+        </w:rPr>
+        <w:t xml:space="preserve">21 . </w:t>
+      </w:r>
+      <w:r>
+        <w:rPr>
+          <w:rFonts w:hint="cs"/>
+          <w:color w:val="000000" w:themeColor="text1"/>
+          <w:rtl/>
+          <w:lang w:bidi="fa-IR"/>
+        </w:rPr>
+        <w:t xml:space="preserve">متد اخر تو این کلاس برای پیشنهاد اهنگ به کاربر با اهنگ ورودی مورد علاقه کاربر و ویژگی مدنظر کاربر و همچنین تعدا اهنگی که میخواد دریافت کنه هستش . اینطوریه که اول میاد اون ویژگی اهنگ کاربر ور حساب میکنه و ذخیره میکنه بعد دوباره میاد لیست اهنگ ها رو مرتب میکنه ولی ایندفعه با تابع ناشناسی که کلیدش تفاوت مقدار اون ویژگی تو اهنگ با وقدار اون ویژگی تو اهنگ کاربر هستش . بعد تعداد اهنگ مدنظر کاربر رو به کاربر خروجی میده . </w:t>
+      </w:r>
+      <w:r>
+        <w:rPr>
+          <w:rFonts w:hint="cs"/>
+          <w:color w:val="000000" w:themeColor="text1"/>
+          <w:rtl/>
+          <w:lang w:bidi="fa-IR"/>
+        </w:rPr>
+        <w:t xml:space="preserve">تو اینجا هم اهنگی که پاس میدیم به این تابع باید از جنس شی کلاس سانگ باشه . </w:t>
+      </w:r>
+    </w:p>
+    <w:p>
+      <w:pPr>
+        <w:ind w:left="360"/>
+        <w:jc w:val="right"/>
+        <w:rPr>
+          <w:color w:val="FF0000"/>
+          <w:lang w:bidi="fa-IR"/>
+        </w:rPr>
+      </w:pPr>
+      <w:r>
+        <w:rPr>
+          <w:rFonts w:hint="cs"/>
+          <w:color w:val="FF0000"/>
+          <w:rtl/>
+          <w:lang w:bidi="fa-IR"/>
+        </w:rPr>
+        <w:lastRenderedPageBreak/>
+        <w:t>ی</w:t>
+      </w:r>
+      <w:r>
+        <w:rPr>
+          <w:rFonts w:hint="cs"/>
+          <w:color w:val="FF0000"/>
+          <w:rtl/>
+          <w:lang w:bidi="fa-IR"/>
+        </w:rPr>
+        <w:t xml:space="preserve">چیز جالب و شاید سردرگم کننده تو این بخش این بود که مثلا ما تو اکثر متد هامون یه لیست از اهنگ ها داشتیم و از اون خیلی استفاده میکردیم و در نهایت هم دوباره یه لیست از اهنگ ها برمیگردوندیم . چیزی که شاید مثل من برای خیلیا سوال باشه و فکرشون رو درگیر کنه اینه که تو این پروژه از اول هر اهنگ رو یک شی در نظر گرفتیم و با قوانین وامکانات و توابع شی گرایی باهاش رفتار کردیم و کار کردیم و مورد قابل توجه اینه که چطور قراره با یه لیستی از اهنگ ها که خروجی میدی در بخش های بعدی کار کنیم ؟! تو جواب باید بگم که واقعا هیچ فرقی با شی معمولی ندارن و موقع کار با اهنگ ها تو لیست خروجی هم دقیقا مثل قبل رفتار میکنیم و طبق قوانین اصلی شی گرایی میتوان به تمام اطلاعات و متد های اهنگ ها دسترسی پیدا کرد . </w:t>
+      </w:r>
+    </w:p>
+    <w:p>
+      <w:pPr>
+        <w:ind w:left="360"/>
+        <w:jc w:val="right"/>
+        <w:rPr>
+          <w:color w:val="000000" w:themeColor="text1"/>
+          <w:rtl/>
+          <w:lang w:bidi="fa-IR"/>
+        </w:rPr>
+      </w:pPr>
+      <w:r>
+        <w:rPr>
+          <w:rFonts w:hint="cs"/>
+          <w:color w:val="000000" w:themeColor="text1"/>
+          <w:rtl/>
+          <w:lang w:bidi="fa-IR"/>
+        </w:rPr>
+        <w:t xml:space="preserve">22 . </w:t>
+      </w:r>
+      <w:r>
+        <w:rPr>
+          <w:rFonts w:hint="cs"/>
+          <w:color w:val="000000" w:themeColor="text1"/>
+          <w:rtl/>
+          <w:lang w:bidi="fa-IR"/>
+        </w:rPr>
+        <w:t xml:space="preserve">خب الان دیگه وقتشه بریم سراغ تکمیل فایل جذاب دیتاویژولایزر که قراره توش رسم نمودار ها رو تکمیل کنیم ... ففط یه کلاس با متد های متفاوت داخل این فایل خواهیم داشت . داخل متد این ایت این کلاس فقط داریم لیست اهنگ رو ورودی میدیم که تو بخش های بعدی که قراره لازمش داشته باشیم دیگه تکرار نکنیمش ... و اما متد های بعدی که قراره جلو تر راجب تک تک شون بحث کنیم درباره رسم انواع نمودار هاس : نمودار باکس پلات و </w:t>
+      </w:r>
+      <w:r>
+        <w:rPr>
+          <w:rFonts w:hint="cs"/>
+          <w:color w:val="000000" w:themeColor="text1"/>
+          <w:rtl/>
+          <w:lang w:bidi="fa-IR"/>
+        </w:rPr>
+        <w:t>اسکتر پلات و ماتریس همبستگی .</w:t>
+      </w:r>
+    </w:p>
+    <w:p>
+      <w:pPr>
+        <w:ind w:left="360"/>
+        <w:jc w:val="right"/>
+        <w:rPr>
+          <w:color w:val="000000" w:themeColor="text1"/>
+          <w:rtl/>
+          <w:lang w:bidi="fa-IR"/>
+        </w:rPr>
+      </w:pPr>
+      <w:r>
+        <w:rPr>
+          <w:rFonts w:hint="cs"/>
+          <w:color w:val="000000" w:themeColor="text1"/>
+          <w:rtl/>
+          <w:lang w:bidi="fa-IR"/>
+        </w:rPr>
+        <w:t xml:space="preserve">23 . اولین متد راجب رسم نمودار باکس پلات یا همون نمودار جعبه ای هستش که قراره یبار قبل تمیزکاری و یبار بعد تمیزکاری نمایشش بدیم تو خروجی . این تابع مون دو تا ورودی میگیره یکیش ویژگی ای از اهنگ هاس که میخوایم نمودار رو دربارش رسم کنیم و یکیش هم یه رشتس که مشخص میکنه چجوری </w:t>
+      </w:r>
+      <w:r>
+        <w:rPr>
+          <w:rFonts w:hint="cs"/>
+          <w:color w:val="000000" w:themeColor="text1"/>
+          <w:rtl/>
+          <w:lang w:bidi="fa-IR"/>
+        </w:rPr>
+        <w:t xml:space="preserve">داده ها رو تمیزکاری کردیم و اینکه میگه نمودار نمایش داده شده قبل تمیز کاریه یا بعدش . اینجوریه که روی لیست اهنگ ها حرکت میکنیم و اون ویژگی ورودی اهنگ ها رو داخل یه لیست جدید ذخیره میکنیم بعد اون لیست رو به نمودارمون میدیم . وقتی یه نمودار رو ایجاد میکنیم در واقع یه شی ایجاد میشه . بعدش اومدیم تنظیمات مربوط به رنگ و ضخامت خطوط و غیره رو تو نمودارمون با استفاده امکانات پکیج مت پلات لیب هندل کردیم که مثلا قبل تمیز کاری قرمز باشه رنگ داخل جعبه مون بعدش سبز باشه و رنگ خطوط و ... رو تنظیم کردیم . </w:t>
+      </w:r>
+      <w:r>
+        <w:rPr>
+          <w:rFonts w:hint="cs"/>
+          <w:color w:val="FF0000"/>
+          <w:rtl/>
+          <w:lang w:bidi="fa-IR"/>
+        </w:rPr>
+        <w:t xml:space="preserve">اون حلقه ها </w:t>
+      </w:r>
+      <w:r>
+        <w:rPr>
+          <w:rFonts w:hint="cs"/>
+          <w:color w:val="000000" w:themeColor="text1"/>
+          <w:rtl/>
+          <w:lang w:bidi="fa-IR"/>
+        </w:rPr>
+        <w:t xml:space="preserve">رو برای اینکه ممکنه چند تا نمودار جعبه ای همزمان چاپ بشه گذاشتیم تا همش رو بتونیم مدیریت کنیم </w:t>
+      </w:r>
+      <w:r>
+        <w:rPr>
+          <w:rFonts w:hint="cs"/>
+          <w:color w:val="000000" w:themeColor="text1"/>
+          <w:rtl/>
+          <w:lang w:bidi="fa-IR"/>
+        </w:rPr>
+        <w:t>و از انجایی که پایتون نمیتونه یه</w:t>
+      </w:r>
+      <w:r>
+        <w:rPr>
+          <w:rFonts w:hint="cs"/>
+          <w:color w:val="000000" w:themeColor="text1"/>
+          <w:rtl/>
+          <w:lang w:bidi="fa-IR"/>
+        </w:rPr>
+        <w:t xml:space="preserve"> رنگ یه لیست رو تغییر بده و فقط میتونه به عنصر داخلش اگر چه یدونه باشه دسترسی پیدا کنه و رنگ اونو تغییر بده پس باید یا با حلقه به عناصر لیست دسترسی پیدا کنیم یا با استفاده از ایندکس که ما حلقه رو انتخاب کردیم.</w:t>
+      </w:r>
+    </w:p>
+    <w:p>
+      <w:pPr>
+        <w:ind w:left="360"/>
+        <w:jc w:val="right"/>
+        <w:rPr>
+          <w:color w:val="000000" w:themeColor="text1"/>
+          <w:rtl/>
+          <w:lang w:bidi="fa-IR"/>
+        </w:rPr>
+      </w:pPr>
+      <w:r>
+        <w:rPr>
+          <w:rFonts w:hint="cs"/>
+          <w:color w:val="000000" w:themeColor="text1"/>
+          <w:rtl/>
+          <w:lang w:bidi="fa-IR"/>
+        </w:rPr>
+        <w:t>24 . دومین متد هم راجب نمودار پراکندگی بود که قراره یبار تو خروجی اونم بعد تمیز کاری چاپ بشه .</w:t>
+      </w:r>
+      <w:r>
+        <w:rPr>
+          <w:rFonts w:hint="cs"/>
+          <w:color w:val="000000" w:themeColor="text1"/>
+          <w:rtl/>
+          <w:lang w:bidi="fa-IR"/>
+        </w:rPr>
+        <w:t xml:space="preserve"> این تابع دو تا </w:t>
+      </w:r>
+      <w:r>
+        <w:rPr>
+          <w:rFonts w:hint="cs"/>
+          <w:color w:val="000000" w:themeColor="text1"/>
+          <w:rtl/>
+          <w:lang w:bidi="fa-IR"/>
+        </w:rPr>
+        <w:t>اسم ورودی که قراره محور های افقی و عمودی رو تشکیل بدن رو میگیره . بعد میایم روی لیست اهنگ ها حرکت میکنیم و ویژگی های مربوط به اون دو تا رو داخل لیست های جدا ذخیره میکنیم سپس داخل یه لیست هم اسم ژانر ها رو ذخیره میکنیم بعد</w:t>
+      </w:r>
+      <w:r>
+        <w:rPr>
+          <w:rFonts w:hint="cs"/>
+          <w:color w:val="000000" w:themeColor="text1"/>
+          <w:rtl/>
+          <w:lang w:bidi="fa-IR"/>
+        </w:rPr>
+        <w:t xml:space="preserve"> از</w:t>
+      </w:r>
+      <w:r>
+        <w:rPr>
+          <w:rFonts w:hint="cs"/>
+          <w:color w:val="000000" w:themeColor="text1"/>
+          <w:rtl/>
+          <w:lang w:bidi="fa-IR"/>
+        </w:rPr>
+        <w:t xml:space="preserve"> اون</w:t>
+      </w:r>
+      <w:r>
+        <w:rPr>
+          <w:rFonts w:hint="cs"/>
+          <w:color w:val="000000" w:themeColor="text1"/>
+          <w:rtl/>
+          <w:lang w:bidi="fa-IR"/>
+        </w:rPr>
+        <w:t xml:space="preserve"> لیست با امکانات کتابخانه کانتر ده تا از تاپ ترین ژانر ها رو تو یه لیست جدا ذخیره میکنیم و </w:t>
+      </w:r>
+      <w:r>
+        <w:rPr>
+          <w:rFonts w:hint="cs"/>
+          <w:color w:val="000000" w:themeColor="text1"/>
+          <w:rtl/>
+          <w:lang w:bidi="fa-IR"/>
+        </w:rPr>
+        <w:t xml:space="preserve">بعد یه لیست ایندکسی از روی اون لیست میسازیم . حالا وقت ساختن نموداره که قراره دو تا لیست ویژگی هرو بهش ورودی بدیم و </w:t>
+      </w:r>
+      <w:r>
+        <w:rPr>
+          <w:rFonts w:hint="cs"/>
+          <w:color w:val="000000" w:themeColor="text1"/>
+          <w:rtl/>
+          <w:lang w:bidi="fa-IR"/>
+        </w:rPr>
+        <w:t>الفا که مقدارشفافیت رو نشون میده رو هفت دهم میذاریم . بعد لیست ایندکس ها را در متغیر(سی) ورودی بهش میدیم و پایتون با این کار میفهمه نباید همه نقاط را یک رنگ کند . و داخل متغیر (سی مپ) ورودی بهش یه اسم یه استاندارد رو به صورت رشته مینویسیم . نمودار رو میسازیم. بعد با استفاده از متد لجند تو کتابخانه مت پلات لیب اون کادر راهنما رو کنار نمودارمون میسازیم که تو ورودی هندلس رو لجند المنت نمودارمون میزازیم که خودکار تشخیص میده چه رنگ روی صفحه رسم شده اند و با گذاشتن {0} میگوییم فقط ان دایره های رنگی را به عنوان هندل انتخاب کن نه اسم رنگ ها را</w:t>
+      </w:r>
+      <w:r>
+        <w:rPr>
+          <w:rFonts w:hint="cs"/>
+          <w:color w:val="000000" w:themeColor="text1"/>
+          <w:rtl/>
+          <w:lang w:bidi="fa-IR"/>
+        </w:rPr>
+        <w:t>. برای هر رنگ یک دایره کوچک رنگی خلق میکند</w:t>
+      </w:r>
+      <w:r>
+        <w:rPr>
+          <w:rFonts w:hint="cs"/>
+          <w:color w:val="000000" w:themeColor="text1"/>
+          <w:rtl/>
+          <w:lang w:bidi="fa-IR"/>
+        </w:rPr>
+        <w:t xml:space="preserve"> . بعد لیست ژانر های منحصر به فرد رو بهش میدیم  و یه متغیر تایتل با نام رشته ای ژانر ها هم بهش ورودی میدیم .</w:t>
+      </w:r>
+      <w:r>
+        <w:rPr>
+          <w:rFonts w:hint="cs"/>
+          <w:color w:val="000000" w:themeColor="text1"/>
+          <w:rtl/>
+          <w:lang w:bidi="fa-IR"/>
+        </w:rPr>
+        <w:t xml:space="preserve"> هندل و لیبل ها مثل یک چرخ دنده و مکمل به هم متصل میشوند .</w:t>
+      </w:r>
+      <w:r>
+        <w:rPr>
+          <w:rFonts w:hint="cs"/>
+          <w:color w:val="000000" w:themeColor="text1"/>
+          <w:rtl/>
+          <w:lang w:bidi="fa-IR"/>
+        </w:rPr>
+        <w:t xml:space="preserve"> بعد در مرحله اخر هم مراحل رسم نمودار و ...  رو ادامه میدیم .</w:t>
+      </w:r>
+      <w:r>
+        <w:rPr>
+          <w:rFonts w:hint="cs"/>
+          <w:color w:val="000000" w:themeColor="text1"/>
+          <w:rtl/>
+          <w:lang w:bidi="fa-IR"/>
+        </w:rPr>
+        <w:t xml:space="preserve"> </w:t>
+      </w:r>
+      <w:r>
+        <w:rPr>
+          <w:rFonts w:hint="cs"/>
+          <w:color w:val="FF0000"/>
+          <w:rtl/>
+          <w:lang w:bidi="fa-IR"/>
+        </w:rPr>
+        <w:t xml:space="preserve">متد جی سی آ از کتابخونه مت پلات لیب هم نمودار فعلی رو صفحه رو برمیگردونه . </w:t>
+      </w:r>
+    </w:p>
+    <w:p>
+      <w:pPr>
+        <w:pStyle w:val="ListParagraph"/>
+        <w:jc w:val="right"/>
+        <w:rPr>
+          <w:color w:val="FF0066"/>
+          <w:rtl/>
+          <w:lang w:bidi="fa-IR"/>
+        </w:rPr>
+      </w:pPr>
+      <w:r>
+        <w:rPr>
+          <w:rFonts w:hint="cs"/>
+          <w:color w:val="FF0066"/>
+          <w:rtl/>
+          <w:lang w:bidi="fa-IR"/>
+        </w:rPr>
+        <w:t>*** فقط باید توجه بشه که این بخش جدول راهنما که ژانر ها رو نشون میده مستقل از اون دو تا ویژگی ای هست که بهش ورودی میدیم و به عنوان یه بعد سوم عمل میکنه برامون</w:t>
+      </w:r>
+      <w:r>
+        <w:rPr>
+          <w:rFonts w:hint="cs"/>
+          <w:color w:val="FF0066"/>
+          <w:rtl/>
+          <w:lang w:bidi="fa-IR"/>
+        </w:rPr>
+        <w:t xml:space="preserve"> و برای اینکه ارور نده و درست نمایش داده بشه فقط ده تا ژانر</w:t>
+      </w:r>
+      <w:r>
+        <w:rPr>
+          <w:rFonts w:hint="cs"/>
+          <w:color w:val="FF0066"/>
+          <w:rtl/>
+          <w:lang w:bidi="fa-IR"/>
+        </w:rPr>
+        <w:t xml:space="preserve"> </w:t>
+      </w:r>
+    </w:p>
+    <w:p>
+      <w:pPr>
+        <w:pStyle w:val="ListParagraph"/>
+        <w:jc w:val="right"/>
+        <w:rPr>
+          <w:color w:val="FF0066"/>
+          <w:rtl/>
+          <w:lang w:bidi="fa-IR"/>
+        </w:rPr>
+      </w:pPr>
+      <w:r>
+        <w:rPr>
+          <w:rFonts w:hint="cs"/>
+          <w:color w:val="FF0066"/>
+          <w:rtl/>
+          <w:lang w:bidi="fa-IR"/>
+        </w:rPr>
+        <w:t xml:space="preserve">رو از بین اون همه ژانر برای برای نمودار پراکندگی انتخاب کردیم . </w:t>
+      </w:r>
+    </w:p>
+    <w:p>
+      <w:pPr>
+        <w:pStyle w:val="ListParagraph"/>
+        <w:jc w:val="right"/>
+        <w:rPr>
+          <w:color w:val="FF0066"/>
+          <w:rtl/>
+          <w:lang w:bidi="fa-IR"/>
+        </w:rPr>
+      </w:pPr>
+    </w:p>
+    <w:p>
+      <w:pPr>
+        <w:pStyle w:val="ListParagraph"/>
+        <w:jc w:val="right"/>
+        <w:rPr>
+          <w:color w:val="000000" w:themeColor="text1"/>
+          <w:rtl/>
+          <w:lang w:bidi="fa-IR"/>
+        </w:rPr>
+      </w:pPr>
+      <w:r>
+        <w:rPr>
+          <w:rFonts w:hint="cs"/>
+          <w:color w:val="538135" w:themeColor="accent6" w:themeShade="BF"/>
+          <w:rtl/>
+          <w:lang w:bidi="fa-IR"/>
+        </w:rPr>
+        <w:t xml:space="preserve">** مورد بعدی که برای شخص من جالب بود اینه که بر خلاف رسم نمودار های ساده و معمولی که یاد گرفته بودیم اینجا باید موقع ایجاد نمودار اونو به عنوان یه شی تو متغیری ذخیره کنیم چون که در خط های بعدی تابع مون لازمشون داریم . در جدول راهنما تو نمودار پراکندگی و در جعبه و داخل جعبه و ... تو نمودار جعبه ای . </w:t>
+      </w:r>
+      <w:r>
+        <w:rPr>
+          <w:rFonts w:hint="cs"/>
+          <w:color w:val="000000" w:themeColor="text1"/>
+          <w:rtl/>
+          <w:lang w:bidi="fa-IR"/>
+        </w:rPr>
+        <w:t xml:space="preserve"> </w:t>
+      </w:r>
+    </w:p>
+    <w:p>
+      <w:pPr>
+        <w:pStyle w:val="NormalWeb"/>
+        <w:rPr>
+          <w:rtl/>
+        </w:rPr>
+      </w:pPr>
+      <w:r>
+        <w:rPr>
+          <w:noProof/>
+        </w:rPr>
+        <w:drawing>
+          <wp:inline distT="0" distB="0" distL="0" distR="0" wp14:anchorId="609043D6" wp14:editId="7E47BC49">
+            <wp:extent cx="3802380" cy="373380"/>
+            <wp:effectExtent l="0" t="0" r="7620" b="7620"/>
+            <wp:docPr id="4" name="Picture 4"/>
+            <wp:cNvGraphicFramePr>
+              <a:graphicFrameLocks xmlns:a="http://schemas.openxmlformats.org/drawingml/2006/main" noChangeAspect="1"/>
+            </wp:cNvGraphicFramePr>
+            <a:graphic xmlns:a="http://schemas.openxmlformats.org/drawingml/2006/main">
+              <a:graphicData uri="http://schemas.openxmlformats.org/drawingml/2006/picture">
+                <pic:pic xmlns:pic="http://schemas.openxmlformats.org/drawingml/2006/picture">
+                  <pic:nvPicPr>
+                    <pic:cNvPr id="0" name="Picture 1"/>
+                    <pic:cNvPicPr>
+                      <a:picLocks noChangeAspect="1" noChangeArrowheads="1"/>
+                    </pic:cNvPicPr>
+                  </pic:nvPicPr>
+                  <pic:blipFill>
+                    <a:blip r:embed="rId11">
+                      <a:extLst>
+                        <a:ext uri="{28A0092B-C50C-407E-A947-70E740481C1C}">
+                          <a14:useLocalDpi xmlns:a14="http://schemas.microsoft.com/office/drawing/2010/main" val="0"/>
+                        </a:ext>
+                      </a:extLst>
+                    </a:blip>
+                    <a:srcRect/>
+                    <a:stretch>
+                      <a:fillRect/>
+                    </a:stretch>
+                  </pic:blipFill>
+                  <pic:spPr bwMode="auto">
+                    <a:xfrm>
+                      <a:off x="0" y="0"/>
+                      <a:ext cx="3802380" cy="373380"/>
+                    </a:xfrm>
+                    <a:prstGeom prst="rect">
+                      <a:avLst/>
+                    </a:prstGeom>
+                    <a:noFill/>
+                    <a:ln>
+                      <a:noFill/>
+                    </a:ln>
+                  </pic:spPr>
+                </pic:pic>
+              </a:graphicData>
+            </a:graphic>
+          </wp:inline>
+        </w:drawing>
+      </w:r>
+    </w:p>
+    <w:p>
+      <w:pPr>
+        <w:pStyle w:val="NormalWeb"/>
+        <w:jc w:val="right"/>
+        <w:rPr>
+          <w:color w:val="FF0000"/>
+          <w:rtl/>
+        </w:rPr>
+      </w:pPr>
+      <w:r>
+        <w:rPr>
+          <w:rFonts w:hint="cs"/>
+          <w:color w:val="FF0000"/>
+          <w:rtl/>
+        </w:rPr>
+        <w:lastRenderedPageBreak/>
+        <w:t xml:space="preserve">اون متغیر بولین هم برای این هست که بتونیم داخل نمودار جعبه ای مون رو رنگ امیزی کنیم . </w:t>
+      </w:r>
+    </w:p>
+    <w:p>
+      <w:pPr>
+        <w:pStyle w:val="NormalWeb"/>
+        <w:jc w:val="right"/>
+        <w:rPr>
+          <w:color w:val="000000" w:themeColor="text1"/>
+          <w:sz w:val="22"/>
+          <w:szCs w:val="22"/>
+          <w:rtl/>
+        </w:rPr>
+      </w:pPr>
+      <w:r>
+        <w:rPr>
+          <w:rFonts w:hint="cs"/>
+          <w:color w:val="000000" w:themeColor="text1"/>
+          <w:sz w:val="22"/>
+          <w:szCs w:val="22"/>
+          <w:rtl/>
+        </w:rPr>
+        <w:t xml:space="preserve">25 . </w:t>
+      </w:r>
+      <w:r>
+        <w:rPr>
+          <w:rFonts w:hint="cs"/>
+          <w:color w:val="000000" w:themeColor="text1"/>
+          <w:sz w:val="22"/>
+          <w:szCs w:val="22"/>
+          <w:rtl/>
+        </w:rPr>
+        <w:t>و اما بخش اخر تو این فایل یا همون ماتریس همبستگی . که من هیچ  درک و شهودی ازش نداشتم و اصلا نمیدونستم چیه . بعد از تحقیق و سرچ فهمیدم که میشه با استفاده از کتابخانه سیبورن به راحتی پیاده سازیش کرد ولی از اونجا که من با این کتابخانه اصلا اشنا نبودم ترجیح دادم خودم فرمول هایش را بنویسم و با استفاده از توابع و امکانات خود پایتون و پکیج مت پلات لیب پیاده سازیش کنم . اول بیاین بهتون یه توضیح کوچیک بدم که اصلا این روش هی هستش ؟؟!</w:t>
+      </w:r>
+    </w:p>
+    <w:p>
+      <w:pPr>
+        <w:pStyle w:val="NormalWeb"/>
+        <w:jc w:val="right"/>
+        <w:rPr>
+          <w:color w:val="2F5496" w:themeColor="accent1" w:themeShade="BF"/>
+          <w:sz w:val="22"/>
+          <w:szCs w:val="22"/>
+          <w:rtl/>
+        </w:rPr>
+      </w:pPr>
+      <w:r>
+        <w:rPr>
+          <w:rFonts w:hint="cs"/>
+          <w:color w:val="2F5496" w:themeColor="accent1" w:themeShade="BF"/>
+          <w:sz w:val="22"/>
+          <w:szCs w:val="22"/>
+          <w:rtl/>
+        </w:rPr>
+        <w:t xml:space="preserve">توضیح خلاصه وار روش پیاده سازی ماتریس همبستگی : یک جدول شطرنجی و متقاطع است که نشان میدهد ویژگی های مختلف یک مجموعه داده ( تو این پروژه اهنگ ها مثلا ویژگی های صوتی و انرژی و محبوبیت و رقص انگیزی و ... ) چقدر با هم رابطه دارند و تغییرات یکی چطور روی دیگری اثر میگذارد . اعداد داخل این ماتریس همیشه بین -1 تا +1 هستند : </w:t>
+      </w:r>
+    </w:p>
+    <w:p>
+      <w:pPr>
+        <w:pStyle w:val="NormalWeb"/>
+        <w:jc w:val="right"/>
+        <w:rPr>
+          <w:color w:val="2F5496" w:themeColor="accent1" w:themeShade="BF"/>
+          <w:sz w:val="22"/>
+          <w:szCs w:val="22"/>
+          <w:rtl/>
+        </w:rPr>
+      </w:pPr>
+      <w:r>
+        <w:rPr>
+          <w:rFonts w:hint="cs"/>
+          <w:color w:val="2F5496" w:themeColor="accent1" w:themeShade="BF"/>
+          <w:sz w:val="22"/>
+          <w:szCs w:val="22"/>
+          <w:rtl/>
+        </w:rPr>
+        <w:t>+1 : همبستگی مثبت کامل . هر چه ویژگی اول بیشتر شود ویژگی دوم هم به همان نسبت بیشتر میشود مثل انرژی و ولوم</w:t>
+      </w:r>
+    </w:p>
+    <w:p>
+      <w:pPr>
+        <w:pStyle w:val="NormalWeb"/>
+        <w:jc w:val="right"/>
+        <w:rPr>
+          <w:color w:val="2F5496" w:themeColor="accent1" w:themeShade="BF"/>
+          <w:sz w:val="22"/>
+          <w:szCs w:val="22"/>
+          <w:rtl/>
+        </w:rPr>
+      </w:pPr>
+      <w:r>
+        <w:rPr>
+          <w:rFonts w:hint="cs"/>
+          <w:color w:val="2F5496" w:themeColor="accent1" w:themeShade="BF"/>
+          <w:sz w:val="22"/>
+          <w:szCs w:val="22"/>
+          <w:rtl/>
+        </w:rPr>
+        <w:t xml:space="preserve">-1 : </w:t>
+      </w:r>
+      <w:r>
+        <w:rPr>
+          <w:rFonts w:hint="cs"/>
+          <w:color w:val="2F5496" w:themeColor="accent1" w:themeShade="BF"/>
+          <w:sz w:val="22"/>
+          <w:szCs w:val="22"/>
+          <w:rtl/>
+        </w:rPr>
+        <w:t>همبستگی منفی کامل . هر چه ویژگی اول بیشتر شود ویژگی دوم کمتر میشود مثل اکوستیک بودن و انرژی .</w:t>
+      </w:r>
+    </w:p>
+    <w:p>
+      <w:pPr>
+        <w:pStyle w:val="NormalWeb"/>
+        <w:jc w:val="right"/>
+        <w:rPr>
+          <w:color w:val="2F5496" w:themeColor="accent1" w:themeShade="BF"/>
+          <w:sz w:val="22"/>
+          <w:szCs w:val="22"/>
+          <w:rtl/>
+        </w:rPr>
+      </w:pPr>
+      <w:r>
+        <w:rPr>
+          <w:rFonts w:hint="cs"/>
+          <w:color w:val="2F5496" w:themeColor="accent1" w:themeShade="BF"/>
+          <w:sz w:val="22"/>
+          <w:szCs w:val="22"/>
+          <w:rtl/>
+        </w:rPr>
+        <w:t xml:space="preserve">0 : عدم همبستگی . هیچ رابطی بین دو ویژگی وجود ندارد و به هم ربط ندارند . </w:t>
+      </w:r>
+    </w:p>
+    <w:p>
+      <w:pPr>
+        <w:pStyle w:val="NormalWeb"/>
+        <w:jc w:val="right"/>
+        <w:rPr>
+          <w:color w:val="BF8F00" w:themeColor="accent4" w:themeShade="BF"/>
+        </w:rPr>
+      </w:pPr>
+      <w:r>
+        <w:rPr>
+          <w:noProof/>
+          <w:sz w:val="22"/>
+          <w:szCs w:val="22"/>
+        </w:rPr>
+        <w:drawing>
+          <wp:anchor distT="0" distB="0" distL="114300" distR="114300" simplePos="0" relativeHeight="251659264" behindDoc="0" locked="0" layoutInCell="1" allowOverlap="1" wp14:anchorId="7968115C" wp14:editId="0AD17601">
+            <wp:simplePos x="0" y="0"/>
+            <wp:positionH relativeFrom="column">
+              <wp:posOffset>883227</wp:posOffset>
+            </wp:positionH>
+            <wp:positionV relativeFrom="paragraph">
+              <wp:posOffset>3521</wp:posOffset>
+            </wp:positionV>
+            <wp:extent cx="2130900" cy="640080"/>
+            <wp:effectExtent l="0" t="0" r="3175" b="7620"/>
+            <wp:wrapNone/>
+            <wp:docPr id="5" name="Picture 5"/>
+            <wp:cNvGraphicFramePr>
+              <a:graphicFrameLocks xmlns:a="http://schemas.openxmlformats.org/drawingml/2006/main" noChangeAspect="1"/>
+            </wp:cNvGraphicFramePr>
+            <a:graphic xmlns:a="http://schemas.openxmlformats.org/drawingml/2006/main">
+              <a:graphicData uri="http://schemas.openxmlformats.org/drawingml/2006/picture">
+                <pic:pic xmlns:pic="http://schemas.openxmlformats.org/drawingml/2006/picture">
+                  <pic:nvPicPr>
+                    <pic:cNvPr id="0" name="Picture 3"/>
+                    <pic:cNvPicPr>
+                      <a:picLocks noChangeAspect="1" noChangeArrowheads="1"/>
+                    </pic:cNvPicPr>
+                  </pic:nvPicPr>
+                  <pic:blipFill>
+                    <a:blip r:embed="rId12" cstate="print">
+                      <a:extLst>
+                        <a:ext uri="{28A0092B-C50C-407E-A947-70E740481C1C}">
+                          <a14:useLocalDpi xmlns:a14="http://schemas.microsoft.com/office/drawing/2010/main" val="0"/>
+                        </a:ext>
+                      </a:extLst>
+                    </a:blip>
+                    <a:srcRect/>
+                    <a:stretch>
+                      <a:fillRect/>
+                    </a:stretch>
+                  </pic:blipFill>
+                  <pic:spPr bwMode="auto">
+                    <a:xfrm>
+                      <a:off x="0" y="0"/>
+                      <a:ext cx="2130900" cy="640080"/>
+                    </a:xfrm>
+                    <a:prstGeom prst="rect">
+                      <a:avLst/>
+                    </a:prstGeom>
+                    <a:noFill/>
+                    <a:ln>
+                      <a:noFill/>
+                    </a:ln>
+                  </pic:spPr>
+                </pic:pic>
+              </a:graphicData>
+            </a:graphic>
+            <wp14:sizeRelH relativeFrom="margin">
+              <wp14:pctWidth>0</wp14:pctWidth>
+            </wp14:sizeRelH>
+            <wp14:sizeRelV relativeFrom="margin">
+              <wp14:pctHeight>0</wp14:pctHeight>
+            </wp14:sizeRelV>
+          </wp:anchor>
+        </w:drawing>
+      </w:r>
+      <w:r>
+        <w:rPr>
+          <w:rFonts w:hint="cs"/>
+          <w:color w:val="BF8F00" w:themeColor="accent4" w:themeShade="BF"/>
+          <w:sz w:val="22"/>
+          <w:szCs w:val="22"/>
+          <w:rtl/>
+        </w:rPr>
+        <w:t>فرمول ریاضی برای محاسبه همبستگی بین دو ویژگی  :</w:t>
+      </w:r>
+      <w:r>
+        <w:rPr>
+          <w:rFonts w:hint="cs"/>
+          <w:color w:val="BF8F00" w:themeColor="accent4" w:themeShade="BF"/>
+          <w:rtl/>
+        </w:rPr>
+        <w:t xml:space="preserve"> </w:t>
+      </w:r>
+    </w:p>
+    <w:p>
+      <w:pPr>
+        <w:pStyle w:val="ListParagraph"/>
+        <w:jc w:val="right"/>
+        <w:rPr>
+          <w:color w:val="000000" w:themeColor="text1"/>
+          <w:rtl/>
+          <w:lang w:bidi="fa-IR"/>
+        </w:rPr>
+      </w:pPr>
+    </w:p>
+    <w:p>
+      <w:pPr>
+        <w:pStyle w:val="ListParagraph"/>
+        <w:jc w:val="center"/>
+        <w:rPr>
+          <w:color w:val="000000" w:themeColor="text1"/>
+          <w:lang w:bidi="fa-IR"/>
+        </w:rPr>
+      </w:pPr>
+      <w:r>
+        <w:rPr>
+          <w:rFonts w:hint="cs"/>
+          <w:color w:val="000000" w:themeColor="text1"/>
+          <w:rtl/>
+          <w:lang w:bidi="fa-IR"/>
+        </w:rPr>
+        <w:t xml:space="preserve"> </w:t>
+      </w:r>
+      <w:r>
+        <w:rPr>
+          <w:color w:val="000000" w:themeColor="text1"/>
+          <w:lang w:bidi="fa-IR"/>
+        </w:rPr>
+        <w:t xml:space="preserve"> </w:t>
+      </w:r>
+    </w:p>
+    <w:p>
+      <w:pPr>
+        <w:jc w:val="right"/>
+        <w:rPr>
+          <w:rtl/>
+          <w:lang w:bidi="fa-IR"/>
+        </w:rPr>
+      </w:pPr>
+      <w:r>
+        <w:rPr>
+          <w:rFonts w:hint="cs"/>
+          <w:rtl/>
+          <w:lang w:bidi="fa-IR"/>
+        </w:rPr>
+        <w:t>خب حالا ادامه بدیم . اول میایم به تابع مون لیستی از ویژگی ها رو که میخوایم دو به دو همبستگی بین اونا رو ببرسی و محاسبه کنیم ورودی میدیم . بعد یه دیکشنری میسازیم که کلیداش اسمای این ویژگی ها هستن و مقدار هاش لیستی از مقادیر ویژگی اهنگ ها تو این ویژگی . بعد میایم یه ماتری</w:t>
+      </w:r>
+      <w:r>
+        <w:rPr>
+          <w:rFonts w:hint="cs"/>
+          <w:rtl/>
+          <w:lang w:bidi="fa-IR"/>
+        </w:rPr>
+        <w:t>س</w:t>
+      </w:r>
+      <w:r>
+        <w:rPr>
+          <w:rFonts w:hint="cs"/>
+          <w:rtl/>
+          <w:lang w:bidi="fa-IR"/>
+        </w:rPr>
+        <w:t xml:space="preserve"> مربع صفر با ابعاد تعداد ویژگی هایی که بهش دادیم درست میکنیم . بعد میایم با دو تا حلقه فور تو در تو تو رنج تعداد ویژگی ها حرکت میکنیم و اونا رو به ترتیب دو به دو جدا میکنیم و تو هر مرحله میزان همبستگی رو</w:t>
+      </w:r>
+      <w:r>
+        <w:rPr>
+          <w:rFonts w:hint="cs"/>
+          <w:rtl/>
+          <w:lang w:bidi="fa-IR"/>
+        </w:rPr>
+        <w:t xml:space="preserve"> با استفاده از فرمول بالا</w:t>
+      </w:r>
+      <w:r>
+        <w:rPr>
+          <w:rFonts w:hint="cs"/>
+          <w:rtl/>
+          <w:lang w:bidi="fa-IR"/>
+        </w:rPr>
+        <w:t xml:space="preserve"> محاسبه میکنیم و اگر مخرج صفر نبود ( با یه شرط چک میکنیم ) تو ماتری</w:t>
+      </w:r>
+      <w:r>
+        <w:rPr>
+          <w:rFonts w:hint="cs"/>
+          <w:rtl/>
+          <w:lang w:bidi="fa-IR"/>
+        </w:rPr>
+        <w:t>س</w:t>
+      </w:r>
+      <w:r>
+        <w:rPr>
+          <w:rFonts w:hint="cs"/>
+          <w:rtl/>
+          <w:lang w:bidi="fa-IR"/>
+        </w:rPr>
+        <w:t xml:space="preserve"> جای مناسب خودش جایگذاری میکنیم و اگر مخرج صفر بود همون</w:t>
+      </w:r>
+      <w:r>
+        <w:rPr>
+          <w:rFonts w:hint="cs"/>
+          <w:rtl/>
+          <w:lang w:bidi="fa-IR"/>
+        </w:rPr>
+        <w:t xml:space="preserve"> عدد</w:t>
+      </w:r>
+      <w:r>
+        <w:rPr>
+          <w:rFonts w:hint="cs"/>
+          <w:rtl/>
+          <w:lang w:bidi="fa-IR"/>
+        </w:rPr>
+        <w:t xml:space="preserve"> صفر رو جایگذاری میکنیم . خب الان بخش محاسبه تموم شد و موند فقط بخش رسم جدول ...</w:t>
+      </w:r>
+      <w:r>
+        <w:rPr>
+          <w:rFonts w:hint="cs"/>
+          <w:rtl/>
+          <w:lang w:bidi="fa-IR"/>
+        </w:rPr>
+        <w:t xml:space="preserve"> . برای رسم جدول ابتدا صفحه رو پاکسازی میکنیم بعدش یه شکل جدید میسازیم بعد تابع ایمشو تو شکل جدیدمون میاد ماتریس دو بعدی مون رو به یک جدول رنگی تبدیل میکند . پالت رنگی استاندارد کول وارم همان طیف رنگی است که خانه های جدول ر ا رنگ میکند برای اعداد منفی رنگ ابی و برای مثبت رنگ قرمز و برای صفر رنگ سفید ر اختصاص میدهد  و داخل همین متد بهش میگیم کف رنگ ابی روی عدد -1 و سقف رنگ قرمز روی عدد +1 قفل شود .</w:t>
+      </w:r>
+      <w:r>
+        <w:rPr>
+          <w:rFonts w:hint="cs"/>
+          <w:rtl/>
+          <w:lang w:bidi="fa-IR"/>
+        </w:rPr>
+        <w:t xml:space="preserve"> تابع کالربار ان نوار عمودی مدرج را در سمت راست نمودار میکشد تا راهنمای سنجش رنگ ها باشد بعد تو خط بعدی هم یک برچسب لیبل عمودی به ان میچسباند تا مشخص شود این نوار مربوط به ضریب همبستگی است </w:t>
+      </w:r>
+      <w:r>
+        <w:rPr>
+          <w:rFonts w:hint="cs"/>
+          <w:rtl/>
+          <w:lang w:bidi="fa-IR"/>
+        </w:rPr>
+        <w:t xml:space="preserve">. بعدا مت پلات لیب به صورت پیش فرض سطر ها و ستون ها را از عدد صفر شماری گذاری میکند ولی با توابع مناسب تیکت های  مناسب هر محو را ست  میکنیم با نام ویژگی ها بعد برای محور ایکس یک زاویه چرخش هم میزازیم تا اگر نام ویژگی ها طولانی بودند در هم فرو نروند و کامل نمایش داده شوند . </w:t>
+      </w:r>
+      <w:r>
+        <w:rPr>
+          <w:rFonts w:hint="cs"/>
+          <w:rtl/>
+          <w:lang w:bidi="fa-IR"/>
+        </w:rPr>
+        <w:t xml:space="preserve">بعد تو مرحله اخر با دو تا حلقه فور تو در تو روی تک تک اعضای ماتریسمون حرکت میکنیم . بخاطرکمرنگ یا پررنگ بودن رنگ هر خانه میایم رنگ نوشته با سفید و سیاه تنظیم میکنیم. بعد عدد رو تا دو رقم اعشار بصورت بولد شده تو مرکز هر خانه تو جدول مون چاپ میکنیم . و در نهایت هم با استفاده از متد تایت لی اوت جدول رو به صورت خودکار منظم و مرتب میکنیم و فاصله اینارو هم تنظیم میکنیم و تمام . </w:t>
+      </w:r>
+    </w:p>
+    <w:p>
+      <w:pPr>
+        <w:jc w:val="right"/>
+        <w:rPr>
+          <w:color w:val="4472C4" w:themeColor="accent1"/>
+          <w:rtl/>
+          <w:lang w:bidi="fa-IR"/>
+        </w:rPr>
+      </w:pPr>
+      <w:r>
+        <w:rPr>
+          <w:rFonts w:hint="cs"/>
+          <w:color w:val="4472C4" w:themeColor="accent1"/>
+          <w:rtl/>
+          <w:lang w:bidi="fa-IR"/>
+        </w:rPr>
+        <w:t>بایه پارامتر مخصوص بهش میگیم ترا</w:t>
+      </w:r>
+      <w:r>
+        <w:rPr>
+          <w:rFonts w:hint="cs"/>
+          <w:color w:val="4472C4" w:themeColor="accent1"/>
+          <w:rtl/>
+          <w:lang w:bidi="fa-IR"/>
+        </w:rPr>
+        <w:t>ز</w:t>
+      </w:r>
+      <w:r>
+        <w:rPr>
+          <w:rFonts w:hint="cs"/>
+          <w:color w:val="4472C4" w:themeColor="accent1"/>
+          <w:rtl/>
+          <w:lang w:bidi="fa-IR"/>
+        </w:rPr>
+        <w:t>عمودی</w:t>
+      </w:r>
+      <w:r>
+        <w:rPr>
+          <w:rFonts w:hint="cs"/>
+          <w:color w:val="4472C4" w:themeColor="accent1"/>
+          <w:rtl/>
+          <w:lang w:bidi="fa-IR"/>
+        </w:rPr>
+        <w:t>(متن نسبت به نقطه ای</w:t>
+      </w:r>
+      <w:r>
+        <w:rPr>
+          <w:rFonts w:hint="cs"/>
+          <w:color w:val="4472C4" w:themeColor="accent1"/>
+          <w:rtl/>
+          <w:lang w:bidi="fa-IR"/>
+        </w:rPr>
+        <w:t xml:space="preserve"> که</w:t>
+      </w:r>
+      <w:r>
+        <w:rPr>
+          <w:rFonts w:hint="cs"/>
+          <w:color w:val="4472C4" w:themeColor="accent1"/>
+          <w:rtl/>
+          <w:lang w:bidi="fa-IR"/>
+        </w:rPr>
+        <w:t xml:space="preserve"> قرا گرفته چطور تراز شود) پایین متن روی نقطه قفل شود.</w:t>
+      </w:r>
+    </w:p>
+    <w:p>
+      <w:pPr>
+        <w:jc w:val="right"/>
+        <w:rPr>
+          <w:color w:val="FF0000"/>
+          <w:rtl/>
+          <w:lang w:bidi="fa-IR"/>
+        </w:rPr>
+      </w:pPr>
+      <w:r>
+        <w:rPr>
+          <w:rFonts w:hint="cs"/>
+          <w:color w:val="FF0000"/>
+          <w:rtl/>
+          <w:lang w:bidi="fa-IR"/>
+        </w:rPr>
+        <w:t xml:space="preserve">اضافه کردن یه بخش امتیازی به کلاس نمودار هامون : ( نمودار واژه ابر ) .  برای نوشتن باید کتابخانه مربوط بهش رو فراخوانی میکردیم . پس اول یه توضیح کوتاه راجب کتابخانش بدم بهتون ... </w:t>
+      </w:r>
+    </w:p>
+    <w:p>
+      <w:pPr>
+        <w:jc w:val="right"/>
+        <w:rPr>
+          <w:color w:val="538135" w:themeColor="accent6" w:themeShade="BF"/>
+          <w:rtl/>
+          <w:lang w:bidi="fa-IR"/>
+        </w:rPr>
+      </w:pPr>
+      <w:r>
+        <w:rPr>
+          <w:rFonts w:hint="cs"/>
+          <w:color w:val="538135" w:themeColor="accent6" w:themeShade="BF"/>
+          <w:rtl/>
+          <w:lang w:bidi="fa-IR"/>
+        </w:rPr>
+        <w:t xml:space="preserve">توضیح مختصر کتابخانه واژه ابر : این کتابخانه برای تبدیل داده های متنی انبوه به یک تصویر گرافیکی استفاده میشود . اینطوریه که تعداد تکرار هر کلمه در متن ورودی را میگیرد و هر چقدر یک کلمه ( در اینج مثلا ژانر ها یا هر ویژگی که کاربر خودش ورودی بده ) در دیتابیس بیشتر تکرار شده باشد در تصویر نهایی با فونت بزرگتر بزرگتر و مرکزی تر نمایش داده میشود و کلماتی که تکرار کمتری دارند با فونت های کوچکتر و در حاشیه ها قرار  میگرند . </w:t>
+      </w:r>
+    </w:p>
+    <w:p>
+      <w:pPr>
+        <w:jc w:val="right"/>
+        <w:rPr>
+          <w:color w:val="FF0000"/>
+          <w:lang w:bidi="fa-IR"/>
+        </w:rPr>
+      </w:pPr>
+      <w:r>
+        <w:rPr>
+          <w:rFonts w:hint="cs"/>
+          <w:color w:val="FF0000"/>
+          <w:rtl/>
+          <w:lang w:bidi="fa-IR"/>
+        </w:rPr>
+        <w:lastRenderedPageBreak/>
+        <w:t xml:space="preserve">توی کدش هم که خیلی سادس اول میایم یه متن از همه ویژگی های اهنگ ها (ویژگی ای که کاربر خودش ورودی داده ) میسازیم بعد با استفاده از تابع اماده جنریت تو کتابخانه مون . تصویرمون رو میسازیم . </w:t>
+      </w:r>
+    </w:p>
+    <w:p>
+      <w:pPr>
+        <w:jc w:val="right"/>
+        <w:rPr>
+          <w:lang w:bidi="fa-IR"/>
+        </w:rPr>
+      </w:pPr>
+      <w:r>
+        <w:rPr>
+          <w:lang w:bidi="fa-IR"/>
+        </w:rPr>
+        <w:t>…………………………………………………………………………………………………………………………………………………………</w:t>
+      </w:r>
+    </w:p>
+    <w:p>
+      <w:pPr>
+        <w:jc w:val="right"/>
+        <w:rPr>
+          <w:color w:val="2F5496" w:themeColor="accent1" w:themeShade="BF"/>
+          <w:rtl/>
+          <w:lang w:bidi="fa-IR"/>
+        </w:rPr>
+      </w:pPr>
+      <w:r>
+        <w:rPr>
+          <w:rFonts w:hint="cs"/>
+          <w:color w:val="4472C4" w:themeColor="accent1"/>
+          <w:rtl/>
+          <w:lang w:bidi="fa-IR"/>
+        </w:rPr>
+        <w:t xml:space="preserve">* </w:t>
+      </w:r>
+      <w:r>
+        <w:rPr>
+          <w:rFonts w:hint="cs"/>
+          <w:color w:val="2F5496" w:themeColor="accent1" w:themeShade="BF"/>
+          <w:rtl/>
+          <w:lang w:bidi="fa-IR"/>
+        </w:rPr>
+        <w:t xml:space="preserve">برای جذاب تر شدن برنامه ام اومدم به عنوان یه بخش امتیازی دیگه بهش موزیک بی کلام اضافه کردم . این کار رو با استفاده از کتابخانه پای گیم انجام دادم . </w:t>
+      </w:r>
+      <w:r>
+        <w:rPr>
+          <w:rFonts w:hint="cs"/>
+          <w:color w:val="2F5496" w:themeColor="accent1" w:themeShade="BF"/>
+          <w:rtl/>
+          <w:lang w:bidi="fa-IR"/>
+        </w:rPr>
+        <w:t>( کتابخانه ای بسیار وسیع برای ساخت بازی و چیزهای گرافیکی در پایتون و ... ) . اینجوری که اول اومدم قبل از اولین حلقه وایل ترو تو تابع مین تو فایل مین وارد کتابخانه شدم بعد اهنگ بی کلامی که دانلود کرده و در فول</w:t>
+      </w:r>
+      <w:r>
+        <w:rPr>
+          <w:rFonts w:hint="cs"/>
+          <w:color w:val="2F5496" w:themeColor="accent1" w:themeShade="BF"/>
+          <w:rtl/>
+          <w:lang w:bidi="fa-IR"/>
+        </w:rPr>
+        <w:t>در</w:t>
+      </w:r>
+      <w:r>
+        <w:rPr>
+          <w:rFonts w:hint="cs"/>
+          <w:color w:val="2F5496" w:themeColor="accent1" w:themeShade="BF"/>
+          <w:rtl/>
+          <w:lang w:bidi="fa-IR"/>
+        </w:rPr>
+        <w:t xml:space="preserve"> پروژم بارگذاری</w:t>
+      </w:r>
+      <w:r>
+        <w:rPr>
+          <w:rFonts w:hint="cs"/>
+          <w:color w:val="2F5496" w:themeColor="accent1" w:themeShade="BF"/>
+          <w:rtl/>
+          <w:lang w:bidi="fa-IR"/>
+        </w:rPr>
+        <w:t xml:space="preserve"> </w:t>
+      </w:r>
+      <w:r>
+        <w:rPr>
+          <w:rFonts w:hint="cs"/>
+          <w:color w:val="2F5496" w:themeColor="accent1" w:themeShade="BF"/>
+          <w:rtl/>
+          <w:lang w:bidi="fa-IR"/>
+        </w:rPr>
+        <w:t xml:space="preserve">کرده بودم را لود کردم بعد پخشش کردم (به این صورت که اگر زمانش تمام شد دوباره از اول پخش بشه اهنگم ) بعد هم توی بخشی که کاربر میخواد به طور کامل از برنامه خارج بشه متوقفش کردم . </w:t>
+      </w:r>
+    </w:p>
+    <w:p>
+      <w:pPr>
+        <w:jc w:val="right"/>
+        <w:rPr>
+          <w:color w:val="171717" w:themeColor="background2" w:themeShade="1A"/>
+          <w:rtl/>
+          <w:lang w:bidi="fa-IR"/>
+        </w:rPr>
+      </w:pPr>
+      <w:r>
+        <w:rPr>
+          <w:rFonts w:hint="cs"/>
+          <w:color w:val="171717" w:themeColor="background2" w:themeShade="1A"/>
+          <w:rtl/>
+          <w:lang w:bidi="fa-IR"/>
+        </w:rPr>
+        <w:t>...................................................................................................................................................</w:t>
+      </w:r>
+    </w:p>
+    <w:p>
+      <w:pPr>
+        <w:jc w:val="right"/>
+        <w:rPr>
+          <w:rtl/>
+          <w:lang w:bidi="fa-IR"/>
+        </w:rPr>
+      </w:pPr>
+      <w:r>
+        <w:rPr>
+          <w:rFonts w:hint="cs"/>
+          <w:rtl/>
+          <w:lang w:bidi="fa-IR"/>
+        </w:rPr>
+        <w:t xml:space="preserve">26 . دیگه نوبتی هم باشه نوبت میرسه به غول مراحل اخر . و تکمیل فایل نهایی یا همون فایل مین و اضافه و هندل کردن بخش های ترای اکسپت برای جاهای مورد نیاز پروژه برای جلوگیری از کرش کردن برنامه . اومدم تو فایل ابتدا همه موارد و ماژول های لازم رو ایمپورت و فراخوانی کردم بعد داخل بدنه تابعی به اسم مین همه کد های لازم رو نوشتم و ... . اینجوری شروع شده در اولین قدم یه شی از کلاس دیتا لودر ساخته میشه بعد همه چیز </w:t>
+      </w:r>
+      <w:r>
+        <w:rPr>
+          <w:rFonts w:hint="cs"/>
+          <w:rtl/>
+          <w:lang w:bidi="fa-IR"/>
+        </w:rPr>
+        <w:t xml:space="preserve">از </w:t>
+      </w:r>
+      <w:r>
+        <w:rPr>
+          <w:rFonts w:hint="cs"/>
+          <w:rtl/>
+          <w:lang w:bidi="fa-IR"/>
+        </w:rPr>
+        <w:t xml:space="preserve">رو لیست اهنگ از اون شی و ... انجام می پذیره . تو منوی اصلی و اولیه با چندین گزینه ( هندل کردن داده های گمشده وداده های پرت و بهره منده از توابع اماری نوشته شده در ماژول موبوط به خودش و رسم انواع نمودار و اضافه کردن اهنگ جدید به فایل مون و ریست کردن دیتاست و سیو کردن تغییرات انجام شده . ) بعد تو هر یک از بخش ها بازم منوی مربوط به خودشون رو گذاشتم . هر بخش برای خودش حلقه وایل ترو دارد و با هندل کردن این حلقه ها </w:t>
+      </w:r>
+      <w:r>
+        <w:rPr>
+          <w:rFonts w:hint="cs"/>
+          <w:rtl/>
+          <w:lang w:bidi="fa-IR"/>
+        </w:rPr>
+        <w:t xml:space="preserve">و </w:t>
+      </w:r>
+      <w:r>
+        <w:rPr>
+          <w:rFonts w:hint="cs"/>
+          <w:rtl/>
+          <w:lang w:bidi="fa-IR"/>
+        </w:rPr>
+        <w:t xml:space="preserve">همچنان برای تمامی بخش ها پرسش خروج از برنامه </w:t>
+      </w:r>
+      <w:r>
+        <w:rPr>
+          <w:rFonts w:hint="cs"/>
+          <w:rtl/>
+          <w:lang w:bidi="fa-IR"/>
+        </w:rPr>
+        <w:t xml:space="preserve">رو اوردم تا کاربر هر وقت خواست از برنامه خارج شه و برگرده عقب . بعدا برای هندل کردن برنامه مون و جلوگیری از ورودی های نامعتبر و نادرست و کرش شدن برنامه در تمامی بخش های لازم از ایف الس های مناسب و ترای اکسپ های مناسب استفاده کردیم ... . </w:t>
+      </w:r>
+    </w:p>
+    <w:p>
+      <w:pPr>
+        <w:jc w:val="right"/>
+        <w:rPr>
+          <w:rtl/>
+          <w:lang w:bidi="fa-IR"/>
+        </w:rPr>
+      </w:pPr>
+      <w:r>
+        <w:rPr>
+          <w:rFonts w:hint="cs"/>
+          <w:rtl/>
+          <w:lang w:bidi="fa-IR"/>
+        </w:rPr>
+        <w:t>....................................................................................................................................................</w:t>
+      </w:r>
+    </w:p>
+    <w:p>
+      <w:pPr>
+        <w:jc w:val="right"/>
+        <w:rPr>
+          <w:color w:val="BF8F00" w:themeColor="accent4" w:themeShade="BF"/>
+          <w:rtl/>
+          <w:lang w:bidi="fa-IR"/>
+        </w:rPr>
+      </w:pPr>
+      <w:r>
+        <w:rPr>
+          <w:rFonts w:hint="cs"/>
+          <w:color w:val="BF8F00" w:themeColor="accent4" w:themeShade="BF"/>
+          <w:rtl/>
+          <w:lang w:bidi="fa-IR"/>
+        </w:rPr>
+        <w:t>جمع بندی موارد امتیازی که پروژم پیاده سازی کردم :</w:t>
+      </w:r>
+    </w:p>
+    <w:p>
+      <w:pPr>
+        <w:jc w:val="right"/>
+        <w:rPr>
+          <w:color w:val="BF8F00" w:themeColor="accent4" w:themeShade="BF"/>
+          <w:rtl/>
+          <w:lang w:bidi="fa-IR"/>
+        </w:rPr>
+      </w:pPr>
+      <w:r>
+        <w:rPr>
+          <w:rFonts w:hint="cs"/>
+          <w:color w:val="BF8F00" w:themeColor="accent4" w:themeShade="BF"/>
+          <w:rtl/>
+          <w:lang w:bidi="fa-IR"/>
+        </w:rPr>
+        <w:t>1 . متد های جالب و مفید تو بخش کلاس انالیز دیتا . مثل : ( دادن تاپ ترین اهنگ ها .فیلتر دیتا براساس اسم هنرمن</w:t>
+      </w:r>
+      <w:r>
+        <w:rPr>
+          <w:rFonts w:hint="cs"/>
+          <w:color w:val="BF8F00" w:themeColor="accent4" w:themeShade="BF"/>
+          <w:rtl/>
+          <w:lang w:bidi="fa-IR"/>
+        </w:rPr>
+        <w:t xml:space="preserve">د و ژانر . دادن اهنگ های شبیه اهنگ مورد علاقه کاربر </w:t>
+      </w:r>
+      <w:r>
+        <w:rPr>
+          <w:rFonts w:hint="cs"/>
+          <w:color w:val="BF8F00" w:themeColor="accent4" w:themeShade="BF"/>
+          <w:rtl/>
+          <w:lang w:bidi="fa-IR"/>
+        </w:rPr>
+        <w:t xml:space="preserve"> )</w:t>
+      </w:r>
+      <w:r>
+        <w:rPr>
+          <w:rFonts w:hint="cs"/>
+          <w:color w:val="BF8F00" w:themeColor="accent4" w:themeShade="BF"/>
+          <w:rtl/>
+          <w:lang w:bidi="fa-IR"/>
+        </w:rPr>
+        <w:t xml:space="preserve"> . </w:t>
+      </w:r>
+    </w:p>
+    <w:p>
+      <w:pPr>
+        <w:jc w:val="right"/>
+        <w:rPr>
+          <w:color w:val="BF8F00" w:themeColor="accent4" w:themeShade="BF"/>
+          <w:rtl/>
+          <w:lang w:bidi="fa-IR"/>
+        </w:rPr>
+      </w:pPr>
+      <w:r>
+        <w:rPr>
+          <w:rFonts w:hint="cs"/>
+          <w:color w:val="BF8F00" w:themeColor="accent4" w:themeShade="BF"/>
+          <w:rtl/>
+          <w:lang w:bidi="fa-IR"/>
+        </w:rPr>
+        <w:t xml:space="preserve">2 . اضافه کردن نمودار واژه ابر . </w:t>
+      </w:r>
+    </w:p>
+    <w:p>
+      <w:pPr>
+        <w:jc w:val="right"/>
+        <w:rPr>
+          <w:color w:val="BF8F00" w:themeColor="accent4" w:themeShade="BF"/>
+          <w:rtl/>
+          <w:lang w:bidi="fa-IR"/>
+        </w:rPr>
+      </w:pPr>
+      <w:r>
+        <w:rPr>
+          <w:rFonts w:hint="cs"/>
+          <w:color w:val="BF8F00" w:themeColor="accent4" w:themeShade="BF"/>
+          <w:rtl/>
+          <w:lang w:bidi="fa-IR"/>
+        </w:rPr>
+        <w:t xml:space="preserve">3 . اضافه اهنگ بی کلام برای پس زمینه برنامه . </w:t>
+      </w:r>
+    </w:p>
+    <w:p>
+      <w:pPr>
+        <w:jc w:val="right"/>
+        <w:rPr>
+          <w:color w:val="000000" w:themeColor="text1"/>
+          <w:rtl/>
+          <w:lang w:bidi="fa-IR"/>
+        </w:rPr>
+      </w:pPr>
+      <w:r>
+        <w:rPr>
+          <w:rFonts w:hint="cs"/>
+          <w:color w:val="000000" w:themeColor="text1"/>
+          <w:rtl/>
+          <w:lang w:bidi="fa-IR"/>
+        </w:rPr>
+        <w:t>.....................................................................................................................................................</w:t>
+      </w:r>
+    </w:p>
+    <w:p>
+      <w:pPr>
+        <w:jc w:val="right"/>
+        <w:rPr>
+          <w:color w:val="000000" w:themeColor="text1"/>
+          <w:lang w:bidi="fa-IR"/>
+        </w:rPr>
+      </w:pPr>
+      <w:r>
+        <w:rPr>
+          <w:noProof/>
+        </w:rPr>
+        <w:drawing>
+          <wp:anchor distT="0" distB="0" distL="114300" distR="114300" simplePos="0" relativeHeight="251661312" behindDoc="0" locked="0" layoutInCell="1" allowOverlap="1" wp14:anchorId="5079EA02" wp14:editId="15399D3B">
+            <wp:simplePos x="0" y="0"/>
+            <wp:positionH relativeFrom="margin">
+              <wp:posOffset>3214370</wp:posOffset>
+            </wp:positionH>
+            <wp:positionV relativeFrom="paragraph">
+              <wp:posOffset>309245</wp:posOffset>
+            </wp:positionV>
+            <wp:extent cx="3209544" cy="2468880"/>
+            <wp:effectExtent l="0" t="0" r="0" b="7620"/>
+            <wp:wrapNone/>
+            <wp:docPr id="7" name="Picture 7"/>
+            <wp:cNvGraphicFramePr>
+              <a:graphicFrameLocks xmlns:a="http://schemas.openxmlformats.org/drawingml/2006/main" noChangeAspect="1"/>
+            </wp:cNvGraphicFramePr>
+            <a:graphic xmlns:a="http://schemas.openxmlformats.org/drawingml/2006/main">
+              <a:graphicData uri="http://schemas.openxmlformats.org/drawingml/2006/picture">
+                <pic:pic xmlns:pic="http://schemas.openxmlformats.org/drawingml/2006/picture">
+                  <pic:nvPicPr>
+                    <pic:cNvPr id="0" name="Picture 3"/>
+                    <pic:cNvPicPr>
+                      <a:picLocks noChangeAspect="1" noChangeArrowheads="1"/>
+                    </pic:cNvPicPr>
+                  </pic:nvPicPr>
+                  <pic:blipFill>
+                    <a:blip r:embed="rId13">
+                      <a:extLst>
+                        <a:ext uri="{28A0092B-C50C-407E-A947-70E740481C1C}">
+                          <a14:useLocalDpi xmlns:a14="http://schemas.microsoft.com/office/drawing/2010/main" val="0"/>
+                        </a:ext>
+                      </a:extLst>
+                    </a:blip>
+                    <a:srcRect/>
+                    <a:stretch>
+                      <a:fillRect/>
+                    </a:stretch>
+                  </pic:blipFill>
+                  <pic:spPr bwMode="auto">
+                    <a:xfrm>
+                      <a:off x="0" y="0"/>
+                      <a:ext cx="3209544" cy="2468880"/>
+                    </a:xfrm>
+                    <a:prstGeom prst="rect">
+                      <a:avLst/>
+                    </a:prstGeom>
+                    <a:noFill/>
+                    <a:ln>
+                      <a:noFill/>
+                    </a:ln>
+                  </pic:spPr>
+                </pic:pic>
+              </a:graphicData>
+            </a:graphic>
+            <wp14:sizeRelH relativeFrom="margin">
+              <wp14:pctWidth>0</wp14:pctWidth>
+            </wp14:sizeRelH>
+            <wp14:sizeRelV relativeFrom="margin">
+              <wp14:pctHeight>0</wp14:pctHeight>
+            </wp14:sizeRelV>
+          </wp:anchor>
+        </w:drawing>
+      </w:r>
+      <w:r>
+        <w:rPr>
+          <w:noProof/>
+        </w:rPr>
+        <w:drawing>
+          <wp:anchor distT="0" distB="0" distL="114300" distR="114300" simplePos="0" relativeHeight="251660288" behindDoc="0" locked="0" layoutInCell="1" allowOverlap="1" wp14:anchorId="1E322108" wp14:editId="6E5A27AE">
+            <wp:simplePos x="0" y="0"/>
+            <wp:positionH relativeFrom="column">
+              <wp:posOffset>-563880</wp:posOffset>
+            </wp:positionH>
+            <wp:positionV relativeFrom="paragraph">
+              <wp:posOffset>364490</wp:posOffset>
+            </wp:positionV>
+            <wp:extent cx="3169920" cy="2376170"/>
+            <wp:effectExtent l="0" t="0" r="0" b="5080"/>
+            <wp:wrapNone/>
+            <wp:docPr id="6" name="Picture 6"/>
+            <wp:cNvGraphicFramePr>
+              <a:graphicFrameLocks xmlns:a="http://schemas.openxmlformats.org/drawingml/2006/main" noChangeAspect="1"/>
+            </wp:cNvGraphicFramePr>
+            <a:graphic xmlns:a="http://schemas.openxmlformats.org/drawingml/2006/main">
+              <a:graphicData uri="http://schemas.openxmlformats.org/drawingml/2006/picture">
+                <pic:pic xmlns:pic="http://schemas.openxmlformats.org/drawingml/2006/picture">
+                  <pic:nvPicPr>
+                    <pic:cNvPr id="0" name="Picture 1"/>
+                    <pic:cNvPicPr>
+                      <a:picLocks noChangeAspect="1" noChangeArrowheads="1"/>
+                    </pic:cNvPicPr>
+                  </pic:nvPicPr>
+                  <pic:blipFill>
+                    <a:blip r:embed="rId14">
+                      <a:extLst>
+                        <a:ext uri="{28A0092B-C50C-407E-A947-70E740481C1C}">
+                          <a14:useLocalDpi xmlns:a14="http://schemas.microsoft.com/office/drawing/2010/main" val="0"/>
+                        </a:ext>
+                      </a:extLst>
+                    </a:blip>
+                    <a:srcRect/>
+                    <a:stretch>
+                      <a:fillRect/>
+                    </a:stretch>
+                  </pic:blipFill>
+                  <pic:spPr bwMode="auto">
+                    <a:xfrm>
+                      <a:off x="0" y="0"/>
+                      <a:ext cx="3169920" cy="2376170"/>
+                    </a:xfrm>
+                    <a:prstGeom prst="rect">
+                      <a:avLst/>
+                    </a:prstGeom>
+                    <a:noFill/>
+                    <a:ln>
+                      <a:noFill/>
+                    </a:ln>
+                  </pic:spPr>
+                </pic:pic>
+              </a:graphicData>
+            </a:graphic>
+            <wp14:sizeRelH relativeFrom="margin">
+              <wp14:pctWidth>0</wp14:pctWidth>
+            </wp14:sizeRelH>
+            <wp14:sizeRelV relativeFrom="margin">
+              <wp14:pctHeight>0</wp14:pctHeight>
+            </wp14:sizeRelV>
+          </wp:anchor>
+        </w:drawing>
+      </w:r>
+      <w:r>
+        <w:rPr>
+          <w:rFonts w:hint="cs"/>
+          <w:color w:val="000000" w:themeColor="text1"/>
+          <w:rtl/>
+          <w:lang w:bidi="fa-IR"/>
+        </w:rPr>
+        <w:t xml:space="preserve">الان تنها چیزی که موند اضافه کردن اسکرین شات از نمودار هاست که در جلو رو خواهیم اوردشان ... . </w:t>
+      </w:r>
+    </w:p>
+    <w:p>
+      <w:pPr>
+        <w:rPr>
+          <w:color w:val="000000" w:themeColor="text1"/>
+          <w:lang w:bidi="fa-IR"/>
+        </w:rPr>
+      </w:pPr>
+      <w:r>
+        <w:rPr>
+          <w:noProof/>
+        </w:rPr>
+        <w:lastRenderedPageBreak/>
+        <w:drawing>
+          <wp:anchor distT="0" distB="0" distL="114300" distR="114300" simplePos="0" relativeHeight="251662336" behindDoc="0" locked="0" layoutInCell="1" allowOverlap="1" wp14:anchorId="73AA2E04" wp14:editId="7A09FC43">
+            <wp:simplePos x="0" y="0"/>
+            <wp:positionH relativeFrom="margin">
+              <wp:align>center</wp:align>
+            </wp:positionH>
+            <wp:positionV relativeFrom="paragraph">
+              <wp:posOffset>0</wp:posOffset>
+            </wp:positionV>
+            <wp:extent cx="4828032" cy="2715768"/>
+            <wp:effectExtent l="0" t="0" r="0" b="8890"/>
+            <wp:wrapSquare wrapText="bothSides"/>
+            <wp:docPr id="8" name="Picture 8"/>
+            <wp:cNvGraphicFramePr>
+              <a:graphicFrameLocks xmlns:a="http://schemas.openxmlformats.org/drawingml/2006/main" noChangeAspect="1"/>
+            </wp:cNvGraphicFramePr>
+            <a:graphic xmlns:a="http://schemas.openxmlformats.org/drawingml/2006/main">
+              <a:graphicData uri="http://schemas.openxmlformats.org/drawingml/2006/picture">
+                <pic:pic xmlns:pic="http://schemas.openxmlformats.org/drawingml/2006/picture">
+                  <pic:nvPicPr>
+                    <pic:cNvPr id="0" name="Picture 5"/>
+                    <pic:cNvPicPr>
+                      <a:picLocks noChangeAspect="1" noChangeArrowheads="1"/>
+                    </pic:cNvPicPr>
+                  </pic:nvPicPr>
+                  <pic:blipFill>
+                    <a:blip r:embed="rId15">
+                      <a:extLst>
+                        <a:ext uri="{28A0092B-C50C-407E-A947-70E740481C1C}">
+                          <a14:useLocalDpi xmlns:a14="http://schemas.microsoft.com/office/drawing/2010/main" val="0"/>
+                        </a:ext>
+                      </a:extLst>
+                    </a:blip>
+                    <a:srcRect/>
+                    <a:stretch>
+                      <a:fillRect/>
+                    </a:stretch>
+                  </pic:blipFill>
+                  <pic:spPr bwMode="auto">
+                    <a:xfrm>
+                      <a:off x="0" y="0"/>
+                      <a:ext cx="4828032" cy="2715768"/>
+                    </a:xfrm>
+                    <a:prstGeom prst="rect">
+                      <a:avLst/>
+                    </a:prstGeom>
+                    <a:noFill/>
+                    <a:ln>
+                      <a:noFill/>
+                    </a:ln>
+                  </pic:spPr>
+                </pic:pic>
+              </a:graphicData>
+            </a:graphic>
+            <wp14:sizeRelH relativeFrom="margin">
+              <wp14:pctWidth>0</wp14:pctWidth>
+            </wp14:sizeRelH>
+            <wp14:sizeRelV relativeFrom="margin">
+              <wp14:pctHeight>0</wp14:pctHeight>
+            </wp14:sizeRelV>
+          </wp:anchor>
+        </w:drawing>
+      </w:r>
+    </w:p>
+    <w:p>
+      <w:pPr>
+        <w:rPr>
+          <w:rtl/>
+          <w:lang w:bidi="fa-IR"/>
+        </w:rPr>
+      </w:pPr>
+    </w:p>
+    <w:p>
+      <w:pPr>
+        <w:rPr>
+          <w:rtl/>
+          <w:lang w:bidi="fa-IR"/>
+        </w:rPr>
+      </w:pPr>
+    </w:p>
+    <w:p>
+      <w:pPr>
+        <w:rPr>
+          <w:rtl/>
+          <w:lang w:bidi="fa-IR"/>
+        </w:rPr>
+      </w:pPr>
+    </w:p>
+    <w:p>
+      <w:pPr>
+        <w:rPr>
+          <w:rtl/>
+          <w:lang w:bidi="fa-IR"/>
+        </w:rPr>
+      </w:pPr>
+    </w:p>
+    <w:p>
+      <w:pPr>
+        <w:rPr>
+          <w:rtl/>
+          <w:lang w:bidi="fa-IR"/>
+        </w:rPr>
+      </w:pPr>
+    </w:p>
+    <w:p>
+      <w:pPr>
+        <w:rPr>
+          <w:rtl/>
+          <w:lang w:bidi="fa-IR"/>
+        </w:rPr>
+      </w:pPr>
+    </w:p>
+    <w:p>
+      <w:pPr>
+        <w:rPr>
+          <w:rtl/>
+          <w:lang w:bidi="fa-IR"/>
+        </w:rPr>
+      </w:pPr>
+    </w:p>
+    <w:p>
+      <w:pPr>
+        <w:rPr>
+          <w:rtl/>
+          <w:lang w:bidi="fa-IR"/>
+        </w:rPr>
+      </w:pPr>
+    </w:p>
+    <w:p>
+      <w:pPr>
+        <w:rPr>
+          <w:rtl/>
+          <w:lang w:bidi="fa-IR"/>
+        </w:rPr>
+      </w:pPr>
+      <w:r>
+        <w:rPr>
+          <w:noProof/>
+        </w:rPr>
+        <w:drawing>
+          <wp:anchor distT="0" distB="0" distL="114300" distR="114300" simplePos="0" relativeHeight="251663360" behindDoc="0" locked="0" layoutInCell="1" allowOverlap="1" wp14:anchorId="567CE07B" wp14:editId="09BEEACA">
+            <wp:simplePos x="0" y="0"/>
+            <wp:positionH relativeFrom="margin">
+              <wp:posOffset>-327660</wp:posOffset>
+            </wp:positionH>
+            <wp:positionV relativeFrom="paragraph">
+              <wp:posOffset>151130</wp:posOffset>
+            </wp:positionV>
+            <wp:extent cx="3732082" cy="3025140"/>
+            <wp:effectExtent l="0" t="0" r="1905" b="3810"/>
+            <wp:wrapNone/>
+            <wp:docPr id="9" name="Picture 9"/>
+            <wp:cNvGraphicFramePr>
+              <a:graphicFrameLocks xmlns:a="http://schemas.openxmlformats.org/drawingml/2006/main" noChangeAspect="1"/>
+            </wp:cNvGraphicFramePr>
+            <a:graphic xmlns:a="http://schemas.openxmlformats.org/drawingml/2006/main">
+              <a:graphicData uri="http://schemas.openxmlformats.org/drawingml/2006/picture">
+                <pic:pic xmlns:pic="http://schemas.openxmlformats.org/drawingml/2006/picture">
+                  <pic:nvPicPr>
+                    <pic:cNvPr id="0" name="Picture 7"/>
+                    <pic:cNvPicPr>
+                      <a:picLocks noChangeAspect="1" noChangeArrowheads="1"/>
+                    </pic:cNvPicPr>
+                  </pic:nvPicPr>
+                  <pic:blipFill>
+                    <a:blip r:embed="rId16" cstate="print">
+                      <a:extLst>
+                        <a:ext uri="{28A0092B-C50C-407E-A947-70E740481C1C}">
+                          <a14:useLocalDpi xmlns:a14="http://schemas.microsoft.com/office/drawing/2010/main" val="0"/>
+                        </a:ext>
+                      </a:extLst>
+                    </a:blip>
+                    <a:srcRect/>
+                    <a:stretch>
+                      <a:fillRect/>
+                    </a:stretch>
+                  </pic:blipFill>
+                  <pic:spPr bwMode="auto">
+                    <a:xfrm>
+                      <a:off x="0" y="0"/>
+                      <a:ext cx="3732082" cy="3025140"/>
+                    </a:xfrm>
+                    <a:prstGeom prst="rect">
+                      <a:avLst/>
+                    </a:prstGeom>
+                    <a:noFill/>
+                    <a:ln>
+                      <a:noFill/>
+                    </a:ln>
+                  </pic:spPr>
+                </pic:pic>
+              </a:graphicData>
+            </a:graphic>
+            <wp14:sizeRelH relativeFrom="margin">
+              <wp14:pctWidth>0</wp14:pctWidth>
+            </wp14:sizeRelH>
+            <wp14:sizeRelV relativeFrom="margin">
+              <wp14:pctHeight>0</wp14:pctHeight>
+            </wp14:sizeRelV>
+          </wp:anchor>
+        </w:drawing>
+      </w:r>
+    </w:p>
+    <w:p>
+      <w:pPr>
+        <w:rPr>
+          <w:rtl/>
+          <w:lang w:bidi="fa-IR"/>
+        </w:rPr>
+      </w:pPr>
+    </w:p>
+    <w:p>
+      <w:pPr>
+        <w:tabs>
+          <w:tab w:val="right" w:pos="9360"/>
+        </w:tabs>
+        <w:rPr>
+          <w:rtl/>
+          <w:lang w:bidi="fa-IR"/>
+        </w:rPr>
+      </w:pPr>
+      <w:r>
+        <w:rPr>
+          <w:rFonts w:hint="cs"/>
+          <w:rtl/>
+          <w:lang w:bidi="fa-IR"/>
+        </w:rPr>
+        <w:t>ب</w:t>
+      </w:r>
+      <w:r>
+        <w:rPr>
+          <w:rtl/>
+          <w:lang w:bidi="fa-IR"/>
+        </w:rPr>
+        <w:tab/>
+      </w:r>
+      <w:r>
+        <w:rPr>
+          <w:rFonts w:hint="cs"/>
+          <w:rtl/>
+          <w:lang w:bidi="fa-IR"/>
+        </w:rPr>
+        <w:t>بخوام  یه توضیح کوتاه راجب کتابخانه شمارنده (کانتر)</w:t>
+      </w:r>
+    </w:p>
+    <w:p>
+      <w:pPr>
+        <w:jc w:val="right"/>
+        <w:rPr>
+          <w:rtl/>
+          <w:lang w:bidi="fa-IR"/>
+        </w:rPr>
+      </w:pPr>
+      <w:r>
+        <w:rPr>
+          <w:rFonts w:hint="cs"/>
+          <w:rtl/>
+          <w:lang w:bidi="fa-IR"/>
+        </w:rPr>
+        <w:t>از کالکشن کتابخانه های استاندارد پایتون بدم :</w:t>
+      </w:r>
+    </w:p>
+    <w:p>
+      <w:pPr>
+        <w:jc w:val="right"/>
+        <w:rPr>
+          <w:color w:val="000000" w:themeColor="text1"/>
+          <w:rtl/>
+          <w:lang w:bidi="fa-IR"/>
+        </w:rPr>
+      </w:pPr>
+      <w:r>
+        <w:rPr>
+          <w:rFonts w:hint="cs"/>
+          <w:color w:val="000000" w:themeColor="text1"/>
+          <w:rtl/>
+          <w:lang w:bidi="fa-IR"/>
+        </w:rPr>
+        <w:t>یک لیست قابل پیمایش مثلا لیست رو میگیره و تعداد</w:t>
+      </w:r>
+    </w:p>
+    <w:p>
+      <w:pPr>
+        <w:tabs>
+          <w:tab w:val="left" w:pos="984"/>
+          <w:tab w:val="right" w:pos="9360"/>
+        </w:tabs>
+        <w:rPr>
+          <w:lang w:bidi="fa-IR"/>
+        </w:rPr>
+      </w:pPr>
+      <w:r>
+        <w:rPr>
+          <w:lang w:bidi="fa-IR"/>
+        </w:rPr>
+        <w:tab/>
+      </w:r>
+      <w:r>
+        <w:rPr>
+          <w:lang w:bidi="fa-IR"/>
+        </w:rPr>
+        <w:tab/>
+      </w:r>
+      <w:r>
+        <w:rPr>
+          <w:rFonts w:hint="cs"/>
+          <w:rtl/>
+          <w:lang w:bidi="fa-IR"/>
+        </w:rPr>
+        <w:t>تکرار هر عضو رو حساب میکنه و خروجیش شبیه</w:t>
+      </w:r>
+    </w:p>
+    <w:p>
+      <w:pPr>
+        <w:jc w:val="right"/>
+        <w:rPr>
+          <w:rtl/>
+          <w:lang w:bidi="fa-IR"/>
+        </w:rPr>
+      </w:pPr>
+      <w:r>
+        <w:rPr>
+          <w:rFonts w:hint="cs"/>
+          <w:rtl/>
+          <w:lang w:bidi="fa-IR"/>
+        </w:rPr>
+        <w:t>دیکشنری هست که کلیدهای ان اعضای لیست و مقادیر</w:t>
+      </w:r>
+    </w:p>
+    <w:p>
+      <w:pPr>
+        <w:jc w:val="right"/>
+        <w:rPr>
+          <w:rtl/>
+          <w:lang w:bidi="fa-IR"/>
+        </w:rPr>
+      </w:pPr>
+      <w:r>
+        <w:rPr>
+          <w:rFonts w:hint="cs"/>
+          <w:rtl/>
+          <w:lang w:bidi="fa-IR"/>
+        </w:rPr>
+        <w:t>ان تعداد تکرار ان عضو هستند .</w:t>
+      </w:r>
+      <w:r>
+        <w:rPr>
+          <w:rFonts w:hint="cs"/>
+          <w:rtl/>
+          <w:lang w:bidi="fa-IR"/>
+        </w:rPr>
+        <w:t xml:space="preserve"> </w:t>
+      </w:r>
+    </w:p>
+    <w:p>
+      <w:pPr>
+        <w:rPr>
+          <w:rtl/>
+          <w:lang w:bidi="fa-IR"/>
+        </w:rPr>
+      </w:pPr>
+    </w:p>
+    <w:p>
+      <w:pPr>
+        <w:rPr>
+          <w:rtl/>
+          <w:lang w:bidi="fa-IR"/>
+        </w:rPr>
+      </w:pPr>
+    </w:p>
+    <w:p>
+      <w:pPr>
+        <w:rPr>
+          <w:rtl/>
+          <w:lang w:bidi="fa-IR"/>
+        </w:rPr>
+      </w:pPr>
+      <w:r>
+        <w:rPr>
+          <w:noProof/>
+        </w:rPr>
+        <w:drawing>
+          <wp:anchor distT="0" distB="0" distL="114300" distR="114300" simplePos="0" relativeHeight="251664384" behindDoc="0" locked="0" layoutInCell="1" allowOverlap="1" wp14:anchorId="7A04ABA7" wp14:editId="046E0F8D">
+            <wp:simplePos x="0" y="0"/>
+            <wp:positionH relativeFrom="margin">
+              <wp:posOffset>3292475</wp:posOffset>
+            </wp:positionH>
+            <wp:positionV relativeFrom="paragraph">
+              <wp:posOffset>244475</wp:posOffset>
+            </wp:positionV>
+            <wp:extent cx="3373120" cy="2537460"/>
+            <wp:effectExtent l="0" t="0" r="0" b="0"/>
+            <wp:wrapSquare wrapText="bothSides"/>
+            <wp:docPr id="10" name="Picture 10"/>
+            <wp:cNvGraphicFramePr>
+              <a:graphicFrameLocks xmlns:a="http://schemas.openxmlformats.org/drawingml/2006/main" noChangeAspect="1"/>
+            </wp:cNvGraphicFramePr>
+            <a:graphic xmlns:a="http://schemas.openxmlformats.org/drawingml/2006/main">
+              <a:graphicData uri="http://schemas.openxmlformats.org/drawingml/2006/picture">
+                <pic:pic xmlns:pic="http://schemas.openxmlformats.org/drawingml/2006/picture">
+                  <pic:nvPicPr>
+                    <pic:cNvPr id="0" name="Picture 9"/>
+                    <pic:cNvPicPr>
+                      <a:picLocks noChangeAspect="1" noChangeArrowheads="1"/>
+                    </pic:cNvPicPr>
+                  </pic:nvPicPr>
+                  <pic:blipFill>
+                    <a:blip r:embed="rId17">
+                      <a:extLst>
+                        <a:ext uri="{28A0092B-C50C-407E-A947-70E740481C1C}">
+                          <a14:useLocalDpi xmlns:a14="http://schemas.microsoft.com/office/drawing/2010/main" val="0"/>
+                        </a:ext>
+                      </a:extLst>
+                    </a:blip>
+                    <a:srcRect/>
+                    <a:stretch>
+                      <a:fillRect/>
+                    </a:stretch>
+                  </pic:blipFill>
+                  <pic:spPr bwMode="auto">
+                    <a:xfrm>
+                      <a:off x="0" y="0"/>
+                      <a:ext cx="3373120" cy="2537460"/>
+                    </a:xfrm>
+                    <a:prstGeom prst="rect">
+                      <a:avLst/>
+                    </a:prstGeom>
+                    <a:noFill/>
+                    <a:ln>
+                      <a:noFill/>
+                    </a:ln>
+                  </pic:spPr>
+                </pic:pic>
+              </a:graphicData>
+            </a:graphic>
+            <wp14:sizeRelH relativeFrom="margin">
+              <wp14:pctWidth>0</wp14:pctWidth>
+            </wp14:sizeRelH>
+            <wp14:sizeRelV relativeFrom="margin">
+              <wp14:pctHeight>0</wp14:pctHeight>
+            </wp14:sizeRelV>
+          </wp:anchor>
+        </w:drawing>
+      </w:r>
+    </w:p>
+    <w:p>
+      <w:pPr>
+        <w:rPr>
+          <w:lang w:bidi="fa-IR"/>
+        </w:rPr>
+      </w:pPr>
+    </w:p>
+    <w:p>
+      <w:pPr>
+        <w:rPr>
+          <w:rtl/>
+          <w:lang w:bidi="fa-IR"/>
+        </w:rPr>
+      </w:pPr>
+    </w:p>
+    <w:p>
+      <w:pPr>
+        <w:rPr>
+          <w:rtl/>
+          <w:lang w:bidi="fa-IR"/>
+        </w:rPr>
+      </w:pPr>
+    </w:p>
+    <w:p>
+      <w:pPr>
+        <w:rPr>
+          <w:rtl/>
+          <w:lang w:bidi="fa-IR"/>
+        </w:rPr>
+      </w:pPr>
+    </w:p>
+    <w:p>
+      <w:pPr>
+        <w:jc w:val="center"/>
+        <w:rPr>
+          <w:rtl/>
+          <w:lang w:bidi="fa-IR"/>
+        </w:rPr>
+      </w:pPr>
+      <w:r>
+        <w:rPr>
+          <w:rFonts w:hint="cs"/>
+          <w:rtl/>
+          <w:lang w:bidi="fa-IR"/>
+        </w:rPr>
+        <w:t>پایا</w:t>
+      </w:r>
+      <w:r>
+        <w:rPr>
+          <w:rFonts w:hint="cs"/>
+          <w:rtl/>
+          <w:lang w:bidi="fa-IR"/>
+        </w:rPr>
+        <w:t>ن</w:t>
+      </w:r>
+    </w:p>
+    <w:p>
+      <w:pPr>
+        <w:jc w:val="center"/>
+        <w:rPr>
+          <w:rtl/>
+          <w:lang w:bidi="fa-IR"/>
+        </w:rPr>
+      </w:pPr>
+      <w:r>
+        <w:rPr>
+          <w:rFonts w:hint="cs"/>
+          <w:rtl/>
+          <w:lang w:bidi="fa-IR"/>
+        </w:rPr>
+        <w:t>با تشکر</w:t>
+      </w:r>
+    </w:p>
+    <w:p>
+      <w:pPr>
+        <w:jc w:val="center"/>
+        <w:rPr>
+          <w:rtl/>
+          <w:lang w:bidi="fa-IR"/>
+        </w:rPr>
+      </w:pPr>
+      <w:r>
+        <w:rPr>
+          <w:rFonts w:hint="cs"/>
+          <w:rtl/>
+          <w:lang w:bidi="fa-IR"/>
+        </w:rPr>
+        <w:t xml:space="preserve">امین امانی </w:t>
+      </w:r>
+    </w:p>
+    <w:p>
+      <w:pPr>
+        <w:jc w:val="center"/>
+        <w:rPr>
+          <w:rtl/>
+          <w:lang w:bidi="fa-IR"/>
+        </w:rPr>
+      </w:pPr>
+      <w:r>
+        <w:rPr>
+          <w:rFonts w:hint="cs"/>
+          <w:rtl/>
+          <w:lang w:bidi="fa-IR"/>
+        </w:rPr>
+        <w:t xml:space="preserve">1404 </w:t>
+      </w:r>
+      <w:r>
+        <w:rPr>
+          <w:rtl/>
+          <w:lang w:bidi="fa-IR"/>
+        </w:rPr>
+        <w:t>–</w:t>
+      </w:r>
+      <w:r>
+        <w:rPr>
+          <w:rFonts w:hint="cs"/>
+          <w:rtl/>
+          <w:lang w:bidi="fa-IR"/>
+        </w:rPr>
+        <w:t xml:space="preserve"> 1405</w:t>
+      </w:r>
+    </w:p>
+    <w:p>
+      <w:pPr>
+        <w:jc w:val="center"/>
+        <w:rPr>
+          <w:rtl/>
+          <w:lang w:bidi="fa-IR"/>
+        </w:rPr>
+      </w:pPr>
+      <w:r>
+        <w:rPr>
+          <w:rFonts w:hint="cs"/>
+          <w:rtl/>
+          <w:lang w:bidi="fa-IR"/>
+        </w:rPr>
+        <w:t>دانشگاه علم و صنعت ایران</w:t>
+      </w:r>
     </w:p>
     <w:sectPr>
-      <w:headerReference w:type="default" r:id="rId8"/>
+      <w:headerReference w:type="default" r:id="rId18"/>
       <w:pgSz w:w="12240" w:h="15840"/>
       <w:pgMar w:top="1440" w:right="1440" w:bottom="1440" w:left="1440" w:header="720" w:footer="720" w:gutter="0"/>
       <w:cols w:space="720"/>
@@ -316,13 +3537,715 @@
     <w:pPr>
       <w:pStyle w:val="Header"/>
       <w:rPr>
-        <w:rFonts w:hint="cs"/>
         <w:rtl/>
         <w:lang w:bidi="fa-IR"/>
       </w:rPr>
     </w:pPr>
   </w:p>
 </w:hdr>
+</file>
+
+<file path=word/numbering.xml><?xml version="1.0" encoding="utf-8"?>
+<w:numbering xmlns:wpc="http://schemas.microsoft.com/office/word/2010/wordprocessingCanvas" xmlns:cx="http://schemas.microsoft.com/office/drawing/2014/chartex" xmlns:cx1="http://schemas.microsoft.com/office/drawing/2015/9/8/chartex" xmlns:cx2="http://schemas.microsoft.com/office/drawing/2015/10/21/chartex" xmlns:cx3="http://schemas.microsoft.com/office/drawing/2016/5/9/chartex" xmlns:cx4="http://schemas.microsoft.com/office/drawing/2016/5/10/chartex" xmlns:cx5="http://schemas.microsoft.com/office/drawing/2016/5/11/chartex" xmlns:cx6="http://schemas.microsoft.com/office/drawing/2016/5/12/chartex" xmlns:cx7="http://schemas.microsoft.com/office/drawing/2016/5/13/chartex" xmlns:cx8="http://schemas.microsoft.com/office/drawing/2016/5/14/chartex" xmlns:mc="http://schemas.openxmlformats.org/markup-compatibility/2006" xmlns:aink="http://schemas.microsoft.com/office/drawing/2016/ink" xmlns:am3d="http://schemas.microsoft.com/office/drawing/2017/model3d" xmlns:o="urn:schemas-microsoft-com:office:office" xmlns:r="http://schemas.openxmlformats.org/officeDocument/2006/relationships" xmlns:m="http://schemas.openxmlformats.org/officeDocument/2006/math" xmlns:v="urn:schemas-microsoft-com:vml" xmlns:wp14="http://schemas.microsoft.com/office/word/2010/wordprocessingDrawing" xmlns:wp="http://schemas.openxmlformats.org/drawingml/2006/wordprocessingDrawing" xmlns:w10="urn:schemas-microsoft-com:office:word" xmlns:w="http://schemas.openxmlformats.org/wordprocessingml/2006/main" xmlns:w14="http://schemas.microsoft.com/office/word/2010/wordml" xmlns:w15="http://schemas.microsoft.com/office/word/2012/wordml" xmlns:w16cex="http://schemas.microsoft.com/office/word/2018/wordml/cex" xmlns:w16cid="http://schemas.microsoft.com/office/word/2016/wordml/cid" xmlns:w16="http://schemas.microsoft.com/office/word/2018/wordml" xmlns:w16sdtdh="http://schemas.microsoft.com/office/word/2020/wordml/sdtdatahash" xmlns:w16se="http://schemas.microsoft.com/office/word/2015/wordml/symex" xmlns:wpg="http://schemas.microsoft.com/office/word/2010/wordprocessingGroup" xmlns:wpi="http://schemas.microsoft.com/office/word/2010/wordprocessingInk" xmlns:wne="http://schemas.microsoft.com/office/word/2006/wordml" xmlns:wps="http://schemas.microsoft.com/office/word/2010/wordprocessingShape" mc:Ignorable="w14 w15 w16se w16cid w16 w16cex w16sdtdh wp14">
+  <w:abstractNum w:abstractNumId="0" w15:restartNumberingAfterBreak="0">
+    <w:nsid w:val="1C505698"/>
+    <w:multiLevelType w:val="hybridMultilevel"/>
+    <w:tmpl w:val="529EC9F2"/>
+    <w:lvl w:ilvl="0" w:tplc="21C02E58">
+      <w:start w:val="24"/>
+      <w:numFmt w:val="bullet"/>
+      <w:lvlText w:val=""/>
+      <w:lvlJc w:val="left"/>
+      <w:pPr>
+        <w:ind w:left="720" w:hanging="360"/>
+      </w:pPr>
+      <w:rPr>
+        <w:rFonts w:ascii="Symbol" w:eastAsiaTheme="minorHAnsi" w:hAnsi="Symbol" w:cstheme="minorBidi" w:hint="default"/>
+        <w:color w:val="FF0066"/>
+      </w:rPr>
+    </w:lvl>
+    <w:lvl w:ilvl="1" w:tplc="04090003" w:tentative="1">
+      <w:start w:val="1"/>
+      <w:numFmt w:val="bullet"/>
+      <w:lvlText w:val="o"/>
+      <w:lvlJc w:val="left"/>
+      <w:pPr>
+        <w:ind w:left="1440" w:hanging="360"/>
+      </w:pPr>
+      <w:rPr>
+        <w:rFonts w:ascii="Courier New" w:hAnsi="Courier New" w:cs="Courier New" w:hint="default"/>
+      </w:rPr>
+    </w:lvl>
+    <w:lvl w:ilvl="2" w:tplc="04090005" w:tentative="1">
+      <w:start w:val="1"/>
+      <w:numFmt w:val="bullet"/>
+      <w:lvlText w:val=""/>
+      <w:lvlJc w:val="left"/>
+      <w:pPr>
+        <w:ind w:left="2160" w:hanging="360"/>
+      </w:pPr>
+      <w:rPr>
+        <w:rFonts w:ascii="Wingdings" w:hAnsi="Wingdings" w:hint="default"/>
+      </w:rPr>
+    </w:lvl>
+    <w:lvl w:ilvl="3" w:tplc="04090001" w:tentative="1">
+      <w:start w:val="1"/>
+      <w:numFmt w:val="bullet"/>
+      <w:lvlText w:val=""/>
+      <w:lvlJc w:val="left"/>
+      <w:pPr>
+        <w:ind w:left="2880" w:hanging="360"/>
+      </w:pPr>
+      <w:rPr>
+        <w:rFonts w:ascii="Symbol" w:hAnsi="Symbol" w:hint="default"/>
+      </w:rPr>
+    </w:lvl>
+    <w:lvl w:ilvl="4" w:tplc="04090003" w:tentative="1">
+      <w:start w:val="1"/>
+      <w:numFmt w:val="bullet"/>
+      <w:lvlText w:val="o"/>
+      <w:lvlJc w:val="left"/>
+      <w:pPr>
+        <w:ind w:left="3600" w:hanging="360"/>
+      </w:pPr>
+      <w:rPr>
+        <w:rFonts w:ascii="Courier New" w:hAnsi="Courier New" w:cs="Courier New" w:hint="default"/>
+      </w:rPr>
+    </w:lvl>
+    <w:lvl w:ilvl="5" w:tplc="04090005" w:tentative="1">
+      <w:start w:val="1"/>
+      <w:numFmt w:val="bullet"/>
+      <w:lvlText w:val=""/>
+      <w:lvlJc w:val="left"/>
+      <w:pPr>
+        <w:ind w:left="4320" w:hanging="360"/>
+      </w:pPr>
+      <w:rPr>
+        <w:rFonts w:ascii="Wingdings" w:hAnsi="Wingdings" w:hint="default"/>
+      </w:rPr>
+    </w:lvl>
+    <w:lvl w:ilvl="6" w:tplc="04090001" w:tentative="1">
+      <w:start w:val="1"/>
+      <w:numFmt w:val="bullet"/>
+      <w:lvlText w:val=""/>
+      <w:lvlJc w:val="left"/>
+      <w:pPr>
+        <w:ind w:left="5040" w:hanging="360"/>
+      </w:pPr>
+      <w:rPr>
+        <w:rFonts w:ascii="Symbol" w:hAnsi="Symbol" w:hint="default"/>
+      </w:rPr>
+    </w:lvl>
+    <w:lvl w:ilvl="7" w:tplc="04090003" w:tentative="1">
+      <w:start w:val="1"/>
+      <w:numFmt w:val="bullet"/>
+      <w:lvlText w:val="o"/>
+      <w:lvlJc w:val="left"/>
+      <w:pPr>
+        <w:ind w:left="5760" w:hanging="360"/>
+      </w:pPr>
+      <w:rPr>
+        <w:rFonts w:ascii="Courier New" w:hAnsi="Courier New" w:cs="Courier New" w:hint="default"/>
+      </w:rPr>
+    </w:lvl>
+    <w:lvl w:ilvl="8" w:tplc="04090005" w:tentative="1">
+      <w:start w:val="1"/>
+      <w:numFmt w:val="bullet"/>
+      <w:lvlText w:val=""/>
+      <w:lvlJc w:val="left"/>
+      <w:pPr>
+        <w:ind w:left="6480" w:hanging="360"/>
+      </w:pPr>
+      <w:rPr>
+        <w:rFonts w:ascii="Wingdings" w:hAnsi="Wingdings" w:hint="default"/>
+      </w:rPr>
+    </w:lvl>
+  </w:abstractNum>
+  <w:abstractNum w:abstractNumId="1" w15:restartNumberingAfterBreak="0">
+    <w:nsid w:val="24062026"/>
+    <w:multiLevelType w:val="hybridMultilevel"/>
+    <w:tmpl w:val="4E86D6F6"/>
+    <w:lvl w:ilvl="0" w:tplc="64045834">
+      <w:start w:val="8"/>
+      <w:numFmt w:val="bullet"/>
+      <w:lvlText w:val=""/>
+      <w:lvlJc w:val="left"/>
+      <w:pPr>
+        <w:ind w:left="720" w:hanging="360"/>
+      </w:pPr>
+      <w:rPr>
+        <w:rFonts w:ascii="Symbol" w:eastAsiaTheme="minorHAnsi" w:hAnsi="Symbol" w:cstheme="minorBidi" w:hint="default"/>
+      </w:rPr>
+    </w:lvl>
+    <w:lvl w:ilvl="1" w:tplc="04090003" w:tentative="1">
+      <w:start w:val="1"/>
+      <w:numFmt w:val="bullet"/>
+      <w:lvlText w:val="o"/>
+      <w:lvlJc w:val="left"/>
+      <w:pPr>
+        <w:ind w:left="1440" w:hanging="360"/>
+      </w:pPr>
+      <w:rPr>
+        <w:rFonts w:ascii="Courier New" w:hAnsi="Courier New" w:cs="Courier New" w:hint="default"/>
+      </w:rPr>
+    </w:lvl>
+    <w:lvl w:ilvl="2" w:tplc="04090005" w:tentative="1">
+      <w:start w:val="1"/>
+      <w:numFmt w:val="bullet"/>
+      <w:lvlText w:val=""/>
+      <w:lvlJc w:val="left"/>
+      <w:pPr>
+        <w:ind w:left="2160" w:hanging="360"/>
+      </w:pPr>
+      <w:rPr>
+        <w:rFonts w:ascii="Wingdings" w:hAnsi="Wingdings" w:hint="default"/>
+      </w:rPr>
+    </w:lvl>
+    <w:lvl w:ilvl="3" w:tplc="04090001" w:tentative="1">
+      <w:start w:val="1"/>
+      <w:numFmt w:val="bullet"/>
+      <w:lvlText w:val=""/>
+      <w:lvlJc w:val="left"/>
+      <w:pPr>
+        <w:ind w:left="2880" w:hanging="360"/>
+      </w:pPr>
+      <w:rPr>
+        <w:rFonts w:ascii="Symbol" w:hAnsi="Symbol" w:hint="default"/>
+      </w:rPr>
+    </w:lvl>
+    <w:lvl w:ilvl="4" w:tplc="04090003" w:tentative="1">
+      <w:start w:val="1"/>
+      <w:numFmt w:val="bullet"/>
+      <w:lvlText w:val="o"/>
+      <w:lvlJc w:val="left"/>
+      <w:pPr>
+        <w:ind w:left="3600" w:hanging="360"/>
+      </w:pPr>
+      <w:rPr>
+        <w:rFonts w:ascii="Courier New" w:hAnsi="Courier New" w:cs="Courier New" w:hint="default"/>
+      </w:rPr>
+    </w:lvl>
+    <w:lvl w:ilvl="5" w:tplc="04090005" w:tentative="1">
+      <w:start w:val="1"/>
+      <w:numFmt w:val="bullet"/>
+      <w:lvlText w:val=""/>
+      <w:lvlJc w:val="left"/>
+      <w:pPr>
+        <w:ind w:left="4320" w:hanging="360"/>
+      </w:pPr>
+      <w:rPr>
+        <w:rFonts w:ascii="Wingdings" w:hAnsi="Wingdings" w:hint="default"/>
+      </w:rPr>
+    </w:lvl>
+    <w:lvl w:ilvl="6" w:tplc="04090001" w:tentative="1">
+      <w:start w:val="1"/>
+      <w:numFmt w:val="bullet"/>
+      <w:lvlText w:val=""/>
+      <w:lvlJc w:val="left"/>
+      <w:pPr>
+        <w:ind w:left="5040" w:hanging="360"/>
+      </w:pPr>
+      <w:rPr>
+        <w:rFonts w:ascii="Symbol" w:hAnsi="Symbol" w:hint="default"/>
+      </w:rPr>
+    </w:lvl>
+    <w:lvl w:ilvl="7" w:tplc="04090003" w:tentative="1">
+      <w:start w:val="1"/>
+      <w:numFmt w:val="bullet"/>
+      <w:lvlText w:val="o"/>
+      <w:lvlJc w:val="left"/>
+      <w:pPr>
+        <w:ind w:left="5760" w:hanging="360"/>
+      </w:pPr>
+      <w:rPr>
+        <w:rFonts w:ascii="Courier New" w:hAnsi="Courier New" w:cs="Courier New" w:hint="default"/>
+      </w:rPr>
+    </w:lvl>
+    <w:lvl w:ilvl="8" w:tplc="04090005" w:tentative="1">
+      <w:start w:val="1"/>
+      <w:numFmt w:val="bullet"/>
+      <w:lvlText w:val=""/>
+      <w:lvlJc w:val="left"/>
+      <w:pPr>
+        <w:ind w:left="6480" w:hanging="360"/>
+      </w:pPr>
+      <w:rPr>
+        <w:rFonts w:ascii="Wingdings" w:hAnsi="Wingdings" w:hint="default"/>
+      </w:rPr>
+    </w:lvl>
+  </w:abstractNum>
+  <w:abstractNum w:abstractNumId="2" w15:restartNumberingAfterBreak="0">
+    <w:nsid w:val="328A0E2D"/>
+    <w:multiLevelType w:val="hybridMultilevel"/>
+    <w:tmpl w:val="47D4E78E"/>
+    <w:lvl w:ilvl="0" w:tplc="2538467A">
+      <w:start w:val="8"/>
+      <w:numFmt w:val="bullet"/>
+      <w:lvlText w:val=""/>
+      <w:lvlJc w:val="left"/>
+      <w:pPr>
+        <w:ind w:left="1080" w:hanging="360"/>
+      </w:pPr>
+      <w:rPr>
+        <w:rFonts w:ascii="Symbol" w:eastAsiaTheme="minorHAnsi" w:hAnsi="Symbol" w:cstheme="minorBidi" w:hint="default"/>
+      </w:rPr>
+    </w:lvl>
+    <w:lvl w:ilvl="1" w:tplc="04090003" w:tentative="1">
+      <w:start w:val="1"/>
+      <w:numFmt w:val="bullet"/>
+      <w:lvlText w:val="o"/>
+      <w:lvlJc w:val="left"/>
+      <w:pPr>
+        <w:ind w:left="1800" w:hanging="360"/>
+      </w:pPr>
+      <w:rPr>
+        <w:rFonts w:ascii="Courier New" w:hAnsi="Courier New" w:cs="Courier New" w:hint="default"/>
+      </w:rPr>
+    </w:lvl>
+    <w:lvl w:ilvl="2" w:tplc="04090005" w:tentative="1">
+      <w:start w:val="1"/>
+      <w:numFmt w:val="bullet"/>
+      <w:lvlText w:val=""/>
+      <w:lvlJc w:val="left"/>
+      <w:pPr>
+        <w:ind w:left="2520" w:hanging="360"/>
+      </w:pPr>
+      <w:rPr>
+        <w:rFonts w:ascii="Wingdings" w:hAnsi="Wingdings" w:hint="default"/>
+      </w:rPr>
+    </w:lvl>
+    <w:lvl w:ilvl="3" w:tplc="04090001" w:tentative="1">
+      <w:start w:val="1"/>
+      <w:numFmt w:val="bullet"/>
+      <w:lvlText w:val=""/>
+      <w:lvlJc w:val="left"/>
+      <w:pPr>
+        <w:ind w:left="3240" w:hanging="360"/>
+      </w:pPr>
+      <w:rPr>
+        <w:rFonts w:ascii="Symbol" w:hAnsi="Symbol" w:hint="default"/>
+      </w:rPr>
+    </w:lvl>
+    <w:lvl w:ilvl="4" w:tplc="04090003" w:tentative="1">
+      <w:start w:val="1"/>
+      <w:numFmt w:val="bullet"/>
+      <w:lvlText w:val="o"/>
+      <w:lvlJc w:val="left"/>
+      <w:pPr>
+        <w:ind w:left="3960" w:hanging="360"/>
+      </w:pPr>
+      <w:rPr>
+        <w:rFonts w:ascii="Courier New" w:hAnsi="Courier New" w:cs="Courier New" w:hint="default"/>
+      </w:rPr>
+    </w:lvl>
+    <w:lvl w:ilvl="5" w:tplc="04090005" w:tentative="1">
+      <w:start w:val="1"/>
+      <w:numFmt w:val="bullet"/>
+      <w:lvlText w:val=""/>
+      <w:lvlJc w:val="left"/>
+      <w:pPr>
+        <w:ind w:left="4680" w:hanging="360"/>
+      </w:pPr>
+      <w:rPr>
+        <w:rFonts w:ascii="Wingdings" w:hAnsi="Wingdings" w:hint="default"/>
+      </w:rPr>
+    </w:lvl>
+    <w:lvl w:ilvl="6" w:tplc="04090001" w:tentative="1">
+      <w:start w:val="1"/>
+      <w:numFmt w:val="bullet"/>
+      <w:lvlText w:val=""/>
+      <w:lvlJc w:val="left"/>
+      <w:pPr>
+        <w:ind w:left="5400" w:hanging="360"/>
+      </w:pPr>
+      <w:rPr>
+        <w:rFonts w:ascii="Symbol" w:hAnsi="Symbol" w:hint="default"/>
+      </w:rPr>
+    </w:lvl>
+    <w:lvl w:ilvl="7" w:tplc="04090003" w:tentative="1">
+      <w:start w:val="1"/>
+      <w:numFmt w:val="bullet"/>
+      <w:lvlText w:val="o"/>
+      <w:lvlJc w:val="left"/>
+      <w:pPr>
+        <w:ind w:left="6120" w:hanging="360"/>
+      </w:pPr>
+      <w:rPr>
+        <w:rFonts w:ascii="Courier New" w:hAnsi="Courier New" w:cs="Courier New" w:hint="default"/>
+      </w:rPr>
+    </w:lvl>
+    <w:lvl w:ilvl="8" w:tplc="04090005" w:tentative="1">
+      <w:start w:val="1"/>
+      <w:numFmt w:val="bullet"/>
+      <w:lvlText w:val=""/>
+      <w:lvlJc w:val="left"/>
+      <w:pPr>
+        <w:ind w:left="6840" w:hanging="360"/>
+      </w:pPr>
+      <w:rPr>
+        <w:rFonts w:ascii="Wingdings" w:hAnsi="Wingdings" w:hint="default"/>
+      </w:rPr>
+    </w:lvl>
+  </w:abstractNum>
+  <w:abstractNum w:abstractNumId="3" w15:restartNumberingAfterBreak="0">
+    <w:nsid w:val="4015287D"/>
+    <w:multiLevelType w:val="hybridMultilevel"/>
+    <w:tmpl w:val="21320656"/>
+    <w:lvl w:ilvl="0" w:tplc="A7588FB2">
+      <w:start w:val="19"/>
+      <w:numFmt w:val="bullet"/>
+      <w:lvlText w:val=""/>
+      <w:lvlJc w:val="left"/>
+      <w:pPr>
+        <w:ind w:left="720" w:hanging="360"/>
+      </w:pPr>
+      <w:rPr>
+        <w:rFonts w:ascii="Symbol" w:eastAsiaTheme="minorHAnsi" w:hAnsi="Symbol" w:cstheme="minorBidi" w:hint="default"/>
+      </w:rPr>
+    </w:lvl>
+    <w:lvl w:ilvl="1" w:tplc="04090003" w:tentative="1">
+      <w:start w:val="1"/>
+      <w:numFmt w:val="bullet"/>
+      <w:lvlText w:val="o"/>
+      <w:lvlJc w:val="left"/>
+      <w:pPr>
+        <w:ind w:left="1440" w:hanging="360"/>
+      </w:pPr>
+      <w:rPr>
+        <w:rFonts w:ascii="Courier New" w:hAnsi="Courier New" w:cs="Courier New" w:hint="default"/>
+      </w:rPr>
+    </w:lvl>
+    <w:lvl w:ilvl="2" w:tplc="04090005" w:tentative="1">
+      <w:start w:val="1"/>
+      <w:numFmt w:val="bullet"/>
+      <w:lvlText w:val=""/>
+      <w:lvlJc w:val="left"/>
+      <w:pPr>
+        <w:ind w:left="2160" w:hanging="360"/>
+      </w:pPr>
+      <w:rPr>
+        <w:rFonts w:ascii="Wingdings" w:hAnsi="Wingdings" w:hint="default"/>
+      </w:rPr>
+    </w:lvl>
+    <w:lvl w:ilvl="3" w:tplc="04090001" w:tentative="1">
+      <w:start w:val="1"/>
+      <w:numFmt w:val="bullet"/>
+      <w:lvlText w:val=""/>
+      <w:lvlJc w:val="left"/>
+      <w:pPr>
+        <w:ind w:left="2880" w:hanging="360"/>
+      </w:pPr>
+      <w:rPr>
+        <w:rFonts w:ascii="Symbol" w:hAnsi="Symbol" w:hint="default"/>
+      </w:rPr>
+    </w:lvl>
+    <w:lvl w:ilvl="4" w:tplc="04090003" w:tentative="1">
+      <w:start w:val="1"/>
+      <w:numFmt w:val="bullet"/>
+      <w:lvlText w:val="o"/>
+      <w:lvlJc w:val="left"/>
+      <w:pPr>
+        <w:ind w:left="3600" w:hanging="360"/>
+      </w:pPr>
+      <w:rPr>
+        <w:rFonts w:ascii="Courier New" w:hAnsi="Courier New" w:cs="Courier New" w:hint="default"/>
+      </w:rPr>
+    </w:lvl>
+    <w:lvl w:ilvl="5" w:tplc="04090005" w:tentative="1">
+      <w:start w:val="1"/>
+      <w:numFmt w:val="bullet"/>
+      <w:lvlText w:val=""/>
+      <w:lvlJc w:val="left"/>
+      <w:pPr>
+        <w:ind w:left="4320" w:hanging="360"/>
+      </w:pPr>
+      <w:rPr>
+        <w:rFonts w:ascii="Wingdings" w:hAnsi="Wingdings" w:hint="default"/>
+      </w:rPr>
+    </w:lvl>
+    <w:lvl w:ilvl="6" w:tplc="04090001" w:tentative="1">
+      <w:start w:val="1"/>
+      <w:numFmt w:val="bullet"/>
+      <w:lvlText w:val=""/>
+      <w:lvlJc w:val="left"/>
+      <w:pPr>
+        <w:ind w:left="5040" w:hanging="360"/>
+      </w:pPr>
+      <w:rPr>
+        <w:rFonts w:ascii="Symbol" w:hAnsi="Symbol" w:hint="default"/>
+      </w:rPr>
+    </w:lvl>
+    <w:lvl w:ilvl="7" w:tplc="04090003" w:tentative="1">
+      <w:start w:val="1"/>
+      <w:numFmt w:val="bullet"/>
+      <w:lvlText w:val="o"/>
+      <w:lvlJc w:val="left"/>
+      <w:pPr>
+        <w:ind w:left="5760" w:hanging="360"/>
+      </w:pPr>
+      <w:rPr>
+        <w:rFonts w:ascii="Courier New" w:hAnsi="Courier New" w:cs="Courier New" w:hint="default"/>
+      </w:rPr>
+    </w:lvl>
+    <w:lvl w:ilvl="8" w:tplc="04090005" w:tentative="1">
+      <w:start w:val="1"/>
+      <w:numFmt w:val="bullet"/>
+      <w:lvlText w:val=""/>
+      <w:lvlJc w:val="left"/>
+      <w:pPr>
+        <w:ind w:left="6480" w:hanging="360"/>
+      </w:pPr>
+      <w:rPr>
+        <w:rFonts w:ascii="Wingdings" w:hAnsi="Wingdings" w:hint="default"/>
+      </w:rPr>
+    </w:lvl>
+  </w:abstractNum>
+  <w:abstractNum w:abstractNumId="4" w15:restartNumberingAfterBreak="0">
+    <w:nsid w:val="56651664"/>
+    <w:multiLevelType w:val="hybridMultilevel"/>
+    <w:tmpl w:val="C9A0A658"/>
+    <w:lvl w:ilvl="0" w:tplc="0B6ECB2A">
+      <w:start w:val="24"/>
+      <w:numFmt w:val="bullet"/>
+      <w:lvlText w:val=""/>
+      <w:lvlJc w:val="left"/>
+      <w:pPr>
+        <w:ind w:left="720" w:hanging="360"/>
+      </w:pPr>
+      <w:rPr>
+        <w:rFonts w:ascii="Symbol" w:eastAsiaTheme="minorHAnsi" w:hAnsi="Symbol" w:cstheme="minorBidi" w:hint="default"/>
+        <w:color w:val="FF0066"/>
+      </w:rPr>
+    </w:lvl>
+    <w:lvl w:ilvl="1" w:tplc="04090003" w:tentative="1">
+      <w:start w:val="1"/>
+      <w:numFmt w:val="bullet"/>
+      <w:lvlText w:val="o"/>
+      <w:lvlJc w:val="left"/>
+      <w:pPr>
+        <w:ind w:left="1440" w:hanging="360"/>
+      </w:pPr>
+      <w:rPr>
+        <w:rFonts w:ascii="Courier New" w:hAnsi="Courier New" w:cs="Courier New" w:hint="default"/>
+      </w:rPr>
+    </w:lvl>
+    <w:lvl w:ilvl="2" w:tplc="04090005" w:tentative="1">
+      <w:start w:val="1"/>
+      <w:numFmt w:val="bullet"/>
+      <w:lvlText w:val=""/>
+      <w:lvlJc w:val="left"/>
+      <w:pPr>
+        <w:ind w:left="2160" w:hanging="360"/>
+      </w:pPr>
+      <w:rPr>
+        <w:rFonts w:ascii="Wingdings" w:hAnsi="Wingdings" w:hint="default"/>
+      </w:rPr>
+    </w:lvl>
+    <w:lvl w:ilvl="3" w:tplc="04090001" w:tentative="1">
+      <w:start w:val="1"/>
+      <w:numFmt w:val="bullet"/>
+      <w:lvlText w:val=""/>
+      <w:lvlJc w:val="left"/>
+      <w:pPr>
+        <w:ind w:left="2880" w:hanging="360"/>
+      </w:pPr>
+      <w:rPr>
+        <w:rFonts w:ascii="Symbol" w:hAnsi="Symbol" w:hint="default"/>
+      </w:rPr>
+    </w:lvl>
+    <w:lvl w:ilvl="4" w:tplc="04090003" w:tentative="1">
+      <w:start w:val="1"/>
+      <w:numFmt w:val="bullet"/>
+      <w:lvlText w:val="o"/>
+      <w:lvlJc w:val="left"/>
+      <w:pPr>
+        <w:ind w:left="3600" w:hanging="360"/>
+      </w:pPr>
+      <w:rPr>
+        <w:rFonts w:ascii="Courier New" w:hAnsi="Courier New" w:cs="Courier New" w:hint="default"/>
+      </w:rPr>
+    </w:lvl>
+    <w:lvl w:ilvl="5" w:tplc="04090005" w:tentative="1">
+      <w:start w:val="1"/>
+      <w:numFmt w:val="bullet"/>
+      <w:lvlText w:val=""/>
+      <w:lvlJc w:val="left"/>
+      <w:pPr>
+        <w:ind w:left="4320" w:hanging="360"/>
+      </w:pPr>
+      <w:rPr>
+        <w:rFonts w:ascii="Wingdings" w:hAnsi="Wingdings" w:hint="default"/>
+      </w:rPr>
+    </w:lvl>
+    <w:lvl w:ilvl="6" w:tplc="04090001" w:tentative="1">
+      <w:start w:val="1"/>
+      <w:numFmt w:val="bullet"/>
+      <w:lvlText w:val=""/>
+      <w:lvlJc w:val="left"/>
+      <w:pPr>
+        <w:ind w:left="5040" w:hanging="360"/>
+      </w:pPr>
+      <w:rPr>
+        <w:rFonts w:ascii="Symbol" w:hAnsi="Symbol" w:hint="default"/>
+      </w:rPr>
+    </w:lvl>
+    <w:lvl w:ilvl="7" w:tplc="04090003" w:tentative="1">
+      <w:start w:val="1"/>
+      <w:numFmt w:val="bullet"/>
+      <w:lvlText w:val="o"/>
+      <w:lvlJc w:val="left"/>
+      <w:pPr>
+        <w:ind w:left="5760" w:hanging="360"/>
+      </w:pPr>
+      <w:rPr>
+        <w:rFonts w:ascii="Courier New" w:hAnsi="Courier New" w:cs="Courier New" w:hint="default"/>
+      </w:rPr>
+    </w:lvl>
+    <w:lvl w:ilvl="8" w:tplc="04090005" w:tentative="1">
+      <w:start w:val="1"/>
+      <w:numFmt w:val="bullet"/>
+      <w:lvlText w:val=""/>
+      <w:lvlJc w:val="left"/>
+      <w:pPr>
+        <w:ind w:left="6480" w:hanging="360"/>
+      </w:pPr>
+      <w:rPr>
+        <w:rFonts w:ascii="Wingdings" w:hAnsi="Wingdings" w:hint="default"/>
+      </w:rPr>
+    </w:lvl>
+  </w:abstractNum>
+  <w:abstractNum w:abstractNumId="5" w15:restartNumberingAfterBreak="0">
+    <w:nsid w:val="7B897D75"/>
+    <w:multiLevelType w:val="hybridMultilevel"/>
+    <w:tmpl w:val="F596327A"/>
+    <w:lvl w:ilvl="0" w:tplc="BF70A81E">
+      <w:start w:val="4"/>
+      <w:numFmt w:val="bullet"/>
+      <w:lvlText w:val=""/>
+      <w:lvlJc w:val="left"/>
+      <w:pPr>
+        <w:ind w:left="720" w:hanging="360"/>
+      </w:pPr>
+      <w:rPr>
+        <w:rFonts w:ascii="Symbol" w:eastAsiaTheme="minorHAnsi" w:hAnsi="Symbol" w:cstheme="minorBidi" w:hint="default"/>
+      </w:rPr>
+    </w:lvl>
+    <w:lvl w:ilvl="1" w:tplc="04090003" w:tentative="1">
+      <w:start w:val="1"/>
+      <w:numFmt w:val="bullet"/>
+      <w:lvlText w:val="o"/>
+      <w:lvlJc w:val="left"/>
+      <w:pPr>
+        <w:ind w:left="1440" w:hanging="360"/>
+      </w:pPr>
+      <w:rPr>
+        <w:rFonts w:ascii="Courier New" w:hAnsi="Courier New" w:cs="Courier New" w:hint="default"/>
+      </w:rPr>
+    </w:lvl>
+    <w:lvl w:ilvl="2" w:tplc="04090005" w:tentative="1">
+      <w:start w:val="1"/>
+      <w:numFmt w:val="bullet"/>
+      <w:lvlText w:val=""/>
+      <w:lvlJc w:val="left"/>
+      <w:pPr>
+        <w:ind w:left="2160" w:hanging="360"/>
+      </w:pPr>
+      <w:rPr>
+        <w:rFonts w:ascii="Wingdings" w:hAnsi="Wingdings" w:hint="default"/>
+      </w:rPr>
+    </w:lvl>
+    <w:lvl w:ilvl="3" w:tplc="04090001" w:tentative="1">
+      <w:start w:val="1"/>
+      <w:numFmt w:val="bullet"/>
+      <w:lvlText w:val=""/>
+      <w:lvlJc w:val="left"/>
+      <w:pPr>
+        <w:ind w:left="2880" w:hanging="360"/>
+      </w:pPr>
+      <w:rPr>
+        <w:rFonts w:ascii="Symbol" w:hAnsi="Symbol" w:hint="default"/>
+      </w:rPr>
+    </w:lvl>
+    <w:lvl w:ilvl="4" w:tplc="04090003" w:tentative="1">
+      <w:start w:val="1"/>
+      <w:numFmt w:val="bullet"/>
+      <w:lvlText w:val="o"/>
+      <w:lvlJc w:val="left"/>
+      <w:pPr>
+        <w:ind w:left="3600" w:hanging="360"/>
+      </w:pPr>
+      <w:rPr>
+        <w:rFonts w:ascii="Courier New" w:hAnsi="Courier New" w:cs="Courier New" w:hint="default"/>
+      </w:rPr>
+    </w:lvl>
+    <w:lvl w:ilvl="5" w:tplc="04090005" w:tentative="1">
+      <w:start w:val="1"/>
+      <w:numFmt w:val="bullet"/>
+      <w:lvlText w:val=""/>
+      <w:lvlJc w:val="left"/>
+      <w:pPr>
+        <w:ind w:left="4320" w:hanging="360"/>
+      </w:pPr>
+      <w:rPr>
+        <w:rFonts w:ascii="Wingdings" w:hAnsi="Wingdings" w:hint="default"/>
+      </w:rPr>
+    </w:lvl>
+    <w:lvl w:ilvl="6" w:tplc="04090001" w:tentative="1">
+      <w:start w:val="1"/>
+      <w:numFmt w:val="bullet"/>
+      <w:lvlText w:val=""/>
+      <w:lvlJc w:val="left"/>
+      <w:pPr>
+        <w:ind w:left="5040" w:hanging="360"/>
+      </w:pPr>
+      <w:rPr>
+        <w:rFonts w:ascii="Symbol" w:hAnsi="Symbol" w:hint="default"/>
+      </w:rPr>
+    </w:lvl>
+    <w:lvl w:ilvl="7" w:tplc="04090003" w:tentative="1">
+      <w:start w:val="1"/>
+      <w:numFmt w:val="bullet"/>
+      <w:lvlText w:val="o"/>
+      <w:lvlJc w:val="left"/>
+      <w:pPr>
+        <w:ind w:left="5760" w:hanging="360"/>
+      </w:pPr>
+      <w:rPr>
+        <w:rFonts w:ascii="Courier New" w:hAnsi="Courier New" w:cs="Courier New" w:hint="default"/>
+      </w:rPr>
+    </w:lvl>
+    <w:lvl w:ilvl="8" w:tplc="04090005" w:tentative="1">
+      <w:start w:val="1"/>
+      <w:numFmt w:val="bullet"/>
+      <w:lvlText w:val=""/>
+      <w:lvlJc w:val="left"/>
+      <w:pPr>
+        <w:ind w:left="6480" w:hanging="360"/>
+      </w:pPr>
+      <w:rPr>
+        <w:rFonts w:ascii="Wingdings" w:hAnsi="Wingdings" w:hint="default"/>
+      </w:rPr>
+    </w:lvl>
+  </w:abstractNum>
+  <w:num w:numId="1">
+    <w:abstractNumId w:val="3"/>
+  </w:num>
+  <w:num w:numId="2">
+    <w:abstractNumId w:val="0"/>
+  </w:num>
+  <w:num w:numId="3">
+    <w:abstractNumId w:val="4"/>
+  </w:num>
+  <w:num w:numId="4">
+    <w:abstractNumId w:val="1"/>
+  </w:num>
+  <w:num w:numId="5">
+    <w:abstractNumId w:val="2"/>
+  </w:num>
+  <w:num w:numId="6">
+    <w:abstractNumId w:val="5"/>
+  </w:num>
+</w:numbering>
 </file>
 
 <file path=word/styles.xml><?xml version="1.0" encoding="utf-8"?>
@@ -795,6 +4718,33 @@
     <w:uiPriority w:val="99"/>
     <w:rsid w:val="006D6FF7"/>
   </w:style>
+  <w:style w:type="paragraph" w:styleId="ListParagraph">
+    <w:name w:val="List Paragraph"/>
+    <w:basedOn w:val="Normal"/>
+    <w:uiPriority w:val="34"/>
+    <w:qFormat/>
+    <w:rsid w:val="00EB1A54"/>
+    <w:pPr>
+      <w:ind w:left="720"/>
+      <w:contextualSpacing/>
+    </w:pPr>
+  </w:style>
+  <w:style w:type="paragraph" w:styleId="NormalWeb">
+    <w:name w:val="Normal (Web)"/>
+    <w:basedOn w:val="Normal"/>
+    <w:uiPriority w:val="99"/>
+    <w:semiHidden/>
+    <w:unhideWhenUsed/>
+    <w:rsid w:val="001D45A2"/>
+    <w:pPr>
+      <w:spacing w:before="100" w:beforeAutospacing="1" w:after="100" w:afterAutospacing="1" w:line="240" w:lineRule="auto"/>
+    </w:pPr>
+    <w:rPr>
+      <w:rFonts w:ascii="Times New Roman" w:eastAsia="Times New Roman" w:hAnsi="Times New Roman" w:cs="Times New Roman"/>
+      <w:sz w:val="24"/>
+      <w:szCs w:val="24"/>
+    </w:rPr>
+  </w:style>
 </w:styles>
 </file>
 

</xml_diff>

<commit_message>
finish for now and just fix one little error in analyzer ... (e) to e .
</commit_message>
<xml_diff>
--- a/پروژه فردی پایانترم نیمسال دوم 1404.docx
+++ b/پروژه فردی پایانترم نیمسال دوم 1404.docx
@@ -2255,7 +2255,87 @@
           <w:rtl/>
           <w:lang w:bidi="fa-IR"/>
         </w:rPr>
-        <w:t xml:space="preserve"> . برای رسم جدول ابتدا صفحه رو پاکسازی میکنیم بعدش یه شکل جدید میسازیم بعد تابع ایمشو تو شکل جدیدمون میاد ماتریس دو بعدی مون رو به یک جدول رنگی تبدیل میکند . پالت رنگی استاندارد کول وارم همان طیف رنگی است که خانه های جدول ر ا رنگ میکند برای اعداد منفی رنگ ابی و برای مثبت رنگ قرمز و برای صفر رنگ سفید ر اختصاص میدهد  و داخل همین متد بهش میگیم کف رنگ ابی روی عدد -1 و سقف رنگ قرمز روی عدد +1 قفل شود .</w:t>
+        <w:t xml:space="preserve"> . برای رسم جدول ابتدا صفحه رو پاکسازی میکنیم بعدش یه شکل جدید میسازیم بعد تابع ایمشو تو شکل جدیدمون میاد ماتریس دو بعدی مون رو به یک جدول رنگی تبدیل میکند . پالت رنگی استاندارد </w:t>
+      </w:r>
+      <w:r>
+        <w:rPr>
+          <w:rFonts w:hint="cs"/>
+          <w:rtl/>
+          <w:lang w:bidi="fa-IR"/>
+        </w:rPr>
+        <w:t>بی دبلیو آر</w:t>
+      </w:r>
+      <w:r>
+        <w:rPr>
+          <w:rFonts w:hint="cs"/>
+          <w:rtl/>
+          <w:lang w:bidi="fa-IR"/>
+        </w:rPr>
+        <w:t xml:space="preserve"> همان طیف رنگی است که خانه های جدول ر ا رنگ میکند برای اعداد منفی رنگ ابی</w:t>
+      </w:r>
+      <w:r>
+        <w:rPr>
+          <w:rFonts w:hint="cs"/>
+          <w:rtl/>
+          <w:lang w:bidi="fa-IR"/>
+        </w:rPr>
+        <w:t xml:space="preserve"> تیره</w:t>
+      </w:r>
+      <w:r>
+        <w:rPr>
+          <w:rFonts w:hint="cs"/>
+          <w:rtl/>
+          <w:lang w:bidi="fa-IR"/>
+        </w:rPr>
+        <w:t xml:space="preserve"> و برای مثبت رنگ قرمز</w:t>
+      </w:r>
+      <w:r>
+        <w:rPr>
+          <w:rFonts w:hint="cs"/>
+          <w:rtl/>
+          <w:lang w:bidi="fa-IR"/>
+        </w:rPr>
+        <w:t xml:space="preserve"> تیره</w:t>
+      </w:r>
+      <w:r>
+        <w:rPr>
+          <w:rFonts w:hint="cs"/>
+          <w:rtl/>
+          <w:lang w:bidi="fa-IR"/>
+        </w:rPr>
+        <w:t xml:space="preserve"> و برای صفر رنگ سفید ر اختصاص میدهد  و داخل همین متد بهش میگیم کف رنگ ابی</w:t>
+      </w:r>
+      <w:r>
+        <w:rPr>
+          <w:rFonts w:hint="cs"/>
+          <w:rtl/>
+          <w:lang w:bidi="fa-IR"/>
+        </w:rPr>
+        <w:t xml:space="preserve"> تیره</w:t>
+      </w:r>
+      <w:r>
+        <w:rPr>
+          <w:rFonts w:hint="cs"/>
+          <w:rtl/>
+          <w:lang w:bidi="fa-IR"/>
+        </w:rPr>
+        <w:t xml:space="preserve"> روی عدد -1 و سقف رنگ قرمز</w:t>
+      </w:r>
+      <w:r>
+        <w:rPr>
+          <w:rFonts w:hint="cs"/>
+          <w:rtl/>
+          <w:lang w:bidi="fa-IR"/>
+        </w:rPr>
+        <w:t xml:space="preserve"> تیره</w:t>
+      </w:r>
+      <w:r>
+        <w:rPr>
+          <w:rFonts w:hint="cs"/>
+          <w:rtl/>
+          <w:lang w:bidi="fa-IR"/>
+        </w:rPr>
+        <w:t xml:space="preserve"> روی عدد +1 قفل شود .</w:t>
       </w:r>
       <w:r>
         <w:rPr>
@@ -2381,7 +2461,17 @@
           <w:rtl/>
           <w:lang w:bidi="fa-IR"/>
         </w:rPr>
-        <w:t xml:space="preserve">توضیح مختصر کتابخانه واژه ابر : این کتابخانه برای تبدیل داده های متنی انبوه به یک تصویر گرافیکی استفاده میشود . اینطوریه که تعداد تکرار هر کلمه در متن ورودی را میگیرد و هر چقدر یک کلمه ( در اینج مثلا ژانر ها یا هر ویژگی که کاربر خودش ورودی بده ) در دیتابیس بیشتر تکرار شده باشد در تصویر نهایی با فونت بزرگتر بزرگتر و مرکزی تر نمایش داده میشود و کلماتی که تکرار کمتری دارند با فونت های کوچکتر و در حاشیه ها قرار  میگرند . </w:t>
+        <w:t xml:space="preserve">توضیح مختصر کتابخانه واژه ابر : این کتابخانه برای تبدیل داده های متنی انبوه به یک تصویر گرافیکی استفاده میشود . اینطوریه که تعداد تکرار هر کلمه در متن ورودی را میگیرد و هر چقدر یک کلمه ( در اینج مثلا ژانر ها یا هر ویژگی که کاربر خودش </w:t>
+      </w:r>
+      <w:r>
+        <w:rPr>
+          <w:rFonts w:hint="cs"/>
+          <w:color w:val="538135" w:themeColor="accent6" w:themeShade="BF"/>
+          <w:rtl/>
+          <w:lang w:bidi="fa-IR"/>
+        </w:rPr>
+        <w:lastRenderedPageBreak/>
+        <w:t xml:space="preserve">ورودی بده ) در دیتابیس بیشتر تکرار شده باشد در تصویر نهایی با فونت بزرگتر بزرگتر و مرکزی تر نمایش داده میشود و کلماتی که تکرار کمتری دارند با فونت های کوچکتر و در حاشیه ها قرار  میگرند . </w:t>
       </w:r>
     </w:p>
     <w:p>
@@ -2399,8 +2489,16 @@
           <w:rtl/>
           <w:lang w:bidi="fa-IR"/>
         </w:rPr>
-        <w:lastRenderedPageBreak/>
         <w:t xml:space="preserve">توی کدش هم که خیلی سادس اول میایم یه متن از همه ویژگی های اهنگ ها (ویژگی ای که کاربر خودش ورودی داده ) میسازیم بعد با استفاده از تابع اماده جنریت تو کتابخانه مون . تصویرمون رو میسازیم . </w:t>
+      </w:r>
+      <w:r>
+        <w:rPr>
+          <w:rFonts w:hint="cs"/>
+          <w:color w:val="FF0000"/>
+          <w:rtl/>
+          <w:lang w:bidi="fa-IR"/>
+        </w:rPr>
+        <w:t>بعدش نمودار ها خط ها درجه بندی ها را حذف میکنیم .</w:t>
       </w:r>
     </w:p>
     <w:p>

</xml_diff>

<commit_message>
fix some little bugs in main and data loader like (or , and) and some printing bugs .
</commit_message>
<xml_diff>
--- a/پروژه فردی پایانترم نیمسال دوم 1404.docx
+++ b/پروژه فردی پایانترم نیمسال دوم 1404.docx
@@ -1141,15 +1141,7 @@
           <w:rtl/>
           <w:lang w:bidi="fa-IR"/>
         </w:rPr>
-        <w:t xml:space="preserve">16 . </w:t>
-      </w:r>
-      <w:r>
-        <w:rPr>
-          <w:rFonts w:hint="cs"/>
-          <w:rtl/>
-          <w:lang w:bidi="fa-IR"/>
-        </w:rPr>
-        <w:t xml:space="preserve">و اما یه بخش جذاب دیگه ... زیر کلاس دوم تو بخش مدیریت داده های پرت که با استفاده از چیزی بنام </w:t>
+        <w:t>16 .</w:t>
       </w:r>
       <w:r>
         <w:rPr>
@@ -1158,6 +1150,23 @@
           <w:rtl/>
           <w:lang w:bidi="fa-IR"/>
         </w:rPr>
+        <w:t>چالش دوم:</w:t>
+      </w:r>
+      <w:r>
+        <w:rPr>
+          <w:rFonts w:hint="cs"/>
+          <w:rtl/>
+          <w:lang w:bidi="fa-IR"/>
+        </w:rPr>
+        <w:t xml:space="preserve">و اما یه بخش جذاب دیگه..زیر کلاس دوم توبخش مدیریت داده های پرت که با استفاده از چیزی بنام </w:t>
+      </w:r>
+      <w:r>
+        <w:rPr>
+          <w:rFonts w:hint="cs"/>
+          <w:color w:val="FF0000"/>
+          <w:rtl/>
+          <w:lang w:bidi="fa-IR"/>
+        </w:rPr>
         <w:t>نمره استاندارد</w:t>
       </w:r>
       <w:r>
@@ -1183,7 +1192,7 @@
           <w:rtl/>
           <w:lang w:bidi="fa-IR"/>
         </w:rPr>
-        <w:t xml:space="preserve"> تو این پروژه یا نه ؟! چون هیچ چیزی از این روش نمیدونستم و بعد خوندن و سرچ و تحقیق در موردش چیز زیاد سخت و طاقت فرسایی به نظر نیومد بلکه جالب بود بنظرم ... اول یه خلاصه بگم که این روش چیه اصلا ؟؟</w:t>
+        <w:t xml:space="preserve"> تو این پروژه یا نه؟! چون هیچ چیزی از این روش نمیدونستم و بعد خوندن و سرچ و تحقیق در موردش چیز زیاد سخت و طاقت فرسایی به نظر نیومد بلکه جالب بود بنظرم .. اول یه خلاصه بگم که این روش چیه اصلا ؟؟</w:t>
       </w:r>
     </w:p>
     <w:p>
@@ -1925,7 +1934,37 @@
           <w:szCs w:val="22"/>
           <w:rtl/>
         </w:rPr>
-        <w:t xml:space="preserve">25 . </w:t>
+        <w:t>25 .</w:t>
+      </w:r>
+      <w:r>
+        <w:rPr>
+          <w:rFonts w:hint="cs"/>
+          <w:color w:val="000000" w:themeColor="text1"/>
+          <w:sz w:val="22"/>
+          <w:szCs w:val="22"/>
+          <w:rtl/>
+        </w:rPr>
+        <w:t xml:space="preserve"> </w:t>
+      </w:r>
+      <w:r>
+        <w:rPr>
+          <w:rFonts w:hint="cs"/>
+          <w:color w:val="FF0000"/>
+          <w:sz w:val="22"/>
+          <w:szCs w:val="22"/>
+          <w:rtl/>
+        </w:rPr>
+        <w:t>چالش سوم :</w:t>
+      </w:r>
+      <w:r>
+        <w:rPr>
+          <w:rFonts w:hint="cs"/>
+          <w:color w:val="000000" w:themeColor="text1"/>
+          <w:sz w:val="22"/>
+          <w:szCs w:val="22"/>
+          <w:rtl/>
+        </w:rPr>
+        <w:t xml:space="preserve"> </w:t>
       </w:r>
       <w:r>
         <w:rPr>

</xml_diff>

<commit_message>
fix some bugs in knn imputer ... and add try except part in visualizer class like boxplot and ... .
</commit_message>
<xml_diff>
--- a/پروژه فردی پایانترم نیمسال دوم 1404.docx
+++ b/پروژه فردی پایانترم نیمسال دوم 1404.docx
@@ -136,6 +136,14 @@
           <w:lang w:bidi="fa-IR"/>
         </w:rPr>
         <w:t>دانشکده ریاضی و علوم کامپیوتر</w:t>
+      </w:r>
+      <w:r>
+        <w:rPr>
+          <w:rFonts w:hint="cs"/>
+          <w:rtl/>
+          <w:lang w:bidi="fa-IR"/>
+        </w:rPr>
+        <w:t xml:space="preserve"> . رشته : علوم کامپیوتر .</w:t>
       </w:r>
     </w:p>
     <w:p>
@@ -3383,18 +3391,25 @@
           <w:lang w:bidi="fa-IR"/>
         </w:rPr>
       </w:pPr>
+    </w:p>
+    <w:p>
+      <w:pPr>
+        <w:rPr>
+          <w:lang w:bidi="fa-IR"/>
+        </w:rPr>
+      </w:pPr>
       <w:r>
         <w:rPr>
           <w:noProof/>
         </w:rPr>
         <w:drawing>
-          <wp:anchor distT="0" distB="0" distL="114300" distR="114300" simplePos="0" relativeHeight="251664384" behindDoc="0" locked="0" layoutInCell="1" allowOverlap="1" wp14:anchorId="7A04ABA7" wp14:editId="046E0F8D">
+          <wp:anchor distT="0" distB="0" distL="114300" distR="114300" simplePos="0" relativeHeight="251664384" behindDoc="0" locked="0" layoutInCell="1" allowOverlap="1" wp14:anchorId="7A04ABA7" wp14:editId="27054E9D">
             <wp:simplePos x="0" y="0"/>
             <wp:positionH relativeFrom="margin">
-              <wp:posOffset>3292475</wp:posOffset>
+              <wp:posOffset>2274166</wp:posOffset>
             </wp:positionH>
             <wp:positionV relativeFrom="paragraph">
-              <wp:posOffset>244475</wp:posOffset>
+              <wp:posOffset>154478</wp:posOffset>
             </wp:positionV>
             <wp:extent cx="3373120" cy="2537460"/>
             <wp:effectExtent l="0" t="0" r="0" b="0"/>
@@ -3454,25 +3469,3988 @@
     <w:p>
       <w:pPr>
         <w:rPr>
-          <w:lang w:bidi="fa-IR"/>
-        </w:rPr>
-      </w:pPr>
-    </w:p>
-    <w:p>
-      <w:pPr>
-        <w:rPr>
-          <w:rtl/>
-          <w:lang w:bidi="fa-IR"/>
-        </w:rPr>
-      </w:pPr>
-    </w:p>
-    <w:p>
-      <w:pPr>
-        <w:rPr>
-          <w:rtl/>
-          <w:lang w:bidi="fa-IR"/>
-        </w:rPr>
-      </w:pPr>
+          <w:rtl/>
+          <w:lang w:bidi="fa-IR"/>
+        </w:rPr>
+      </w:pPr>
+    </w:p>
+    <w:p>
+      <w:pPr>
+        <w:rPr>
+          <w:rtl/>
+          <w:lang w:bidi="fa-IR"/>
+        </w:rPr>
+      </w:pPr>
+    </w:p>
+    <w:p>
+      <w:pPr>
+        <w:rPr>
+          <w:lang w:bidi="fa-IR"/>
+        </w:rPr>
+      </w:pPr>
+    </w:p>
+    <w:p>
+      <w:pPr>
+        <w:rPr>
+          <w:lang w:bidi="fa-IR"/>
+        </w:rPr>
+      </w:pPr>
+    </w:p>
+    <w:p>
+      <w:pPr>
+        <w:rPr>
+          <w:lang w:bidi="fa-IR"/>
+        </w:rPr>
+      </w:pPr>
+    </w:p>
+    <w:p>
+      <w:pPr>
+        <w:rPr>
+          <w:lang w:bidi="fa-IR"/>
+        </w:rPr>
+      </w:pPr>
+    </w:p>
+    <w:p>
+      <w:pPr>
+        <w:rPr>
+          <w:lang w:bidi="fa-IR"/>
+        </w:rPr>
+      </w:pPr>
+    </w:p>
+    <w:p>
+      <w:pPr>
+        <w:rPr>
+          <w:lang w:bidi="fa-IR"/>
+        </w:rPr>
+      </w:pPr>
+    </w:p>
+    <w:p>
+      <w:pPr>
+        <w:rPr>
+          <w:rtl/>
+          <w:lang w:bidi="fa-IR"/>
+        </w:rPr>
+      </w:pPr>
+    </w:p>
+    <w:p>
+      <w:pPr>
+        <w:jc w:val="right"/>
+        <w:rPr>
+          <w:color w:val="FF0000"/>
+          <w:lang w:bidi="fa-IR"/>
+        </w:rPr>
+      </w:pPr>
+      <w:r>
+        <w:rPr>
+          <w:rFonts w:cs="Arial" w:hint="cs"/>
+          <w:color w:val="FF0000"/>
+          <w:rtl/>
+          <w:lang w:bidi="fa-IR"/>
+        </w:rPr>
+        <w:lastRenderedPageBreak/>
+        <w:t>و اما ت</w:t>
+      </w:r>
+      <w:r>
+        <w:rPr>
+          <w:rFonts w:cs="Arial"/>
+          <w:color w:val="FF0000"/>
+          <w:rtl/>
+          <w:lang w:bidi="fa-IR"/>
+        </w:rPr>
+        <w:t>جرب</w:t>
+      </w:r>
+      <w:r>
+        <w:rPr>
+          <w:rFonts w:cs="Arial" w:hint="cs"/>
+          <w:color w:val="FF0000"/>
+          <w:rtl/>
+          <w:lang w:bidi="fa-IR"/>
+        </w:rPr>
+        <w:t>ی</w:t>
+      </w:r>
+      <w:r>
+        <w:rPr>
+          <w:rFonts w:cs="Arial" w:hint="eastAsia"/>
+          <w:color w:val="FF0000"/>
+          <w:rtl/>
+          <w:lang w:bidi="fa-IR"/>
+        </w:rPr>
+        <w:t>ات</w:t>
+      </w:r>
+      <w:r>
+        <w:rPr>
+          <w:rFonts w:cs="Arial"/>
+          <w:color w:val="FF0000"/>
+          <w:rtl/>
+          <w:lang w:bidi="fa-IR"/>
+        </w:rPr>
+        <w:t xml:space="preserve"> </w:t>
+      </w:r>
+      <w:r>
+        <w:rPr>
+          <w:rFonts w:cs="Arial" w:hint="cs"/>
+          <w:color w:val="FF0000"/>
+          <w:rtl/>
+          <w:lang w:bidi="fa-IR"/>
+        </w:rPr>
+        <w:t>ی</w:t>
+      </w:r>
+      <w:r>
+        <w:rPr>
+          <w:rFonts w:cs="Arial" w:hint="eastAsia"/>
+          <w:color w:val="FF0000"/>
+          <w:rtl/>
+          <w:lang w:bidi="fa-IR"/>
+        </w:rPr>
+        <w:t>ادگ</w:t>
+      </w:r>
+      <w:r>
+        <w:rPr>
+          <w:rFonts w:cs="Arial" w:hint="cs"/>
+          <w:color w:val="FF0000"/>
+          <w:rtl/>
+          <w:lang w:bidi="fa-IR"/>
+        </w:rPr>
+        <w:t>ی</w:t>
+      </w:r>
+      <w:r>
+        <w:rPr>
+          <w:rFonts w:cs="Arial" w:hint="eastAsia"/>
+          <w:color w:val="FF0000"/>
+          <w:rtl/>
+          <w:lang w:bidi="fa-IR"/>
+        </w:rPr>
+        <w:t>ر</w:t>
+      </w:r>
+      <w:r>
+        <w:rPr>
+          <w:rFonts w:cs="Arial" w:hint="cs"/>
+          <w:color w:val="FF0000"/>
+          <w:rtl/>
+          <w:lang w:bidi="fa-IR"/>
+        </w:rPr>
+        <w:t>ی</w:t>
+      </w:r>
+      <w:r>
+        <w:rPr>
+          <w:rFonts w:cs="Arial"/>
+          <w:color w:val="FF0000"/>
+          <w:rtl/>
+          <w:lang w:bidi="fa-IR"/>
+        </w:rPr>
+        <w:t>: کاربرد واقع</w:t>
+      </w:r>
+      <w:r>
+        <w:rPr>
+          <w:rFonts w:cs="Arial" w:hint="cs"/>
+          <w:color w:val="FF0000"/>
+          <w:rtl/>
+          <w:lang w:bidi="fa-IR"/>
+        </w:rPr>
+        <w:t>ی</w:t>
+      </w:r>
+      <w:r>
+        <w:rPr>
+          <w:rFonts w:cs="Arial"/>
+          <w:color w:val="FF0000"/>
+          <w:rtl/>
+          <w:lang w:bidi="fa-IR"/>
+        </w:rPr>
+        <w:t xml:space="preserve"> مفاه</w:t>
+      </w:r>
+      <w:r>
+        <w:rPr>
+          <w:rFonts w:cs="Arial" w:hint="cs"/>
+          <w:color w:val="FF0000"/>
+          <w:rtl/>
+          <w:lang w:bidi="fa-IR"/>
+        </w:rPr>
+        <w:t>ی</w:t>
+      </w:r>
+      <w:r>
+        <w:rPr>
+          <w:rFonts w:cs="Arial" w:hint="eastAsia"/>
+          <w:color w:val="FF0000"/>
+          <w:rtl/>
+          <w:lang w:bidi="fa-IR"/>
+        </w:rPr>
+        <w:t>م</w:t>
+      </w:r>
+      <w:r>
+        <w:rPr>
+          <w:rFonts w:cs="Arial"/>
+          <w:color w:val="FF0000"/>
+          <w:rtl/>
+          <w:lang w:bidi="fa-IR"/>
+        </w:rPr>
+        <w:t xml:space="preserve"> ش</w:t>
+      </w:r>
+      <w:r>
+        <w:rPr>
+          <w:rFonts w:cs="Arial" w:hint="cs"/>
+          <w:color w:val="FF0000"/>
+          <w:rtl/>
+          <w:lang w:bidi="fa-IR"/>
+        </w:rPr>
+        <w:t>ی</w:t>
+      </w:r>
+      <w:r>
+        <w:rPr>
+          <w:rFonts w:cs="Arial" w:hint="eastAsia"/>
+          <w:color w:val="FF0000"/>
+          <w:rtl/>
+          <w:lang w:bidi="fa-IR"/>
+        </w:rPr>
+        <w:t>ءگرا</w:t>
+      </w:r>
+      <w:r>
+        <w:rPr>
+          <w:rFonts w:cs="Arial" w:hint="cs"/>
+          <w:color w:val="FF0000"/>
+          <w:rtl/>
+          <w:lang w:bidi="fa-IR"/>
+        </w:rPr>
+        <w:t>یی</w:t>
+      </w:r>
+      <w:r>
+        <w:rPr>
+          <w:rFonts w:cs="Arial"/>
+          <w:color w:val="FF0000"/>
+          <w:rtl/>
+          <w:lang w:bidi="fa-IR"/>
+        </w:rPr>
+        <w:t xml:space="preserve"> و جلوگ</w:t>
+      </w:r>
+      <w:r>
+        <w:rPr>
+          <w:rFonts w:cs="Arial" w:hint="cs"/>
+          <w:color w:val="FF0000"/>
+          <w:rtl/>
+          <w:lang w:bidi="fa-IR"/>
+        </w:rPr>
+        <w:t>ی</w:t>
+      </w:r>
+      <w:r>
+        <w:rPr>
+          <w:rFonts w:cs="Arial" w:hint="eastAsia"/>
+          <w:color w:val="FF0000"/>
+          <w:rtl/>
+          <w:lang w:bidi="fa-IR"/>
+        </w:rPr>
+        <w:t>ر</w:t>
+      </w:r>
+      <w:r>
+        <w:rPr>
+          <w:rFonts w:cs="Arial" w:hint="cs"/>
+          <w:color w:val="FF0000"/>
+          <w:rtl/>
+          <w:lang w:bidi="fa-IR"/>
+        </w:rPr>
+        <w:t>ی</w:t>
+      </w:r>
+      <w:r>
+        <w:rPr>
+          <w:rFonts w:cs="Arial"/>
+          <w:color w:val="FF0000"/>
+          <w:rtl/>
+          <w:lang w:bidi="fa-IR"/>
+        </w:rPr>
+        <w:t xml:space="preserve"> از تکرار ساختارها</w:t>
+      </w:r>
+    </w:p>
+    <w:p>
+      <w:pPr>
+        <w:jc w:val="right"/>
+        <w:rPr>
+          <w:lang w:bidi="fa-IR"/>
+        </w:rPr>
+      </w:pPr>
+      <w:r>
+        <w:rPr>
+          <w:rFonts w:cs="Arial" w:hint="cs"/>
+          <w:rtl/>
+          <w:lang w:bidi="fa-IR"/>
+        </w:rPr>
+        <w:t>ی</w:t>
+      </w:r>
+      <w:r>
+        <w:rPr>
+          <w:rFonts w:cs="Arial" w:hint="eastAsia"/>
+          <w:rtl/>
+          <w:lang w:bidi="fa-IR"/>
+        </w:rPr>
+        <w:t>ک</w:t>
+      </w:r>
+      <w:r>
+        <w:rPr>
+          <w:rFonts w:cs="Arial" w:hint="cs"/>
+          <w:rtl/>
+          <w:lang w:bidi="fa-IR"/>
+        </w:rPr>
+        <w:t>ی</w:t>
+      </w:r>
+      <w:r>
+        <w:rPr>
+          <w:rFonts w:cs="Arial"/>
+          <w:rtl/>
+          <w:lang w:bidi="fa-IR"/>
+        </w:rPr>
+        <w:t xml:space="preserve"> </w:t>
+      </w:r>
+      <w:r>
+        <w:rPr>
+          <w:rFonts w:cs="Arial"/>
+          <w:rtl/>
+          <w:lang w:bidi="fa-IR"/>
+        </w:rPr>
+        <w:t>از</w:t>
+      </w:r>
+      <w:r>
+        <w:rPr>
+          <w:rFonts w:cs="Arial"/>
+          <w:color w:val="FF0000"/>
+          <w:rtl/>
+          <w:lang w:bidi="fa-IR"/>
+        </w:rPr>
+        <w:t xml:space="preserve"> ارزشمندتر</w:t>
+      </w:r>
+      <w:r>
+        <w:rPr>
+          <w:rFonts w:cs="Arial" w:hint="cs"/>
+          <w:color w:val="FF0000"/>
+          <w:rtl/>
+          <w:lang w:bidi="fa-IR"/>
+        </w:rPr>
+        <w:t>ی</w:t>
+      </w:r>
+      <w:r>
+        <w:rPr>
+          <w:rFonts w:cs="Arial" w:hint="eastAsia"/>
+          <w:color w:val="FF0000"/>
+          <w:rtl/>
+          <w:lang w:bidi="fa-IR"/>
+        </w:rPr>
+        <w:t>ن</w:t>
+      </w:r>
+      <w:r>
+        <w:rPr>
+          <w:rFonts w:cs="Arial" w:hint="cs"/>
+          <w:color w:val="FF0000"/>
+          <w:rtl/>
+          <w:lang w:bidi="fa-IR"/>
+        </w:rPr>
+        <w:t xml:space="preserve"> </w:t>
+      </w:r>
+      <w:r>
+        <w:rPr>
+          <w:rFonts w:cs="Arial" w:hint="cs"/>
+          <w:rtl/>
+          <w:lang w:bidi="fa-IR"/>
+        </w:rPr>
+        <w:t>و</w:t>
+      </w:r>
+      <w:r>
+        <w:rPr>
+          <w:rFonts w:cs="Arial" w:hint="cs"/>
+          <w:color w:val="FF0000"/>
+          <w:rtl/>
+          <w:lang w:bidi="fa-IR"/>
+        </w:rPr>
+        <w:t xml:space="preserve"> جذاب ترین</w:t>
+      </w:r>
+      <w:r>
+        <w:rPr>
+          <w:rFonts w:cs="Arial"/>
+          <w:rtl/>
+          <w:lang w:bidi="fa-IR"/>
+        </w:rPr>
+        <w:t xml:space="preserve"> دستاوردها</w:t>
+      </w:r>
+      <w:r>
+        <w:rPr>
+          <w:rFonts w:cs="Arial" w:hint="cs"/>
+          <w:rtl/>
+          <w:lang w:bidi="fa-IR"/>
+        </w:rPr>
+        <w:t>ی</w:t>
+      </w:r>
+      <w:r>
+        <w:rPr>
+          <w:rFonts w:cs="Arial"/>
+          <w:rtl/>
+          <w:lang w:bidi="fa-IR"/>
+        </w:rPr>
+        <w:t xml:space="preserve"> ا</w:t>
+      </w:r>
+      <w:r>
+        <w:rPr>
+          <w:rFonts w:cs="Arial" w:hint="cs"/>
+          <w:rtl/>
+          <w:lang w:bidi="fa-IR"/>
+        </w:rPr>
+        <w:t>ی</w:t>
+      </w:r>
+      <w:r>
+        <w:rPr>
+          <w:rFonts w:cs="Arial" w:hint="eastAsia"/>
+          <w:rtl/>
+          <w:lang w:bidi="fa-IR"/>
+        </w:rPr>
+        <w:t>ن</w:t>
+      </w:r>
+      <w:r>
+        <w:rPr>
+          <w:rFonts w:cs="Arial"/>
+          <w:rtl/>
+          <w:lang w:bidi="fa-IR"/>
+        </w:rPr>
+        <w:t xml:space="preserve"> پروژه</w:t>
+      </w:r>
+      <w:r>
+        <w:rPr>
+          <w:rFonts w:cs="Arial" w:hint="cs"/>
+          <w:rtl/>
+          <w:lang w:bidi="fa-IR"/>
+        </w:rPr>
+        <w:t xml:space="preserve"> برای من </w:t>
+      </w:r>
+      <w:r>
+        <w:rPr>
+          <w:rFonts w:cs="Arial"/>
+          <w:rtl/>
+          <w:lang w:bidi="fa-IR"/>
+        </w:rPr>
+        <w:t>، تبد</w:t>
+      </w:r>
+      <w:r>
+        <w:rPr>
+          <w:rFonts w:cs="Arial" w:hint="cs"/>
+          <w:rtl/>
+          <w:lang w:bidi="fa-IR"/>
+        </w:rPr>
+        <w:t>ی</w:t>
+      </w:r>
+      <w:r>
+        <w:rPr>
+          <w:rFonts w:cs="Arial" w:hint="eastAsia"/>
+          <w:rtl/>
+          <w:lang w:bidi="fa-IR"/>
+        </w:rPr>
+        <w:t>ل</w:t>
+      </w:r>
+      <w:r>
+        <w:rPr>
+          <w:rFonts w:cs="Arial"/>
+          <w:rtl/>
+          <w:lang w:bidi="fa-IR"/>
+        </w:rPr>
+        <w:t xml:space="preserve"> تفکر برنامه‌نو</w:t>
+      </w:r>
+      <w:r>
+        <w:rPr>
+          <w:rFonts w:cs="Arial" w:hint="cs"/>
+          <w:rtl/>
+          <w:lang w:bidi="fa-IR"/>
+        </w:rPr>
+        <w:t>ی</w:t>
+      </w:r>
+      <w:r>
+        <w:rPr>
+          <w:rFonts w:cs="Arial" w:hint="eastAsia"/>
+          <w:rtl/>
+          <w:lang w:bidi="fa-IR"/>
+        </w:rPr>
+        <w:t>س</w:t>
+      </w:r>
+      <w:r>
+        <w:rPr>
+          <w:rFonts w:cs="Arial" w:hint="cs"/>
+          <w:rtl/>
+          <w:lang w:bidi="fa-IR"/>
+        </w:rPr>
+        <w:t>ی</w:t>
+      </w:r>
+      <w:r>
+        <w:rPr>
+          <w:rFonts w:cs="Arial"/>
+          <w:rtl/>
+          <w:lang w:bidi="fa-IR"/>
+        </w:rPr>
+        <w:t xml:space="preserve"> خط</w:t>
+      </w:r>
+      <w:r>
+        <w:rPr>
+          <w:rFonts w:cs="Arial" w:hint="cs"/>
+          <w:rtl/>
+          <w:lang w:bidi="fa-IR"/>
+        </w:rPr>
+        <w:t>ی</w:t>
+      </w:r>
+      <w:r>
+        <w:rPr>
+          <w:rFonts w:cs="Arial"/>
+          <w:rtl/>
+          <w:lang w:bidi="fa-IR"/>
+        </w:rPr>
+        <w:t xml:space="preserve"> به ساختار پ</w:t>
+      </w:r>
+      <w:r>
+        <w:rPr>
+          <w:rFonts w:cs="Arial" w:hint="cs"/>
+          <w:rtl/>
+          <w:lang w:bidi="fa-IR"/>
+        </w:rPr>
+        <w:t>ی</w:t>
+      </w:r>
+      <w:r>
+        <w:rPr>
+          <w:rFonts w:cs="Arial" w:hint="eastAsia"/>
+          <w:rtl/>
+          <w:lang w:bidi="fa-IR"/>
+        </w:rPr>
+        <w:t>شرفته‌</w:t>
+      </w:r>
+      <w:r>
+        <w:rPr>
+          <w:rFonts w:cs="Arial" w:hint="cs"/>
+          <w:rtl/>
+          <w:lang w:bidi="fa-IR"/>
+        </w:rPr>
+        <w:t>ی</w:t>
+      </w:r>
+      <w:r>
+        <w:rPr>
+          <w:rFonts w:cs="Arial"/>
+          <w:rtl/>
+          <w:lang w:bidi="fa-IR"/>
+        </w:rPr>
+        <w:t xml:space="preserve"> ش</w:t>
+      </w:r>
+      <w:r>
+        <w:rPr>
+          <w:rFonts w:cs="Arial" w:hint="cs"/>
+          <w:rtl/>
+          <w:lang w:bidi="fa-IR"/>
+        </w:rPr>
+        <w:t>ی</w:t>
+      </w:r>
+      <w:r>
+        <w:rPr>
+          <w:rFonts w:cs="Arial" w:hint="eastAsia"/>
+          <w:rtl/>
+          <w:lang w:bidi="fa-IR"/>
+        </w:rPr>
+        <w:t>ءگرا</w:t>
+      </w:r>
+      <w:r>
+        <w:rPr>
+          <w:rFonts w:cs="Arial" w:hint="cs"/>
+          <w:rtl/>
+          <w:lang w:bidi="fa-IR"/>
+        </w:rPr>
+        <w:t>یی</w:t>
+      </w:r>
+      <w:r>
+        <w:rPr>
+          <w:rFonts w:cs="Arial"/>
+          <w:rtl/>
+          <w:lang w:bidi="fa-IR"/>
+        </w:rPr>
+        <w:t xml:space="preserve"> برا</w:t>
+      </w:r>
+      <w:r>
+        <w:rPr>
+          <w:rFonts w:cs="Arial" w:hint="cs"/>
+          <w:rtl/>
+          <w:lang w:bidi="fa-IR"/>
+        </w:rPr>
+        <w:t>ی</w:t>
+      </w:r>
+      <w:r>
+        <w:rPr>
+          <w:rFonts w:cs="Arial"/>
+          <w:rtl/>
+          <w:lang w:bidi="fa-IR"/>
+        </w:rPr>
+        <w:t xml:space="preserve"> مد</w:t>
+      </w:r>
+      <w:r>
+        <w:rPr>
+          <w:rFonts w:cs="Arial" w:hint="cs"/>
+          <w:rtl/>
+          <w:lang w:bidi="fa-IR"/>
+        </w:rPr>
+        <w:t>ی</w:t>
+      </w:r>
+      <w:r>
+        <w:rPr>
+          <w:rFonts w:cs="Arial" w:hint="eastAsia"/>
+          <w:rtl/>
+          <w:lang w:bidi="fa-IR"/>
+        </w:rPr>
+        <w:t>ر</w:t>
+      </w:r>
+      <w:r>
+        <w:rPr>
+          <w:rFonts w:cs="Arial" w:hint="cs"/>
+          <w:rtl/>
+          <w:lang w:bidi="fa-IR"/>
+        </w:rPr>
+        <w:t>ی</w:t>
+      </w:r>
+      <w:r>
+        <w:rPr>
+          <w:rFonts w:cs="Arial" w:hint="eastAsia"/>
+          <w:rtl/>
+          <w:lang w:bidi="fa-IR"/>
+        </w:rPr>
+        <w:t>ت</w:t>
+      </w:r>
+      <w:r>
+        <w:rPr>
+          <w:rFonts w:cs="Arial"/>
+          <w:rtl/>
+          <w:lang w:bidi="fa-IR"/>
+        </w:rPr>
+        <w:t xml:space="preserve"> حجم بالا</w:t>
+      </w:r>
+      <w:r>
+        <w:rPr>
+          <w:rFonts w:cs="Arial" w:hint="cs"/>
+          <w:rtl/>
+          <w:lang w:bidi="fa-IR"/>
+        </w:rPr>
+        <w:t>ی</w:t>
+      </w:r>
+      <w:r>
+        <w:rPr>
+          <w:rFonts w:cs="Arial"/>
+          <w:rtl/>
+          <w:lang w:bidi="fa-IR"/>
+        </w:rPr>
+        <w:t xml:space="preserve"> داده‌ها</w:t>
+      </w:r>
+      <w:r>
+        <w:rPr>
+          <w:rFonts w:cs="Arial" w:hint="cs"/>
+          <w:rtl/>
+          <w:lang w:bidi="fa-IR"/>
+        </w:rPr>
+        <w:t>ی</w:t>
+      </w:r>
+      <w:r>
+        <w:rPr>
+          <w:rFonts w:cs="Arial"/>
+          <w:rtl/>
+          <w:lang w:bidi="fa-IR"/>
+        </w:rPr>
+        <w:t xml:space="preserve"> واقع</w:t>
+      </w:r>
+      <w:r>
+        <w:rPr>
+          <w:rFonts w:cs="Arial" w:hint="cs"/>
+          <w:rtl/>
+          <w:lang w:bidi="fa-IR"/>
+        </w:rPr>
+        <w:t>ی</w:t>
+      </w:r>
+      <w:r>
+        <w:rPr>
+          <w:rFonts w:cs="Arial"/>
+          <w:rtl/>
+          <w:lang w:bidi="fa-IR"/>
+        </w:rPr>
+        <w:t xml:space="preserve"> بود. تجرب</w:t>
+      </w:r>
+      <w:r>
+        <w:rPr>
+          <w:rFonts w:cs="Arial" w:hint="cs"/>
+          <w:rtl/>
+          <w:lang w:bidi="fa-IR"/>
+        </w:rPr>
+        <w:t>ی</w:t>
+      </w:r>
+      <w:r>
+        <w:rPr>
+          <w:rFonts w:cs="Arial" w:hint="eastAsia"/>
+          <w:rtl/>
+          <w:lang w:bidi="fa-IR"/>
+        </w:rPr>
+        <w:t>ات</w:t>
+      </w:r>
+      <w:r>
+        <w:rPr>
+          <w:rFonts w:cs="Arial"/>
+          <w:rtl/>
+          <w:lang w:bidi="fa-IR"/>
+        </w:rPr>
+        <w:t xml:space="preserve"> ا</w:t>
+      </w:r>
+      <w:r>
+        <w:rPr>
+          <w:rFonts w:cs="Arial" w:hint="cs"/>
+          <w:rtl/>
+          <w:lang w:bidi="fa-IR"/>
+        </w:rPr>
+        <w:t>ی</w:t>
+      </w:r>
+      <w:r>
+        <w:rPr>
+          <w:rFonts w:cs="Arial" w:hint="eastAsia"/>
+          <w:rtl/>
+          <w:lang w:bidi="fa-IR"/>
+        </w:rPr>
+        <w:t>ن</w:t>
+      </w:r>
+      <w:r>
+        <w:rPr>
+          <w:rFonts w:cs="Arial"/>
+          <w:rtl/>
+          <w:lang w:bidi="fa-IR"/>
+        </w:rPr>
+        <w:t xml:space="preserve"> </w:t>
+      </w:r>
+      <w:r>
+        <w:rPr>
+          <w:rFonts w:cs="Arial" w:hint="cs"/>
+          <w:rtl/>
+          <w:lang w:bidi="fa-IR"/>
+        </w:rPr>
+        <w:t>پروژه</w:t>
+      </w:r>
+      <w:r>
+        <w:rPr>
+          <w:rFonts w:cs="Arial"/>
+          <w:rtl/>
+          <w:lang w:bidi="fa-IR"/>
+        </w:rPr>
+        <w:t xml:space="preserve"> عبارتند از</w:t>
+      </w:r>
+      <w:r>
+        <w:rPr>
+          <w:rFonts w:hint="cs"/>
+          <w:rtl/>
+          <w:lang w:bidi="fa-IR"/>
+        </w:rPr>
+        <w:t xml:space="preserve"> : </w:t>
+      </w:r>
+    </w:p>
+    <w:p>
+      <w:pPr>
+        <w:jc w:val="right"/>
+        <w:rPr>
+          <w:color w:val="FF0000"/>
+          <w:lang w:bidi="fa-IR"/>
+        </w:rPr>
+      </w:pPr>
+      <w:r>
+        <w:rPr>
+          <w:rFonts w:cs="Arial" w:hint="cs"/>
+          <w:color w:val="FF0000"/>
+          <w:rtl/>
+          <w:lang w:bidi="fa-IR"/>
+        </w:rPr>
+        <w:t xml:space="preserve">   </w:t>
+      </w:r>
+      <w:r>
+        <w:rPr>
+          <w:color w:val="FF0000"/>
+          <w:lang w:bidi="fa-IR"/>
+        </w:rPr>
+        <w:t xml:space="preserve">. </w:t>
+      </w:r>
+      <w:r>
+        <w:rPr>
+          <w:rFonts w:hint="cs"/>
+          <w:color w:val="FF0000"/>
+          <w:rtl/>
+          <w:lang w:bidi="fa-IR"/>
+        </w:rPr>
+        <w:t xml:space="preserve">1 . </w:t>
+      </w:r>
+      <w:r>
+        <w:rPr>
+          <w:rFonts w:cs="Arial"/>
+          <w:color w:val="FF0000"/>
+          <w:rtl/>
+          <w:lang w:bidi="fa-IR"/>
+        </w:rPr>
+        <w:t>کپسوله‌ساز</w:t>
+      </w:r>
+      <w:r>
+        <w:rPr>
+          <w:rFonts w:cs="Arial" w:hint="cs"/>
+          <w:color w:val="FF0000"/>
+          <w:rtl/>
+          <w:lang w:bidi="fa-IR"/>
+        </w:rPr>
+        <w:t>ی</w:t>
+      </w:r>
+      <w:r>
+        <w:rPr>
+          <w:rFonts w:cs="Arial"/>
+          <w:color w:val="FF0000"/>
+          <w:rtl/>
+          <w:lang w:bidi="fa-IR"/>
+        </w:rPr>
+        <w:t xml:space="preserve"> و اعتبارسنج</w:t>
+      </w:r>
+      <w:r>
+        <w:rPr>
+          <w:rFonts w:cs="Arial" w:hint="cs"/>
+          <w:color w:val="FF0000"/>
+          <w:rtl/>
+          <w:lang w:bidi="fa-IR"/>
+        </w:rPr>
+        <w:t>ی</w:t>
+      </w:r>
+      <w:r>
+        <w:rPr>
+          <w:rFonts w:cs="Arial"/>
+          <w:color w:val="FF0000"/>
+          <w:rtl/>
+          <w:lang w:bidi="fa-IR"/>
+        </w:rPr>
+        <w:t xml:space="preserve"> پو</w:t>
+      </w:r>
+      <w:r>
+        <w:rPr>
+          <w:rFonts w:cs="Arial" w:hint="cs"/>
+          <w:color w:val="FF0000"/>
+          <w:rtl/>
+          <w:lang w:bidi="fa-IR"/>
+        </w:rPr>
+        <w:t>ی</w:t>
+      </w:r>
+      <w:r>
+        <w:rPr>
+          <w:rFonts w:cs="Arial" w:hint="eastAsia"/>
+          <w:color w:val="FF0000"/>
+          <w:rtl/>
+          <w:lang w:bidi="fa-IR"/>
+        </w:rPr>
+        <w:t>ا</w:t>
+      </w:r>
+      <w:r>
+        <w:rPr>
+          <w:rFonts w:cs="Arial" w:hint="cs"/>
+          <w:color w:val="FF0000"/>
+          <w:rtl/>
+          <w:lang w:bidi="fa-IR"/>
+        </w:rPr>
+        <w:t>ی</w:t>
+      </w:r>
+      <w:r>
+        <w:rPr>
+          <w:rFonts w:cs="Arial"/>
+          <w:color w:val="FF0000"/>
+          <w:rtl/>
+          <w:lang w:bidi="fa-IR"/>
+        </w:rPr>
+        <w:t xml:space="preserve"> داده‌ها</w:t>
+      </w:r>
+    </w:p>
+    <w:p>
+      <w:pPr>
+        <w:jc w:val="right"/>
+        <w:rPr>
+          <w:lang w:bidi="fa-IR"/>
+        </w:rPr>
+      </w:pPr>
+      <w:r>
+        <w:rPr>
+          <w:rFonts w:cs="Arial" w:hint="eastAsia"/>
+          <w:rtl/>
+          <w:lang w:bidi="fa-IR"/>
+        </w:rPr>
+        <w:t>در</w:t>
+      </w:r>
+      <w:r>
+        <w:rPr>
+          <w:rFonts w:cs="Arial"/>
+          <w:rtl/>
+          <w:lang w:bidi="fa-IR"/>
+        </w:rPr>
+        <w:t xml:space="preserve"> دن</w:t>
+      </w:r>
+      <w:r>
+        <w:rPr>
+          <w:rFonts w:cs="Arial" w:hint="cs"/>
+          <w:rtl/>
+          <w:lang w:bidi="fa-IR"/>
+        </w:rPr>
+        <w:t>ی</w:t>
+      </w:r>
+      <w:r>
+        <w:rPr>
+          <w:rFonts w:cs="Arial" w:hint="eastAsia"/>
+          <w:rtl/>
+          <w:lang w:bidi="fa-IR"/>
+        </w:rPr>
+        <w:t>ا</w:t>
+      </w:r>
+      <w:r>
+        <w:rPr>
+          <w:rFonts w:cs="Arial" w:hint="cs"/>
+          <w:rtl/>
+          <w:lang w:bidi="fa-IR"/>
+        </w:rPr>
+        <w:t>ی</w:t>
+      </w:r>
+      <w:r>
+        <w:rPr>
+          <w:rFonts w:cs="Arial"/>
+          <w:rtl/>
+          <w:lang w:bidi="fa-IR"/>
+        </w:rPr>
+        <w:t xml:space="preserve"> واقع</w:t>
+      </w:r>
+      <w:r>
+        <w:rPr>
+          <w:rFonts w:cs="Arial" w:hint="cs"/>
+          <w:rtl/>
+          <w:lang w:bidi="fa-IR"/>
+        </w:rPr>
+        <w:t>ی</w:t>
+      </w:r>
+      <w:r>
+        <w:rPr>
+          <w:rFonts w:cs="Arial" w:hint="eastAsia"/>
+          <w:rtl/>
+          <w:lang w:bidi="fa-IR"/>
+        </w:rPr>
+        <w:t>،</w:t>
+      </w:r>
+      <w:r>
+        <w:rPr>
+          <w:rFonts w:cs="Arial"/>
+          <w:rtl/>
+          <w:lang w:bidi="fa-IR"/>
+        </w:rPr>
+        <w:t xml:space="preserve"> داده‌ها</w:t>
+      </w:r>
+      <w:r>
+        <w:rPr>
+          <w:rFonts w:cs="Arial" w:hint="cs"/>
+          <w:rtl/>
+          <w:lang w:bidi="fa-IR"/>
+        </w:rPr>
+        <w:t>ی</w:t>
+      </w:r>
+      <w:r>
+        <w:rPr>
+          <w:rFonts w:cs="Arial"/>
+          <w:rtl/>
+          <w:lang w:bidi="fa-IR"/>
+        </w:rPr>
+        <w:t xml:space="preserve"> خام ممکن است مخدوش </w:t>
+      </w:r>
+      <w:r>
+        <w:rPr>
+          <w:rFonts w:cs="Arial" w:hint="cs"/>
+          <w:rtl/>
+          <w:lang w:bidi="fa-IR"/>
+        </w:rPr>
+        <w:t>ی</w:t>
+      </w:r>
+      <w:r>
+        <w:rPr>
+          <w:rFonts w:cs="Arial" w:hint="eastAsia"/>
+          <w:rtl/>
+          <w:lang w:bidi="fa-IR"/>
+        </w:rPr>
+        <w:t>ا</w:t>
+      </w:r>
+      <w:r>
+        <w:rPr>
+          <w:rFonts w:cs="Arial"/>
+          <w:rtl/>
+          <w:lang w:bidi="fa-IR"/>
+        </w:rPr>
+        <w:t xml:space="preserve"> ناقص باشند. با طراح</w:t>
+      </w:r>
+      <w:r>
+        <w:rPr>
+          <w:rFonts w:cs="Arial" w:hint="cs"/>
+          <w:rtl/>
+          <w:lang w:bidi="fa-IR"/>
+        </w:rPr>
+        <w:t>ی</w:t>
+      </w:r>
+      <w:r>
+        <w:rPr>
+          <w:rFonts w:cs="Arial"/>
+          <w:rtl/>
+          <w:lang w:bidi="fa-IR"/>
+        </w:rPr>
+        <w:t xml:space="preserve"> </w:t>
+      </w:r>
+      <w:r>
+        <w:rPr>
+          <w:rFonts w:cs="Arial"/>
+          <w:color w:val="FF0000"/>
+          <w:rtl/>
+          <w:lang w:bidi="fa-IR"/>
+        </w:rPr>
+        <w:t>کلاسِ آهنگ</w:t>
+      </w:r>
+      <w:r>
+        <w:rPr>
+          <w:rFonts w:cs="Arial"/>
+          <w:rtl/>
+          <w:lang w:bidi="fa-IR"/>
+        </w:rPr>
+        <w:t>، هر سطر از جدول داده‌ها</w:t>
+      </w:r>
+      <w:r>
+        <w:rPr>
+          <w:rFonts w:cs="Arial" w:hint="cs"/>
+          <w:rtl/>
+          <w:lang w:bidi="fa-IR"/>
+        </w:rPr>
+        <w:t xml:space="preserve"> را</w:t>
+      </w:r>
+      <w:r>
+        <w:rPr>
+          <w:rFonts w:cs="Arial"/>
+          <w:rtl/>
+          <w:lang w:bidi="fa-IR"/>
+        </w:rPr>
+        <w:t xml:space="preserve"> به </w:t>
+      </w:r>
+      <w:r>
+        <w:rPr>
+          <w:rFonts w:cs="Arial" w:hint="cs"/>
+          <w:rtl/>
+          <w:lang w:bidi="fa-IR"/>
+        </w:rPr>
+        <w:t>ی</w:t>
+      </w:r>
+      <w:r>
+        <w:rPr>
+          <w:rFonts w:cs="Arial" w:hint="eastAsia"/>
+          <w:rtl/>
+          <w:lang w:bidi="fa-IR"/>
+        </w:rPr>
+        <w:t>ک</w:t>
+      </w:r>
+      <w:r>
+        <w:rPr>
+          <w:rFonts w:cs="Arial"/>
+          <w:rtl/>
+          <w:lang w:bidi="fa-IR"/>
+        </w:rPr>
+        <w:t xml:space="preserve"> موجود</w:t>
+      </w:r>
+      <w:r>
+        <w:rPr>
+          <w:rFonts w:cs="Arial" w:hint="cs"/>
+          <w:rtl/>
+          <w:lang w:bidi="fa-IR"/>
+        </w:rPr>
+        <w:t>ی</w:t>
+      </w:r>
+      <w:r>
+        <w:rPr>
+          <w:rFonts w:cs="Arial" w:hint="eastAsia"/>
+          <w:rtl/>
+          <w:lang w:bidi="fa-IR"/>
+        </w:rPr>
+        <w:t>ت</w:t>
+      </w:r>
+      <w:r>
+        <w:rPr>
+          <w:rFonts w:cs="Arial"/>
+          <w:rtl/>
+          <w:lang w:bidi="fa-IR"/>
+        </w:rPr>
+        <w:t xml:space="preserve"> مستقل نرم‌افزار</w:t>
+      </w:r>
+      <w:r>
+        <w:rPr>
+          <w:rFonts w:cs="Arial" w:hint="cs"/>
+          <w:rtl/>
+          <w:lang w:bidi="fa-IR"/>
+        </w:rPr>
+        <w:t>ی</w:t>
+      </w:r>
+      <w:r>
+        <w:rPr>
+          <w:rFonts w:cs="Arial"/>
+          <w:rtl/>
+          <w:lang w:bidi="fa-IR"/>
+        </w:rPr>
+        <w:t xml:space="preserve"> با هو</w:t>
+      </w:r>
+      <w:r>
+        <w:rPr>
+          <w:rFonts w:cs="Arial" w:hint="cs"/>
+          <w:rtl/>
+          <w:lang w:bidi="fa-IR"/>
+        </w:rPr>
+        <w:t>ی</w:t>
+      </w:r>
+      <w:r>
+        <w:rPr>
+          <w:rFonts w:cs="Arial" w:hint="eastAsia"/>
+          <w:rtl/>
+          <w:lang w:bidi="fa-IR"/>
+        </w:rPr>
+        <w:t>ت</w:t>
+      </w:r>
+      <w:r>
+        <w:rPr>
+          <w:rFonts w:cs="Arial"/>
+          <w:rtl/>
+          <w:lang w:bidi="fa-IR"/>
+        </w:rPr>
+        <w:t xml:space="preserve"> مشخص تبد</w:t>
+      </w:r>
+      <w:r>
+        <w:rPr>
+          <w:rFonts w:cs="Arial" w:hint="cs"/>
+          <w:rtl/>
+          <w:lang w:bidi="fa-IR"/>
+        </w:rPr>
+        <w:t>ی</w:t>
+      </w:r>
+      <w:r>
+        <w:rPr>
+          <w:rFonts w:cs="Arial" w:hint="eastAsia"/>
+          <w:rtl/>
+          <w:lang w:bidi="fa-IR"/>
+        </w:rPr>
+        <w:t>ل</w:t>
+      </w:r>
+      <w:r>
+        <w:rPr>
+          <w:rFonts w:cs="Arial" w:hint="cs"/>
+          <w:rtl/>
+          <w:lang w:bidi="fa-IR"/>
+        </w:rPr>
+        <w:t xml:space="preserve"> کردم</w:t>
+      </w:r>
+      <w:r>
+        <w:rPr>
+          <w:rFonts w:cs="Arial" w:hint="cs"/>
+          <w:rtl/>
+          <w:lang w:bidi="fa-IR"/>
+        </w:rPr>
+        <w:t xml:space="preserve"> . </w:t>
+      </w:r>
+    </w:p>
+    <w:p>
+      <w:pPr>
+        <w:jc w:val="right"/>
+        <w:rPr>
+          <w:lang w:bidi="fa-IR"/>
+        </w:rPr>
+      </w:pPr>
+      <w:r>
+        <w:rPr>
+          <w:rFonts w:cs="Arial"/>
+          <w:rtl/>
+          <w:lang w:bidi="fa-IR"/>
+        </w:rPr>
+        <w:t>تجربه کاربرد</w:t>
+      </w:r>
+      <w:r>
+        <w:rPr>
+          <w:rFonts w:cs="Arial" w:hint="cs"/>
+          <w:rtl/>
+          <w:lang w:bidi="fa-IR"/>
+        </w:rPr>
+        <w:t>ی</w:t>
+      </w:r>
+      <w:r>
+        <w:rPr>
+          <w:rFonts w:cs="Arial"/>
+          <w:rtl/>
+          <w:lang w:bidi="fa-IR"/>
+        </w:rPr>
+        <w:t>: به جا</w:t>
+      </w:r>
+      <w:r>
+        <w:rPr>
+          <w:rFonts w:cs="Arial" w:hint="cs"/>
+          <w:rtl/>
+          <w:lang w:bidi="fa-IR"/>
+        </w:rPr>
+        <w:t>ی</w:t>
+      </w:r>
+      <w:r>
+        <w:rPr>
+          <w:rFonts w:cs="Arial"/>
+          <w:rtl/>
+          <w:lang w:bidi="fa-IR"/>
+        </w:rPr>
+        <w:t xml:space="preserve"> رها کردن و</w:t>
+      </w:r>
+      <w:r>
+        <w:rPr>
+          <w:rFonts w:cs="Arial" w:hint="cs"/>
+          <w:rtl/>
+          <w:lang w:bidi="fa-IR"/>
+        </w:rPr>
+        <w:t>ی</w:t>
+      </w:r>
+      <w:r>
+        <w:rPr>
+          <w:rFonts w:cs="Arial" w:hint="eastAsia"/>
+          <w:rtl/>
+          <w:lang w:bidi="fa-IR"/>
+        </w:rPr>
+        <w:t>ژگ</w:t>
+      </w:r>
+      <w:r>
+        <w:rPr>
+          <w:rFonts w:cs="Arial" w:hint="cs"/>
+          <w:rtl/>
+          <w:lang w:bidi="fa-IR"/>
+        </w:rPr>
+        <w:t>ی‌</w:t>
+      </w:r>
+      <w:r>
+        <w:rPr>
+          <w:rFonts w:cs="Arial" w:hint="eastAsia"/>
+          <w:rtl/>
+          <w:lang w:bidi="fa-IR"/>
+        </w:rPr>
+        <w:t>ها</w:t>
+      </w:r>
+      <w:r>
+        <w:rPr>
+          <w:rFonts w:cs="Arial"/>
+          <w:rtl/>
+          <w:lang w:bidi="fa-IR"/>
+        </w:rPr>
+        <w:t xml:space="preserve"> به صورت متن </w:t>
+      </w:r>
+      <w:r>
+        <w:rPr>
+          <w:rFonts w:cs="Arial" w:hint="cs"/>
+          <w:rtl/>
+          <w:lang w:bidi="fa-IR"/>
+        </w:rPr>
+        <w:t>ی</w:t>
+      </w:r>
+      <w:r>
+        <w:rPr>
+          <w:rFonts w:cs="Arial" w:hint="eastAsia"/>
+          <w:rtl/>
+          <w:lang w:bidi="fa-IR"/>
+        </w:rPr>
+        <w:t>ا</w:t>
+      </w:r>
+      <w:r>
+        <w:rPr>
+          <w:rFonts w:cs="Arial"/>
+          <w:rtl/>
+          <w:lang w:bidi="fa-IR"/>
+        </w:rPr>
+        <w:t xml:space="preserve"> عدد ساده، از و</w:t>
+      </w:r>
+      <w:r>
+        <w:rPr>
+          <w:rFonts w:cs="Arial" w:hint="cs"/>
+          <w:rtl/>
+          <w:lang w:bidi="fa-IR"/>
+        </w:rPr>
+        <w:t>ی</w:t>
+      </w:r>
+      <w:r>
+        <w:rPr>
+          <w:rFonts w:cs="Arial" w:hint="eastAsia"/>
+          <w:rtl/>
+          <w:lang w:bidi="fa-IR"/>
+        </w:rPr>
+        <w:t>ژگ</w:t>
+      </w:r>
+      <w:r>
+        <w:rPr>
+          <w:rFonts w:cs="Arial" w:hint="cs"/>
+          <w:rtl/>
+          <w:lang w:bidi="fa-IR"/>
+        </w:rPr>
+        <w:t>ی‌</w:t>
+      </w:r>
+      <w:r>
+        <w:rPr>
+          <w:rFonts w:cs="Arial" w:hint="eastAsia"/>
+          <w:rtl/>
+          <w:lang w:bidi="fa-IR"/>
+        </w:rPr>
+        <w:t>ها</w:t>
+      </w:r>
+      <w:r>
+        <w:rPr>
+          <w:rFonts w:cs="Arial" w:hint="cs"/>
+          <w:rtl/>
+          <w:lang w:bidi="fa-IR"/>
+        </w:rPr>
+        <w:t>ی</w:t>
+      </w:r>
+      <w:r>
+        <w:rPr>
+          <w:rFonts w:cs="Arial"/>
+          <w:rtl/>
+          <w:lang w:bidi="fa-IR"/>
+        </w:rPr>
+        <w:t xml:space="preserve"> ترت</w:t>
+      </w:r>
+      <w:r>
+        <w:rPr>
+          <w:rFonts w:cs="Arial" w:hint="cs"/>
+          <w:rtl/>
+          <w:lang w:bidi="fa-IR"/>
+        </w:rPr>
+        <w:t>ی</w:t>
+      </w:r>
+      <w:r>
+        <w:rPr>
+          <w:rFonts w:cs="Arial" w:hint="eastAsia"/>
+          <w:rtl/>
+          <w:lang w:bidi="fa-IR"/>
+        </w:rPr>
+        <w:t>ب</w:t>
+      </w:r>
+      <w:r>
+        <w:rPr>
+          <w:rFonts w:cs="Arial" w:hint="cs"/>
+          <w:rtl/>
+          <w:lang w:bidi="fa-IR"/>
+        </w:rPr>
+        <w:t>ی</w:t>
+      </w:r>
+      <w:r>
+        <w:rPr>
+          <w:rFonts w:cs="Arial"/>
+          <w:rtl/>
+          <w:lang w:bidi="fa-IR"/>
+        </w:rPr>
+        <w:t xml:space="preserve"> و توابع </w:t>
+      </w:r>
+      <w:r>
+        <w:rPr>
+          <w:rFonts w:cs="Arial" w:hint="cs"/>
+          <w:rtl/>
+          <w:lang w:bidi="fa-IR"/>
+        </w:rPr>
+        <w:t xml:space="preserve">و متد های </w:t>
+      </w:r>
+      <w:r>
+        <w:rPr>
+          <w:rFonts w:cs="Arial"/>
+          <w:rtl/>
+          <w:lang w:bidi="fa-IR"/>
+        </w:rPr>
+        <w:t>تنظ</w:t>
+      </w:r>
+      <w:r>
+        <w:rPr>
+          <w:rFonts w:cs="Arial" w:hint="cs"/>
+          <w:rtl/>
+          <w:lang w:bidi="fa-IR"/>
+        </w:rPr>
+        <w:t>ی</w:t>
+      </w:r>
+      <w:r>
+        <w:rPr>
+          <w:rFonts w:cs="Arial" w:hint="eastAsia"/>
+          <w:rtl/>
+          <w:lang w:bidi="fa-IR"/>
+        </w:rPr>
+        <w:t>م‌کننده</w:t>
+      </w:r>
+      <w:r>
+        <w:rPr>
+          <w:rFonts w:cs="Arial" w:hint="cs"/>
+          <w:rtl/>
+          <w:lang w:bidi="fa-IR"/>
+        </w:rPr>
+        <w:t xml:space="preserve"> ( ابزار زبان پایتون مانند </w:t>
+      </w:r>
+      <w:r>
+        <w:rPr>
+          <w:rFonts w:cs="Arial" w:hint="cs"/>
+          <w:color w:val="FF0000"/>
+          <w:rtl/>
+          <w:lang w:bidi="fa-IR"/>
+        </w:rPr>
+        <w:t>پراپرتی ها</w:t>
+      </w:r>
+      <w:r>
+        <w:rPr>
+          <w:rFonts w:cs="Arial" w:hint="cs"/>
+          <w:rtl/>
+          <w:lang w:bidi="fa-IR"/>
+        </w:rPr>
+        <w:t xml:space="preserve"> و ...)</w:t>
+      </w:r>
+      <w:r>
+        <w:rPr>
+          <w:rFonts w:cs="Arial"/>
+          <w:rtl/>
+          <w:lang w:bidi="fa-IR"/>
+        </w:rPr>
+        <w:t xml:space="preserve"> استفاده </w:t>
+      </w:r>
+      <w:r>
+        <w:rPr>
+          <w:rFonts w:cs="Arial" w:hint="cs"/>
+          <w:rtl/>
+          <w:lang w:bidi="fa-IR"/>
+        </w:rPr>
+        <w:t>کردم</w:t>
+      </w:r>
+      <w:r>
+        <w:rPr>
+          <w:rFonts w:cs="Arial"/>
+          <w:rtl/>
+          <w:lang w:bidi="fa-IR"/>
+        </w:rPr>
+        <w:t>. ا</w:t>
+      </w:r>
+      <w:r>
+        <w:rPr>
+          <w:rFonts w:cs="Arial" w:hint="cs"/>
+          <w:rtl/>
+          <w:lang w:bidi="fa-IR"/>
+        </w:rPr>
+        <w:t>ی</w:t>
+      </w:r>
+      <w:r>
+        <w:rPr>
+          <w:rFonts w:cs="Arial" w:hint="eastAsia"/>
+          <w:rtl/>
+          <w:lang w:bidi="fa-IR"/>
+        </w:rPr>
+        <w:t>ن</w:t>
+      </w:r>
+      <w:r>
+        <w:rPr>
+          <w:rFonts w:cs="Arial"/>
+          <w:rtl/>
+          <w:lang w:bidi="fa-IR"/>
+        </w:rPr>
+        <w:t xml:space="preserve"> ساختار مانند </w:t>
+      </w:r>
+      <w:r>
+        <w:rPr>
+          <w:rFonts w:cs="Arial" w:hint="cs"/>
+          <w:rtl/>
+          <w:lang w:bidi="fa-IR"/>
+        </w:rPr>
+        <w:t>ی</w:t>
+      </w:r>
+      <w:r>
+        <w:rPr>
+          <w:rFonts w:cs="Arial" w:hint="eastAsia"/>
+          <w:rtl/>
+          <w:lang w:bidi="fa-IR"/>
+        </w:rPr>
+        <w:t>ک</w:t>
+      </w:r>
+      <w:r>
+        <w:rPr>
+          <w:rFonts w:cs="Arial"/>
+          <w:rtl/>
+          <w:lang w:bidi="fa-IR"/>
+        </w:rPr>
+        <w:t xml:space="preserve"> </w:t>
+      </w:r>
+      <w:r>
+        <w:rPr>
+          <w:rFonts w:cs="Arial"/>
+          <w:color w:val="FF0000"/>
+          <w:rtl/>
+          <w:lang w:bidi="fa-IR"/>
+        </w:rPr>
+        <w:t>دروازه امن</w:t>
+      </w:r>
+      <w:r>
+        <w:rPr>
+          <w:rFonts w:cs="Arial" w:hint="cs"/>
+          <w:color w:val="FF0000"/>
+          <w:rtl/>
+          <w:lang w:bidi="fa-IR"/>
+        </w:rPr>
+        <w:t>ی</w:t>
+      </w:r>
+      <w:r>
+        <w:rPr>
+          <w:rFonts w:cs="Arial" w:hint="eastAsia"/>
+          <w:color w:val="FF0000"/>
+          <w:rtl/>
+          <w:lang w:bidi="fa-IR"/>
+        </w:rPr>
+        <w:t>ت</w:t>
+      </w:r>
+      <w:r>
+        <w:rPr>
+          <w:rFonts w:cs="Arial" w:hint="cs"/>
+          <w:color w:val="FF0000"/>
+          <w:rtl/>
+          <w:lang w:bidi="fa-IR"/>
+        </w:rPr>
+        <w:t>ی</w:t>
+      </w:r>
+      <w:r>
+        <w:rPr>
+          <w:rFonts w:cs="Arial"/>
+          <w:rtl/>
+          <w:lang w:bidi="fa-IR"/>
+        </w:rPr>
+        <w:t xml:space="preserve"> عمل م</w:t>
+      </w:r>
+      <w:r>
+        <w:rPr>
+          <w:rFonts w:cs="Arial" w:hint="cs"/>
+          <w:rtl/>
+          <w:lang w:bidi="fa-IR"/>
+        </w:rPr>
+        <w:t>ی‌</w:t>
+      </w:r>
+      <w:r>
+        <w:rPr>
+          <w:rFonts w:cs="Arial" w:hint="eastAsia"/>
+          <w:rtl/>
+          <w:lang w:bidi="fa-IR"/>
+        </w:rPr>
+        <w:t>کند؛</w:t>
+      </w:r>
+      <w:r>
+        <w:rPr>
+          <w:rFonts w:cs="Arial"/>
+          <w:rtl/>
+          <w:lang w:bidi="fa-IR"/>
+        </w:rPr>
+        <w:t xml:space="preserve"> به طور</w:t>
+      </w:r>
+      <w:r>
+        <w:rPr>
+          <w:rFonts w:cs="Arial" w:hint="cs"/>
+          <w:rtl/>
+          <w:lang w:bidi="fa-IR"/>
+        </w:rPr>
+        <w:t>ی</w:t>
+      </w:r>
+      <w:r>
+        <w:rPr>
+          <w:rFonts w:cs="Arial"/>
+          <w:rtl/>
+          <w:lang w:bidi="fa-IR"/>
+        </w:rPr>
+        <w:t xml:space="preserve"> که موقع خواندن داده‌ها</w:t>
+      </w:r>
+      <w:r>
+        <w:rPr>
+          <w:rFonts w:cs="Arial" w:hint="cs"/>
+          <w:rtl/>
+          <w:lang w:bidi="fa-IR"/>
+        </w:rPr>
+        <w:t>ی</w:t>
+      </w:r>
+      <w:r>
+        <w:rPr>
+          <w:rFonts w:cs="Arial"/>
+          <w:rtl/>
+          <w:lang w:bidi="fa-IR"/>
+        </w:rPr>
+        <w:t xml:space="preserve"> مخدوش از فا</w:t>
+      </w:r>
+      <w:r>
+        <w:rPr>
+          <w:rFonts w:cs="Arial" w:hint="cs"/>
+          <w:rtl/>
+          <w:lang w:bidi="fa-IR"/>
+        </w:rPr>
+        <w:t>ی</w:t>
+      </w:r>
+      <w:r>
+        <w:rPr>
+          <w:rFonts w:cs="Arial" w:hint="eastAsia"/>
+          <w:rtl/>
+          <w:lang w:bidi="fa-IR"/>
+        </w:rPr>
+        <w:t>ل</w:t>
+      </w:r>
+      <w:r>
+        <w:rPr>
+          <w:rFonts w:cs="Arial"/>
+          <w:rtl/>
+          <w:lang w:bidi="fa-IR"/>
+        </w:rPr>
+        <w:t xml:space="preserve"> </w:t>
+      </w:r>
+      <w:r>
+        <w:rPr>
+          <w:rFonts w:cs="Arial" w:hint="cs"/>
+          <w:rtl/>
+          <w:lang w:bidi="fa-IR"/>
+        </w:rPr>
+        <w:t>ی</w:t>
+      </w:r>
+      <w:r>
+        <w:rPr>
+          <w:rFonts w:cs="Arial" w:hint="eastAsia"/>
+          <w:rtl/>
+          <w:lang w:bidi="fa-IR"/>
+        </w:rPr>
+        <w:t>ا</w:t>
+      </w:r>
+      <w:r>
+        <w:rPr>
+          <w:rFonts w:cs="Arial"/>
+          <w:rtl/>
+          <w:lang w:bidi="fa-IR"/>
+        </w:rPr>
+        <w:t xml:space="preserve"> هنگام اضافه‌شدن آهنگ جد</w:t>
+      </w:r>
+      <w:r>
+        <w:rPr>
+          <w:rFonts w:cs="Arial" w:hint="cs"/>
+          <w:rtl/>
+          <w:lang w:bidi="fa-IR"/>
+        </w:rPr>
+        <w:t>ی</w:t>
+      </w:r>
+      <w:r>
+        <w:rPr>
+          <w:rFonts w:cs="Arial" w:hint="eastAsia"/>
+          <w:rtl/>
+          <w:lang w:bidi="fa-IR"/>
+        </w:rPr>
+        <w:t>د</w:t>
+      </w:r>
+      <w:r>
+        <w:rPr>
+          <w:rFonts w:cs="Arial"/>
+          <w:rtl/>
+          <w:lang w:bidi="fa-IR"/>
+        </w:rPr>
+        <w:t xml:space="preserve"> توسط کاربر، ورود</w:t>
+      </w:r>
+      <w:r>
+        <w:rPr>
+          <w:rFonts w:cs="Arial" w:hint="cs"/>
+          <w:rtl/>
+          <w:lang w:bidi="fa-IR"/>
+        </w:rPr>
+        <w:t>ی‌</w:t>
+      </w:r>
+      <w:r>
+        <w:rPr>
+          <w:rFonts w:cs="Arial" w:hint="eastAsia"/>
+          <w:rtl/>
+          <w:lang w:bidi="fa-IR"/>
+        </w:rPr>
+        <w:t>ها</w:t>
+      </w:r>
+      <w:r>
+        <w:rPr>
+          <w:rFonts w:cs="Arial"/>
+          <w:rtl/>
+          <w:lang w:bidi="fa-IR"/>
+        </w:rPr>
+        <w:t xml:space="preserve"> بررس</w:t>
+      </w:r>
+      <w:r>
+        <w:rPr>
+          <w:rFonts w:cs="Arial" w:hint="cs"/>
+          <w:rtl/>
+          <w:lang w:bidi="fa-IR"/>
+        </w:rPr>
+        <w:t>ی</w:t>
+      </w:r>
+      <w:r>
+        <w:rPr>
+          <w:rFonts w:cs="Arial"/>
+          <w:rtl/>
+          <w:lang w:bidi="fa-IR"/>
+        </w:rPr>
+        <w:t xml:space="preserve"> شده و از ورود داده‌ها</w:t>
+      </w:r>
+      <w:r>
+        <w:rPr>
+          <w:rFonts w:cs="Arial" w:hint="cs"/>
+          <w:rtl/>
+          <w:lang w:bidi="fa-IR"/>
+        </w:rPr>
+        <w:t>ی</w:t>
+      </w:r>
+      <w:r>
+        <w:rPr>
+          <w:rFonts w:cs="Arial"/>
+          <w:rtl/>
+          <w:lang w:bidi="fa-IR"/>
+        </w:rPr>
+        <w:t xml:space="preserve"> </w:t>
+      </w:r>
+      <w:r>
+        <w:rPr>
+          <w:rFonts w:cs="Arial"/>
+          <w:color w:val="FF0000"/>
+          <w:rtl/>
+          <w:lang w:bidi="fa-IR"/>
+        </w:rPr>
+        <w:t>خارج از محدوده استاندارد</w:t>
+      </w:r>
+      <w:r>
+        <w:rPr>
+          <w:rFonts w:cs="Arial"/>
+          <w:rtl/>
+          <w:lang w:bidi="fa-IR"/>
+        </w:rPr>
+        <w:t xml:space="preserve"> (مثلاً خارج از بازه صفر و </w:t>
+      </w:r>
+      <w:r>
+        <w:rPr>
+          <w:rFonts w:cs="Arial" w:hint="cs"/>
+          <w:rtl/>
+          <w:lang w:bidi="fa-IR"/>
+        </w:rPr>
+        <w:t>ی</w:t>
+      </w:r>
+      <w:r>
+        <w:rPr>
+          <w:rFonts w:cs="Arial" w:hint="eastAsia"/>
+          <w:rtl/>
+          <w:lang w:bidi="fa-IR"/>
+        </w:rPr>
+        <w:t>ک</w:t>
+      </w:r>
+      <w:r>
+        <w:rPr>
+          <w:rFonts w:cs="Arial"/>
+          <w:rtl/>
+          <w:lang w:bidi="fa-IR"/>
+        </w:rPr>
+        <w:t xml:space="preserve"> برا</w:t>
+      </w:r>
+      <w:r>
+        <w:rPr>
+          <w:rFonts w:cs="Arial" w:hint="cs"/>
+          <w:rtl/>
+          <w:lang w:bidi="fa-IR"/>
+        </w:rPr>
+        <w:t>ی</w:t>
+      </w:r>
+      <w:r>
+        <w:rPr>
+          <w:rFonts w:cs="Arial"/>
+          <w:rtl/>
+          <w:lang w:bidi="fa-IR"/>
+        </w:rPr>
+        <w:t xml:space="preserve"> شاخص‌ها</w:t>
+      </w:r>
+      <w:r>
+        <w:rPr>
+          <w:rFonts w:cs="Arial" w:hint="cs"/>
+          <w:rtl/>
+          <w:lang w:bidi="fa-IR"/>
+        </w:rPr>
+        <w:t>ی</w:t>
+      </w:r>
+      <w:r>
+        <w:rPr>
+          <w:rFonts w:cs="Arial"/>
+          <w:rtl/>
+          <w:lang w:bidi="fa-IR"/>
+        </w:rPr>
+        <w:t xml:space="preserve"> صوت</w:t>
+      </w:r>
+      <w:r>
+        <w:rPr>
+          <w:rFonts w:cs="Arial" w:hint="cs"/>
+          <w:rtl/>
+          <w:lang w:bidi="fa-IR"/>
+        </w:rPr>
+        <w:t>ی</w:t>
+      </w:r>
+      <w:r>
+        <w:rPr>
+          <w:rFonts w:cs="Arial"/>
+          <w:rtl/>
+          <w:lang w:bidi="fa-IR"/>
+        </w:rPr>
+        <w:t xml:space="preserve"> مثل انرژ</w:t>
+      </w:r>
+      <w:r>
+        <w:rPr>
+          <w:rFonts w:cs="Arial" w:hint="cs"/>
+          <w:rtl/>
+          <w:lang w:bidi="fa-IR"/>
+        </w:rPr>
+        <w:t>ی</w:t>
+      </w:r>
+      <w:r>
+        <w:rPr>
+          <w:rFonts w:cs="Arial"/>
+          <w:rtl/>
+          <w:lang w:bidi="fa-IR"/>
+        </w:rPr>
+        <w:t xml:space="preserve"> و شاداب</w:t>
+      </w:r>
+      <w:r>
+        <w:rPr>
+          <w:rFonts w:cs="Arial" w:hint="cs"/>
+          <w:rtl/>
+          <w:lang w:bidi="fa-IR"/>
+        </w:rPr>
+        <w:t>ی</w:t>
+      </w:r>
+      <w:r>
+        <w:rPr>
+          <w:rFonts w:cs="Arial"/>
+          <w:rtl/>
+          <w:lang w:bidi="fa-IR"/>
+        </w:rPr>
+        <w:t>) جلوگ</w:t>
+      </w:r>
+      <w:r>
+        <w:rPr>
+          <w:rFonts w:cs="Arial" w:hint="cs"/>
+          <w:rtl/>
+          <w:lang w:bidi="fa-IR"/>
+        </w:rPr>
+        <w:t>ی</w:t>
+      </w:r>
+      <w:r>
+        <w:rPr>
+          <w:rFonts w:cs="Arial" w:hint="eastAsia"/>
+          <w:rtl/>
+          <w:lang w:bidi="fa-IR"/>
+        </w:rPr>
+        <w:t>ر</w:t>
+      </w:r>
+      <w:r>
+        <w:rPr>
+          <w:rFonts w:cs="Arial" w:hint="cs"/>
+          <w:rtl/>
+          <w:lang w:bidi="fa-IR"/>
+        </w:rPr>
+        <w:t>ی</w:t>
+      </w:r>
+      <w:r>
+        <w:rPr>
+          <w:rFonts w:cs="Arial"/>
+          <w:rtl/>
+          <w:lang w:bidi="fa-IR"/>
+        </w:rPr>
+        <w:t xml:space="preserve"> م</w:t>
+      </w:r>
+      <w:r>
+        <w:rPr>
+          <w:rFonts w:cs="Arial" w:hint="cs"/>
+          <w:rtl/>
+          <w:lang w:bidi="fa-IR"/>
+        </w:rPr>
+        <w:t>ی‌</w:t>
+      </w:r>
+      <w:r>
+        <w:rPr>
+          <w:rFonts w:cs="Arial" w:hint="eastAsia"/>
+          <w:rtl/>
+          <w:lang w:bidi="fa-IR"/>
+        </w:rPr>
+        <w:t>شود</w:t>
+      </w:r>
+      <w:r>
+        <w:rPr>
+          <w:rFonts w:cs="Arial" w:hint="cs"/>
+          <w:rtl/>
+          <w:lang w:bidi="fa-IR"/>
+        </w:rPr>
+        <w:t xml:space="preserve"> . </w:t>
+      </w:r>
+      <w:r>
+        <w:rPr>
+          <w:lang w:bidi="fa-IR"/>
+        </w:rPr>
+        <w:t>.</w:t>
+      </w:r>
+    </w:p>
+    <w:p>
+      <w:pPr>
+        <w:jc w:val="right"/>
+        <w:rPr>
+          <w:color w:val="FF0000"/>
+          <w:lang w:bidi="fa-IR"/>
+        </w:rPr>
+      </w:pPr>
+      <w:r>
+        <w:rPr>
+          <w:color w:val="FF0000"/>
+          <w:lang w:bidi="fa-IR"/>
+        </w:rPr>
+        <w:t xml:space="preserve">. </w:t>
+      </w:r>
+      <w:r>
+        <w:rPr>
+          <w:rFonts w:hint="cs"/>
+          <w:color w:val="FF0000"/>
+          <w:rtl/>
+          <w:lang w:bidi="fa-IR"/>
+        </w:rPr>
+        <w:t xml:space="preserve">2 . </w:t>
+      </w:r>
+      <w:r>
+        <w:rPr>
+          <w:rFonts w:cs="Arial"/>
+          <w:color w:val="FF0000"/>
+          <w:rtl/>
+          <w:lang w:bidi="fa-IR"/>
+        </w:rPr>
+        <w:t>ارث‌بر</w:t>
+      </w:r>
+      <w:r>
+        <w:rPr>
+          <w:rFonts w:cs="Arial" w:hint="cs"/>
+          <w:color w:val="FF0000"/>
+          <w:rtl/>
+          <w:lang w:bidi="fa-IR"/>
+        </w:rPr>
+        <w:t>ی</w:t>
+      </w:r>
+      <w:r>
+        <w:rPr>
+          <w:rFonts w:cs="Arial"/>
+          <w:color w:val="FF0000"/>
+          <w:rtl/>
+          <w:lang w:bidi="fa-IR"/>
+        </w:rPr>
+        <w:t xml:space="preserve"> و چندر</w:t>
+      </w:r>
+      <w:r>
+        <w:rPr>
+          <w:rFonts w:cs="Arial" w:hint="cs"/>
+          <w:color w:val="FF0000"/>
+          <w:rtl/>
+          <w:lang w:bidi="fa-IR"/>
+        </w:rPr>
+        <w:t>ی</w:t>
+      </w:r>
+      <w:r>
+        <w:rPr>
+          <w:rFonts w:cs="Arial" w:hint="eastAsia"/>
+          <w:color w:val="FF0000"/>
+          <w:rtl/>
+          <w:lang w:bidi="fa-IR"/>
+        </w:rPr>
+        <w:t>خت</w:t>
+      </w:r>
+      <w:r>
+        <w:rPr>
+          <w:rFonts w:cs="Arial" w:hint="cs"/>
+          <w:color w:val="FF0000"/>
+          <w:rtl/>
+          <w:lang w:bidi="fa-IR"/>
+        </w:rPr>
+        <w:t>ی</w:t>
+      </w:r>
+    </w:p>
+    <w:p>
+      <w:pPr>
+        <w:jc w:val="right"/>
+        <w:rPr>
+          <w:lang w:bidi="fa-IR"/>
+        </w:rPr>
+      </w:pPr>
+      <w:r>
+        <w:rPr>
+          <w:rFonts w:cs="Arial" w:hint="eastAsia"/>
+          <w:rtl/>
+          <w:lang w:bidi="fa-IR"/>
+        </w:rPr>
+        <w:t>در</w:t>
+      </w:r>
+      <w:r>
+        <w:rPr>
+          <w:rFonts w:cs="Arial"/>
+          <w:rtl/>
+          <w:lang w:bidi="fa-IR"/>
+        </w:rPr>
+        <w:t xml:space="preserve"> بخش تم</w:t>
+      </w:r>
+      <w:r>
+        <w:rPr>
+          <w:rFonts w:cs="Arial" w:hint="cs"/>
+          <w:rtl/>
+          <w:lang w:bidi="fa-IR"/>
+        </w:rPr>
+        <w:t>ی</w:t>
+      </w:r>
+      <w:r>
+        <w:rPr>
+          <w:rFonts w:cs="Arial" w:hint="eastAsia"/>
+          <w:rtl/>
+          <w:lang w:bidi="fa-IR"/>
+        </w:rPr>
+        <w:t>زکار</w:t>
+      </w:r>
+      <w:r>
+        <w:rPr>
+          <w:rFonts w:cs="Arial" w:hint="cs"/>
+          <w:rtl/>
+          <w:lang w:bidi="fa-IR"/>
+        </w:rPr>
+        <w:t>ی</w:t>
+      </w:r>
+      <w:r>
+        <w:rPr>
+          <w:rFonts w:cs="Arial"/>
+          <w:rtl/>
+          <w:lang w:bidi="fa-IR"/>
+        </w:rPr>
+        <w:t xml:space="preserve"> داده‌ها و </w:t>
+      </w:r>
+      <w:r>
+        <w:rPr>
+          <w:rFonts w:cs="Arial"/>
+          <w:color w:val="FF0000"/>
+          <w:rtl/>
+          <w:lang w:bidi="fa-IR"/>
+        </w:rPr>
+        <w:t>مد</w:t>
+      </w:r>
+      <w:r>
+        <w:rPr>
+          <w:rFonts w:cs="Arial" w:hint="cs"/>
+          <w:color w:val="FF0000"/>
+          <w:rtl/>
+          <w:lang w:bidi="fa-IR"/>
+        </w:rPr>
+        <w:t>ی</w:t>
+      </w:r>
+      <w:r>
+        <w:rPr>
+          <w:rFonts w:cs="Arial" w:hint="eastAsia"/>
+          <w:color w:val="FF0000"/>
+          <w:rtl/>
+          <w:lang w:bidi="fa-IR"/>
+        </w:rPr>
+        <w:t>ر</w:t>
+      </w:r>
+      <w:r>
+        <w:rPr>
+          <w:rFonts w:cs="Arial" w:hint="cs"/>
+          <w:color w:val="FF0000"/>
+          <w:rtl/>
+          <w:lang w:bidi="fa-IR"/>
+        </w:rPr>
+        <w:t>ی</w:t>
+      </w:r>
+      <w:r>
+        <w:rPr>
+          <w:rFonts w:cs="Arial" w:hint="eastAsia"/>
+          <w:color w:val="FF0000"/>
+          <w:rtl/>
+          <w:lang w:bidi="fa-IR"/>
+        </w:rPr>
+        <w:t>ت</w:t>
+      </w:r>
+      <w:r>
+        <w:rPr>
+          <w:rFonts w:cs="Arial"/>
+          <w:color w:val="FF0000"/>
+          <w:rtl/>
+          <w:lang w:bidi="fa-IR"/>
+        </w:rPr>
+        <w:t xml:space="preserve"> داده‌ها</w:t>
+      </w:r>
+      <w:r>
+        <w:rPr>
+          <w:rFonts w:cs="Arial" w:hint="cs"/>
+          <w:color w:val="FF0000"/>
+          <w:rtl/>
+          <w:lang w:bidi="fa-IR"/>
+        </w:rPr>
+        <w:t>ی</w:t>
+      </w:r>
+      <w:r>
+        <w:rPr>
+          <w:rFonts w:cs="Arial"/>
+          <w:color w:val="FF0000"/>
+          <w:rtl/>
+          <w:lang w:bidi="fa-IR"/>
+        </w:rPr>
+        <w:t xml:space="preserve"> پرت</w:t>
+      </w:r>
+      <w:r>
+        <w:rPr>
+          <w:rFonts w:cs="Arial"/>
+          <w:rtl/>
+          <w:lang w:bidi="fa-IR"/>
+        </w:rPr>
+        <w:t>، با روش‌ها</w:t>
+      </w:r>
+      <w:r>
+        <w:rPr>
+          <w:rFonts w:cs="Arial" w:hint="cs"/>
+          <w:rtl/>
+          <w:lang w:bidi="fa-IR"/>
+        </w:rPr>
+        <w:t>ی</w:t>
+      </w:r>
+      <w:r>
+        <w:rPr>
+          <w:rFonts w:cs="Arial"/>
+          <w:rtl/>
+          <w:lang w:bidi="fa-IR"/>
+        </w:rPr>
+        <w:t xml:space="preserve"> مختلف</w:t>
+      </w:r>
+      <w:r>
+        <w:rPr>
+          <w:rFonts w:cs="Arial" w:hint="cs"/>
+          <w:rtl/>
+          <w:lang w:bidi="fa-IR"/>
+        </w:rPr>
+        <w:t>ی</w:t>
+      </w:r>
+      <w:r>
+        <w:rPr>
+          <w:rFonts w:cs="Arial"/>
+          <w:rtl/>
+          <w:lang w:bidi="fa-IR"/>
+        </w:rPr>
+        <w:t xml:space="preserve"> روبرو بود</w:t>
+      </w:r>
+      <w:r>
+        <w:rPr>
+          <w:rFonts w:cs="Arial" w:hint="eastAsia"/>
+          <w:rtl/>
+          <w:lang w:bidi="fa-IR"/>
+        </w:rPr>
+        <w:t>م</w:t>
+      </w:r>
+      <w:r>
+        <w:rPr>
+          <w:rFonts w:cs="Arial"/>
+          <w:rtl/>
+          <w:lang w:bidi="fa-IR"/>
+        </w:rPr>
+        <w:t xml:space="preserve"> (مانند پر کردن با م</w:t>
+      </w:r>
+      <w:r>
+        <w:rPr>
+          <w:rFonts w:cs="Arial" w:hint="cs"/>
+          <w:rtl/>
+          <w:lang w:bidi="fa-IR"/>
+        </w:rPr>
+        <w:t>ی</w:t>
+      </w:r>
+      <w:r>
+        <w:rPr>
+          <w:rFonts w:cs="Arial" w:hint="eastAsia"/>
+          <w:rtl/>
+          <w:lang w:bidi="fa-IR"/>
+        </w:rPr>
+        <w:t>انگ</w:t>
+      </w:r>
+      <w:r>
+        <w:rPr>
+          <w:rFonts w:cs="Arial" w:hint="cs"/>
+          <w:rtl/>
+          <w:lang w:bidi="fa-IR"/>
+        </w:rPr>
+        <w:t>ی</w:t>
+      </w:r>
+      <w:r>
+        <w:rPr>
+          <w:rFonts w:cs="Arial" w:hint="eastAsia"/>
+          <w:rtl/>
+          <w:lang w:bidi="fa-IR"/>
+        </w:rPr>
+        <w:t>ن،</w:t>
+      </w:r>
+      <w:r>
+        <w:rPr>
+          <w:rFonts w:cs="Arial"/>
+          <w:rtl/>
+          <w:lang w:bidi="fa-IR"/>
+        </w:rPr>
+        <w:t xml:space="preserve"> م</w:t>
+      </w:r>
+      <w:r>
+        <w:rPr>
+          <w:rFonts w:cs="Arial" w:hint="cs"/>
+          <w:rtl/>
+          <w:lang w:bidi="fa-IR"/>
+        </w:rPr>
+        <w:t>ی</w:t>
+      </w:r>
+      <w:r>
+        <w:rPr>
+          <w:rFonts w:cs="Arial" w:hint="eastAsia"/>
+          <w:rtl/>
+          <w:lang w:bidi="fa-IR"/>
+        </w:rPr>
+        <w:t>انه</w:t>
+      </w:r>
+      <w:r>
+        <w:rPr>
+          <w:rFonts w:cs="Arial"/>
+          <w:rtl/>
+          <w:lang w:bidi="fa-IR"/>
+        </w:rPr>
+        <w:t xml:space="preserve"> </w:t>
+      </w:r>
+      <w:r>
+        <w:rPr>
+          <w:rFonts w:cs="Arial" w:hint="cs"/>
+          <w:rtl/>
+          <w:lang w:bidi="fa-IR"/>
+        </w:rPr>
+        <w:t>ی</w:t>
+      </w:r>
+      <w:r>
+        <w:rPr>
+          <w:rFonts w:cs="Arial" w:hint="eastAsia"/>
+          <w:rtl/>
+          <w:lang w:bidi="fa-IR"/>
+        </w:rPr>
+        <w:t>ا</w:t>
+      </w:r>
+      <w:r>
+        <w:rPr>
+          <w:rFonts w:cs="Arial"/>
+          <w:rtl/>
+          <w:lang w:bidi="fa-IR"/>
+        </w:rPr>
+        <w:t xml:space="preserve"> همسا</w:t>
+      </w:r>
+      <w:r>
+        <w:rPr>
+          <w:rFonts w:cs="Arial" w:hint="cs"/>
+          <w:rtl/>
+          <w:lang w:bidi="fa-IR"/>
+        </w:rPr>
+        <w:t>ی</w:t>
+      </w:r>
+      <w:r>
+        <w:rPr>
+          <w:rFonts w:cs="Arial" w:hint="eastAsia"/>
+          <w:rtl/>
+          <w:lang w:bidi="fa-IR"/>
+        </w:rPr>
+        <w:t>گ</w:t>
+      </w:r>
+      <w:r>
+        <w:rPr>
+          <w:rFonts w:cs="Arial" w:hint="cs"/>
+          <w:rtl/>
+          <w:lang w:bidi="fa-IR"/>
+        </w:rPr>
+        <w:t>ی</w:t>
+      </w:r>
+      <w:r>
+        <w:rPr>
+          <w:rFonts w:cs="Arial"/>
+          <w:rtl/>
+          <w:lang w:bidi="fa-IR"/>
+        </w:rPr>
+        <w:t>)</w:t>
+      </w:r>
+    </w:p>
+    <w:p>
+      <w:pPr>
+        <w:jc w:val="right"/>
+        <w:rPr>
+          <w:lang w:bidi="fa-IR"/>
+        </w:rPr>
+      </w:pPr>
+      <w:r>
+        <w:rPr>
+          <w:rFonts w:cs="Arial"/>
+          <w:rtl/>
+          <w:lang w:bidi="fa-IR"/>
+        </w:rPr>
+        <w:t>تجربه کاربرد</w:t>
+      </w:r>
+      <w:r>
+        <w:rPr>
+          <w:rFonts w:cs="Arial" w:hint="cs"/>
+          <w:rtl/>
+          <w:lang w:bidi="fa-IR"/>
+        </w:rPr>
+        <w:t>ی</w:t>
+      </w:r>
+      <w:r>
+        <w:rPr>
+          <w:rFonts w:cs="Arial"/>
+          <w:rtl/>
+          <w:lang w:bidi="fa-IR"/>
+        </w:rPr>
+        <w:t>: با طراح</w:t>
+      </w:r>
+      <w:r>
+        <w:rPr>
+          <w:rFonts w:cs="Arial" w:hint="cs"/>
+          <w:rtl/>
+          <w:lang w:bidi="fa-IR"/>
+        </w:rPr>
+        <w:t>ی</w:t>
+      </w:r>
+      <w:r>
+        <w:rPr>
+          <w:rFonts w:cs="Arial"/>
+          <w:rtl/>
+          <w:lang w:bidi="fa-IR"/>
+        </w:rPr>
+        <w:t xml:space="preserve"> کلاس‌ها</w:t>
+      </w:r>
+      <w:r>
+        <w:rPr>
+          <w:rFonts w:cs="Arial" w:hint="cs"/>
+          <w:rtl/>
+          <w:lang w:bidi="fa-IR"/>
+        </w:rPr>
+        <w:t>ی</w:t>
+      </w:r>
+      <w:r>
+        <w:rPr>
+          <w:rFonts w:cs="Arial"/>
+          <w:rtl/>
+          <w:lang w:bidi="fa-IR"/>
+        </w:rPr>
+        <w:t xml:space="preserve"> پا</w:t>
+      </w:r>
+      <w:r>
+        <w:rPr>
+          <w:rFonts w:cs="Arial" w:hint="cs"/>
+          <w:rtl/>
+          <w:lang w:bidi="fa-IR"/>
+        </w:rPr>
+        <w:t>ی</w:t>
+      </w:r>
+      <w:r>
+        <w:rPr>
+          <w:rFonts w:cs="Arial" w:hint="eastAsia"/>
+          <w:rtl/>
+          <w:lang w:bidi="fa-IR"/>
+        </w:rPr>
+        <w:t>ه</w:t>
+      </w:r>
+      <w:r>
+        <w:rPr>
+          <w:rFonts w:cs="Arial"/>
+          <w:rtl/>
+          <w:lang w:bidi="fa-IR"/>
+        </w:rPr>
+        <w:t xml:space="preserve"> و تعر</w:t>
+      </w:r>
+      <w:r>
+        <w:rPr>
+          <w:rFonts w:cs="Arial" w:hint="cs"/>
+          <w:rtl/>
+          <w:lang w:bidi="fa-IR"/>
+        </w:rPr>
+        <w:t>ی</w:t>
+      </w:r>
+      <w:r>
+        <w:rPr>
+          <w:rFonts w:cs="Arial" w:hint="eastAsia"/>
+          <w:rtl/>
+          <w:lang w:bidi="fa-IR"/>
+        </w:rPr>
+        <w:t>ف</w:t>
+      </w:r>
+      <w:r>
+        <w:rPr>
+          <w:rFonts w:cs="Arial"/>
+          <w:rtl/>
+          <w:lang w:bidi="fa-IR"/>
+        </w:rPr>
+        <w:t xml:space="preserve"> رفتارها</w:t>
+      </w:r>
+      <w:r>
+        <w:rPr>
+          <w:rFonts w:cs="Arial" w:hint="cs"/>
+          <w:rtl/>
+          <w:lang w:bidi="fa-IR"/>
+        </w:rPr>
+        <w:t>ی</w:t>
+      </w:r>
+      <w:r>
+        <w:rPr>
+          <w:rFonts w:cs="Arial"/>
+          <w:rtl/>
+          <w:lang w:bidi="fa-IR"/>
+        </w:rPr>
+        <w:t xml:space="preserve"> عموم</w:t>
+      </w:r>
+      <w:r>
+        <w:rPr>
+          <w:rFonts w:cs="Arial" w:hint="cs"/>
+          <w:rtl/>
+          <w:lang w:bidi="fa-IR"/>
+        </w:rPr>
+        <w:t>ی</w:t>
+      </w:r>
+      <w:r>
+        <w:rPr>
+          <w:rFonts w:cs="Arial" w:hint="eastAsia"/>
+          <w:rtl/>
+          <w:lang w:bidi="fa-IR"/>
+        </w:rPr>
+        <w:t>،</w:t>
+      </w:r>
+      <w:r>
+        <w:rPr>
+          <w:rFonts w:cs="Arial"/>
+          <w:rtl/>
+          <w:lang w:bidi="fa-IR"/>
+        </w:rPr>
+        <w:t xml:space="preserve"> </w:t>
+      </w:r>
+      <w:r>
+        <w:rPr>
+          <w:rFonts w:cs="Arial" w:hint="cs"/>
+          <w:rtl/>
+          <w:lang w:bidi="fa-IR"/>
+        </w:rPr>
+        <w:t>ی</w:t>
+      </w:r>
+      <w:r>
+        <w:rPr>
+          <w:rFonts w:cs="Arial" w:hint="eastAsia"/>
+          <w:rtl/>
+          <w:lang w:bidi="fa-IR"/>
+        </w:rPr>
+        <w:t>ک</w:t>
+      </w:r>
+      <w:r>
+        <w:rPr>
+          <w:rFonts w:cs="Arial"/>
+          <w:rtl/>
+          <w:lang w:bidi="fa-IR"/>
+        </w:rPr>
+        <w:t xml:space="preserve"> قرارداد ساختار</w:t>
+      </w:r>
+      <w:r>
+        <w:rPr>
+          <w:rFonts w:cs="Arial" w:hint="cs"/>
+          <w:rtl/>
+          <w:lang w:bidi="fa-IR"/>
+        </w:rPr>
+        <w:t>ی</w:t>
+      </w:r>
+      <w:r>
+        <w:rPr>
+          <w:rFonts w:cs="Arial"/>
+          <w:rtl/>
+          <w:lang w:bidi="fa-IR"/>
+        </w:rPr>
+        <w:t xml:space="preserve"> ا</w:t>
+      </w:r>
+      <w:r>
+        <w:rPr>
+          <w:rFonts w:cs="Arial" w:hint="cs"/>
+          <w:rtl/>
+          <w:lang w:bidi="fa-IR"/>
+        </w:rPr>
+        <w:t>ی</w:t>
+      </w:r>
+      <w:r>
+        <w:rPr>
+          <w:rFonts w:cs="Arial" w:hint="eastAsia"/>
+          <w:rtl/>
+          <w:lang w:bidi="fa-IR"/>
+        </w:rPr>
+        <w:t>جاد</w:t>
+      </w:r>
+      <w:r>
+        <w:rPr>
+          <w:rFonts w:cs="Arial" w:hint="cs"/>
+          <w:rtl/>
+          <w:lang w:bidi="fa-IR"/>
+        </w:rPr>
+        <w:t xml:space="preserve"> کردم</w:t>
+      </w:r>
+      <w:r>
+        <w:rPr>
+          <w:rFonts w:cs="Arial"/>
+          <w:rtl/>
+          <w:lang w:bidi="fa-IR"/>
+        </w:rPr>
+        <w:t>. سپس کلاس‌ها</w:t>
+      </w:r>
+      <w:r>
+        <w:rPr>
+          <w:rFonts w:cs="Arial" w:hint="cs"/>
+          <w:rtl/>
+          <w:lang w:bidi="fa-IR"/>
+        </w:rPr>
+        <w:t>ی</w:t>
+      </w:r>
+      <w:r>
+        <w:rPr>
+          <w:rFonts w:cs="Arial"/>
+          <w:rtl/>
+          <w:lang w:bidi="fa-IR"/>
+        </w:rPr>
+        <w:t xml:space="preserve"> فرزند ا</w:t>
+      </w:r>
+      <w:r>
+        <w:rPr>
+          <w:rFonts w:cs="Arial" w:hint="cs"/>
+          <w:rtl/>
+          <w:lang w:bidi="fa-IR"/>
+        </w:rPr>
+        <w:t>ی</w:t>
+      </w:r>
+      <w:r>
+        <w:rPr>
+          <w:rFonts w:cs="Arial" w:hint="eastAsia"/>
+          <w:rtl/>
+          <w:lang w:bidi="fa-IR"/>
+        </w:rPr>
+        <w:t>ن</w:t>
+      </w:r>
+      <w:r>
+        <w:rPr>
+          <w:rFonts w:cs="Arial"/>
+          <w:rtl/>
+          <w:lang w:bidi="fa-IR"/>
+        </w:rPr>
+        <w:t xml:space="preserve"> رفتارها را </w:t>
+      </w:r>
+      <w:r>
+        <w:rPr>
+          <w:rFonts w:cs="Arial"/>
+          <w:color w:val="FF0000"/>
+          <w:rtl/>
+          <w:lang w:bidi="fa-IR"/>
+        </w:rPr>
+        <w:t>ارث‌بر</w:t>
+      </w:r>
+      <w:r>
+        <w:rPr>
+          <w:rFonts w:cs="Arial" w:hint="cs"/>
+          <w:color w:val="FF0000"/>
+          <w:rtl/>
+          <w:lang w:bidi="fa-IR"/>
+        </w:rPr>
+        <w:t>ی</w:t>
+      </w:r>
+      <w:r>
+        <w:rPr>
+          <w:rFonts w:cs="Arial"/>
+          <w:color w:val="FF0000"/>
+          <w:rtl/>
+          <w:lang w:bidi="fa-IR"/>
+        </w:rPr>
+        <w:t xml:space="preserve"> </w:t>
+      </w:r>
+      <w:r>
+        <w:rPr>
+          <w:rFonts w:cs="Arial"/>
+          <w:rtl/>
+          <w:lang w:bidi="fa-IR"/>
+        </w:rPr>
+        <w:t>کرد</w:t>
+      </w:r>
+      <w:r>
+        <w:rPr>
+          <w:rFonts w:cs="Arial" w:hint="cs"/>
+          <w:rtl/>
+          <w:lang w:bidi="fa-IR"/>
+        </w:rPr>
+        <w:t>ند</w:t>
+      </w:r>
+      <w:r>
+        <w:rPr>
+          <w:rFonts w:cs="Arial"/>
+          <w:rtl/>
+          <w:lang w:bidi="fa-IR"/>
+        </w:rPr>
+        <w:t xml:space="preserve"> و وظا</w:t>
+      </w:r>
+      <w:r>
+        <w:rPr>
+          <w:rFonts w:cs="Arial" w:hint="cs"/>
+          <w:rtl/>
+          <w:lang w:bidi="fa-IR"/>
+        </w:rPr>
+        <w:t>ی</w:t>
+      </w:r>
+      <w:r>
+        <w:rPr>
+          <w:rFonts w:cs="Arial" w:hint="eastAsia"/>
+          <w:rtl/>
+          <w:lang w:bidi="fa-IR"/>
+        </w:rPr>
+        <w:t>ف</w:t>
+      </w:r>
+      <w:r>
+        <w:rPr>
+          <w:rFonts w:cs="Arial"/>
+          <w:rtl/>
+          <w:lang w:bidi="fa-IR"/>
+        </w:rPr>
+        <w:t xml:space="preserve"> خود را بازنو</w:t>
+      </w:r>
+      <w:r>
+        <w:rPr>
+          <w:rFonts w:cs="Arial" w:hint="cs"/>
+          <w:rtl/>
+          <w:lang w:bidi="fa-IR"/>
+        </w:rPr>
+        <w:t>ی</w:t>
+      </w:r>
+      <w:r>
+        <w:rPr>
+          <w:rFonts w:cs="Arial" w:hint="eastAsia"/>
+          <w:rtl/>
+          <w:lang w:bidi="fa-IR"/>
+        </w:rPr>
+        <w:t>س</w:t>
+      </w:r>
+      <w:r>
+        <w:rPr>
+          <w:rFonts w:cs="Arial" w:hint="cs"/>
+          <w:rtl/>
+          <w:lang w:bidi="fa-IR"/>
+        </w:rPr>
+        <w:t>ی</w:t>
+      </w:r>
+      <w:r>
+        <w:rPr>
+          <w:rFonts w:cs="Arial"/>
+          <w:rtl/>
+          <w:lang w:bidi="fa-IR"/>
+        </w:rPr>
+        <w:t xml:space="preserve"> کردند. ا</w:t>
+      </w:r>
+      <w:r>
+        <w:rPr>
+          <w:rFonts w:cs="Arial" w:hint="cs"/>
+          <w:rtl/>
+          <w:lang w:bidi="fa-IR"/>
+        </w:rPr>
+        <w:t>ی</w:t>
+      </w:r>
+      <w:r>
+        <w:rPr>
+          <w:rFonts w:cs="Arial" w:hint="eastAsia"/>
+          <w:rtl/>
+          <w:lang w:bidi="fa-IR"/>
+        </w:rPr>
+        <w:t>ن</w:t>
+      </w:r>
+      <w:r>
+        <w:rPr>
+          <w:rFonts w:cs="Arial"/>
+          <w:rtl/>
+          <w:lang w:bidi="fa-IR"/>
+        </w:rPr>
+        <w:t xml:space="preserve"> کار باعث شد برنامه اصل</w:t>
+      </w:r>
+      <w:r>
+        <w:rPr>
+          <w:rFonts w:cs="Arial" w:hint="cs"/>
+          <w:rtl/>
+          <w:lang w:bidi="fa-IR"/>
+        </w:rPr>
+        <w:t>ی</w:t>
+      </w:r>
+      <w:r>
+        <w:rPr>
+          <w:rFonts w:cs="Arial"/>
+          <w:rtl/>
+          <w:lang w:bidi="fa-IR"/>
+        </w:rPr>
+        <w:t xml:space="preserve"> بدون درگ</w:t>
+      </w:r>
+      <w:r>
+        <w:rPr>
+          <w:rFonts w:cs="Arial" w:hint="cs"/>
+          <w:rtl/>
+          <w:lang w:bidi="fa-IR"/>
+        </w:rPr>
+        <w:t>ی</w:t>
+      </w:r>
+      <w:r>
+        <w:rPr>
+          <w:rFonts w:cs="Arial" w:hint="eastAsia"/>
+          <w:rtl/>
+          <w:lang w:bidi="fa-IR"/>
+        </w:rPr>
+        <w:t>ر</w:t>
+      </w:r>
+      <w:r>
+        <w:rPr>
+          <w:rFonts w:cs="Arial"/>
+          <w:rtl/>
+          <w:lang w:bidi="fa-IR"/>
+        </w:rPr>
+        <w:t xml:space="preserve"> شدن با جزئ</w:t>
+      </w:r>
+      <w:r>
+        <w:rPr>
+          <w:rFonts w:cs="Arial" w:hint="cs"/>
+          <w:rtl/>
+          <w:lang w:bidi="fa-IR"/>
+        </w:rPr>
+        <w:t>ی</w:t>
+      </w:r>
+      <w:r>
+        <w:rPr>
+          <w:rFonts w:cs="Arial" w:hint="eastAsia"/>
+          <w:rtl/>
+          <w:lang w:bidi="fa-IR"/>
+        </w:rPr>
+        <w:t>ات</w:t>
+      </w:r>
+      <w:r>
+        <w:rPr>
+          <w:rFonts w:cs="Arial"/>
+          <w:rtl/>
+          <w:lang w:bidi="fa-IR"/>
+        </w:rPr>
+        <w:t xml:space="preserve"> هر الگو، بتواند رفتار موردنظر را صدا بزند. همچن</w:t>
+      </w:r>
+      <w:r>
+        <w:rPr>
+          <w:rFonts w:cs="Arial" w:hint="cs"/>
+          <w:rtl/>
+          <w:lang w:bidi="fa-IR"/>
+        </w:rPr>
+        <w:t>ی</w:t>
+      </w:r>
+      <w:r>
+        <w:rPr>
+          <w:rFonts w:cs="Arial" w:hint="eastAsia"/>
+          <w:rtl/>
+          <w:lang w:bidi="fa-IR"/>
+        </w:rPr>
+        <w:t>ن</w:t>
+      </w:r>
+      <w:r>
+        <w:rPr>
+          <w:rFonts w:cs="Arial"/>
+          <w:rtl/>
+          <w:lang w:bidi="fa-IR"/>
+        </w:rPr>
+        <w:t xml:space="preserve"> اگر در </w:t>
+      </w:r>
+      <w:r>
+        <w:rPr>
+          <w:rFonts w:cs="Arial"/>
+          <w:color w:val="FF0000"/>
+          <w:rtl/>
+          <w:lang w:bidi="fa-IR"/>
+        </w:rPr>
+        <w:t>آ</w:t>
+      </w:r>
+      <w:r>
+        <w:rPr>
+          <w:rFonts w:cs="Arial" w:hint="cs"/>
+          <w:color w:val="FF0000"/>
+          <w:rtl/>
+          <w:lang w:bidi="fa-IR"/>
+        </w:rPr>
+        <w:t>ی</w:t>
+      </w:r>
+      <w:r>
+        <w:rPr>
+          <w:rFonts w:cs="Arial" w:hint="eastAsia"/>
+          <w:color w:val="FF0000"/>
+          <w:rtl/>
+          <w:lang w:bidi="fa-IR"/>
+        </w:rPr>
+        <w:t>نده</w:t>
+      </w:r>
+      <w:r>
+        <w:rPr>
+          <w:rFonts w:cs="Arial"/>
+          <w:color w:val="FF0000"/>
+          <w:rtl/>
+          <w:lang w:bidi="fa-IR"/>
+        </w:rPr>
+        <w:t xml:space="preserve"> </w:t>
+      </w:r>
+      <w:r>
+        <w:rPr>
+          <w:rFonts w:cs="Arial"/>
+          <w:rtl/>
+          <w:lang w:bidi="fa-IR"/>
+        </w:rPr>
+        <w:t>بخواه</w:t>
+      </w:r>
+      <w:r>
+        <w:rPr>
+          <w:rFonts w:cs="Arial" w:hint="eastAsia"/>
+          <w:rtl/>
+          <w:lang w:bidi="fa-IR"/>
+        </w:rPr>
+        <w:t>م</w:t>
+      </w:r>
+      <w:r>
+        <w:rPr>
+          <w:rFonts w:cs="Arial"/>
+          <w:rtl/>
+          <w:lang w:bidi="fa-IR"/>
+        </w:rPr>
+        <w:t xml:space="preserve"> الگور</w:t>
+      </w:r>
+      <w:r>
+        <w:rPr>
+          <w:rFonts w:cs="Arial" w:hint="cs"/>
+          <w:rtl/>
+          <w:lang w:bidi="fa-IR"/>
+        </w:rPr>
+        <w:t>ی</w:t>
+      </w:r>
+      <w:r>
+        <w:rPr>
+          <w:rFonts w:cs="Arial" w:hint="eastAsia"/>
+          <w:rtl/>
+          <w:lang w:bidi="fa-IR"/>
+        </w:rPr>
+        <w:t>تم</w:t>
+      </w:r>
+      <w:r>
+        <w:rPr>
+          <w:rFonts w:cs="Arial"/>
+          <w:rtl/>
+          <w:lang w:bidi="fa-IR"/>
+        </w:rPr>
+        <w:t xml:space="preserve"> جد</w:t>
+      </w:r>
+      <w:r>
+        <w:rPr>
+          <w:rFonts w:cs="Arial" w:hint="cs"/>
+          <w:rtl/>
+          <w:lang w:bidi="fa-IR"/>
+        </w:rPr>
+        <w:t>ی</w:t>
+      </w:r>
+      <w:r>
+        <w:rPr>
+          <w:rFonts w:cs="Arial" w:hint="eastAsia"/>
+          <w:rtl/>
+          <w:lang w:bidi="fa-IR"/>
+        </w:rPr>
+        <w:t>د</w:t>
+      </w:r>
+      <w:r>
+        <w:rPr>
+          <w:rFonts w:cs="Arial" w:hint="cs"/>
+          <w:rtl/>
+          <w:lang w:bidi="fa-IR"/>
+        </w:rPr>
+        <w:t>ی</w:t>
+      </w:r>
+      <w:r>
+        <w:rPr>
+          <w:rFonts w:cs="Arial"/>
+          <w:rtl/>
+          <w:lang w:bidi="fa-IR"/>
+        </w:rPr>
+        <w:t xml:space="preserve"> اضافه کن</w:t>
+      </w:r>
+      <w:r>
+        <w:rPr>
+          <w:rFonts w:cs="Arial" w:hint="cs"/>
+          <w:rtl/>
+          <w:lang w:bidi="fa-IR"/>
+        </w:rPr>
+        <w:t>م</w:t>
+      </w:r>
+      <w:r>
+        <w:rPr>
+          <w:rFonts w:cs="Arial" w:hint="eastAsia"/>
+          <w:rtl/>
+          <w:lang w:bidi="fa-IR"/>
+        </w:rPr>
+        <w:t>،</w:t>
+      </w:r>
+      <w:r>
+        <w:rPr>
+          <w:rFonts w:cs="Arial"/>
+          <w:rtl/>
+          <w:lang w:bidi="fa-IR"/>
+        </w:rPr>
+        <w:t xml:space="preserve"> ن</w:t>
+      </w:r>
+      <w:r>
+        <w:rPr>
+          <w:rFonts w:cs="Arial" w:hint="cs"/>
+          <w:rtl/>
+          <w:lang w:bidi="fa-IR"/>
+        </w:rPr>
+        <w:t>ی</w:t>
+      </w:r>
+      <w:r>
+        <w:rPr>
+          <w:rFonts w:cs="Arial" w:hint="eastAsia"/>
+          <w:rtl/>
+          <w:lang w:bidi="fa-IR"/>
+        </w:rPr>
+        <w:t>از</w:t>
+      </w:r>
+      <w:r>
+        <w:rPr>
+          <w:rFonts w:cs="Arial" w:hint="cs"/>
+          <w:rtl/>
+          <w:lang w:bidi="fa-IR"/>
+        </w:rPr>
+        <w:t>ی</w:t>
+      </w:r>
+      <w:r>
+        <w:rPr>
+          <w:rFonts w:cs="Arial"/>
+          <w:rtl/>
+          <w:lang w:bidi="fa-IR"/>
+        </w:rPr>
+        <w:t xml:space="preserve"> به تغ</w:t>
+      </w:r>
+      <w:r>
+        <w:rPr>
+          <w:rFonts w:cs="Arial" w:hint="cs"/>
+          <w:rtl/>
+          <w:lang w:bidi="fa-IR"/>
+        </w:rPr>
+        <w:t>یی</w:t>
+      </w:r>
+      <w:r>
+        <w:rPr>
+          <w:rFonts w:cs="Arial" w:hint="eastAsia"/>
+          <w:rtl/>
+          <w:lang w:bidi="fa-IR"/>
+        </w:rPr>
+        <w:t>ر</w:t>
+      </w:r>
+      <w:r>
+        <w:rPr>
+          <w:rFonts w:cs="Arial"/>
+          <w:rtl/>
+          <w:lang w:bidi="fa-IR"/>
+        </w:rPr>
+        <w:t xml:space="preserve"> کدها</w:t>
+      </w:r>
+      <w:r>
+        <w:rPr>
+          <w:rFonts w:cs="Arial" w:hint="cs"/>
+          <w:rtl/>
+          <w:lang w:bidi="fa-IR"/>
+        </w:rPr>
+        <w:t>ی</w:t>
+      </w:r>
+      <w:r>
+        <w:rPr>
+          <w:rFonts w:cs="Arial"/>
+          <w:rtl/>
+          <w:lang w:bidi="fa-IR"/>
+        </w:rPr>
+        <w:t xml:space="preserve"> قبل</w:t>
+      </w:r>
+      <w:r>
+        <w:rPr>
+          <w:rFonts w:cs="Arial" w:hint="cs"/>
+          <w:rtl/>
+          <w:lang w:bidi="fa-IR"/>
+        </w:rPr>
+        <w:t>ی</w:t>
+      </w:r>
+      <w:r>
+        <w:rPr>
+          <w:rFonts w:cs="Arial"/>
+          <w:rtl/>
+          <w:lang w:bidi="fa-IR"/>
+        </w:rPr>
+        <w:t xml:space="preserve"> ن</w:t>
+      </w:r>
+      <w:r>
+        <w:rPr>
+          <w:rFonts w:cs="Arial" w:hint="cs"/>
+          <w:rtl/>
+          <w:lang w:bidi="fa-IR"/>
+        </w:rPr>
+        <w:t>دارم.</w:t>
+      </w:r>
+      <w:r>
+        <w:rPr>
+          <w:rFonts w:cs="Arial" w:hint="cs"/>
+          <w:rtl/>
+          <w:lang w:bidi="fa-IR"/>
+        </w:rPr>
+        <w:t xml:space="preserve"> </w:t>
+      </w:r>
+    </w:p>
+    <w:p>
+      <w:pPr>
+        <w:jc w:val="right"/>
+        <w:rPr>
+          <w:color w:val="FF0000"/>
+          <w:lang w:bidi="fa-IR"/>
+        </w:rPr>
+      </w:pPr>
+      <w:r>
+        <w:rPr>
+          <w:color w:val="FF0000"/>
+          <w:lang w:bidi="fa-IR"/>
+        </w:rPr>
+        <w:t xml:space="preserve">. </w:t>
+      </w:r>
+      <w:r>
+        <w:rPr>
+          <w:rFonts w:hint="cs"/>
+          <w:color w:val="FF0000"/>
+          <w:rtl/>
+          <w:lang w:bidi="fa-IR"/>
+        </w:rPr>
+        <w:t xml:space="preserve">3 . </w:t>
+      </w:r>
+      <w:r>
+        <w:rPr>
+          <w:rFonts w:cs="Arial"/>
+          <w:color w:val="FF0000"/>
+          <w:rtl/>
+          <w:lang w:bidi="fa-IR"/>
+        </w:rPr>
+        <w:t>تحقق اصل عدم تکرار در برنامه‌نو</w:t>
+      </w:r>
+      <w:r>
+        <w:rPr>
+          <w:rFonts w:cs="Arial" w:hint="cs"/>
+          <w:color w:val="FF0000"/>
+          <w:rtl/>
+          <w:lang w:bidi="fa-IR"/>
+        </w:rPr>
+        <w:t>ی</w:t>
+      </w:r>
+      <w:r>
+        <w:rPr>
+          <w:rFonts w:cs="Arial" w:hint="eastAsia"/>
+          <w:color w:val="FF0000"/>
+          <w:rtl/>
+          <w:lang w:bidi="fa-IR"/>
+        </w:rPr>
+        <w:t>س</w:t>
+      </w:r>
+      <w:r>
+        <w:rPr>
+          <w:rFonts w:cs="Arial" w:hint="cs"/>
+          <w:color w:val="FF0000"/>
+          <w:rtl/>
+          <w:lang w:bidi="fa-IR"/>
+        </w:rPr>
+        <w:t>ی</w:t>
+      </w:r>
+    </w:p>
+    <w:p>
+      <w:pPr>
+        <w:jc w:val="right"/>
+        <w:rPr>
+          <w:lang w:bidi="fa-IR"/>
+        </w:rPr>
+      </w:pPr>
+      <w:r>
+        <w:rPr>
+          <w:rFonts w:cs="Arial" w:hint="eastAsia"/>
+          <w:rtl/>
+          <w:lang w:bidi="fa-IR"/>
+        </w:rPr>
+        <w:t>تکرار</w:t>
+      </w:r>
+      <w:r>
+        <w:rPr>
+          <w:rFonts w:cs="Arial"/>
+          <w:rtl/>
+          <w:lang w:bidi="fa-IR"/>
+        </w:rPr>
+        <w:t xml:space="preserve"> کدها</w:t>
+      </w:r>
+      <w:r>
+        <w:rPr>
+          <w:rFonts w:cs="Arial" w:hint="cs"/>
+          <w:rtl/>
+          <w:lang w:bidi="fa-IR"/>
+        </w:rPr>
+        <w:t>ی</w:t>
+      </w:r>
+      <w:r>
+        <w:rPr>
+          <w:rFonts w:cs="Arial"/>
+          <w:rtl/>
+          <w:lang w:bidi="fa-IR"/>
+        </w:rPr>
+        <w:t xml:space="preserve"> مشابه در پروژه‌ها</w:t>
+      </w:r>
+      <w:r>
+        <w:rPr>
+          <w:rFonts w:cs="Arial" w:hint="cs"/>
+          <w:rtl/>
+          <w:lang w:bidi="fa-IR"/>
+        </w:rPr>
+        <w:t>ی</w:t>
+      </w:r>
+      <w:r>
+        <w:rPr>
+          <w:rFonts w:cs="Arial"/>
+          <w:rtl/>
+          <w:lang w:bidi="fa-IR"/>
+        </w:rPr>
+        <w:t xml:space="preserve"> بزرگ، احتمال خطا را به شدت بالا م</w:t>
+      </w:r>
+      <w:r>
+        <w:rPr>
+          <w:rFonts w:cs="Arial" w:hint="cs"/>
+          <w:rtl/>
+          <w:lang w:bidi="fa-IR"/>
+        </w:rPr>
+        <w:t>ی‌</w:t>
+      </w:r>
+      <w:r>
+        <w:rPr>
+          <w:rFonts w:cs="Arial" w:hint="eastAsia"/>
+          <w:rtl/>
+          <w:lang w:bidi="fa-IR"/>
+        </w:rPr>
+        <w:t>برد</w:t>
+      </w:r>
+      <w:r>
+        <w:rPr>
+          <w:rFonts w:cs="Arial"/>
+          <w:rtl/>
+          <w:lang w:bidi="fa-IR"/>
+        </w:rPr>
+        <w:t>. در ا</w:t>
+      </w:r>
+      <w:r>
+        <w:rPr>
+          <w:rFonts w:cs="Arial" w:hint="cs"/>
+          <w:rtl/>
+          <w:lang w:bidi="fa-IR"/>
+        </w:rPr>
+        <w:t>ی</w:t>
+      </w:r>
+      <w:r>
+        <w:rPr>
+          <w:rFonts w:cs="Arial" w:hint="eastAsia"/>
+          <w:rtl/>
+          <w:lang w:bidi="fa-IR"/>
+        </w:rPr>
+        <w:t>ن</w:t>
+      </w:r>
+      <w:r>
+        <w:rPr>
+          <w:rFonts w:cs="Arial"/>
+          <w:rtl/>
+          <w:lang w:bidi="fa-IR"/>
+        </w:rPr>
+        <w:t xml:space="preserve"> پروژه با </w:t>
+      </w:r>
+      <w:r>
+        <w:rPr>
+          <w:rFonts w:cs="Arial"/>
+          <w:color w:val="FF0000"/>
+          <w:rtl/>
+          <w:lang w:bidi="fa-IR"/>
+        </w:rPr>
+        <w:t>دو</w:t>
+      </w:r>
+      <w:r>
+        <w:rPr>
+          <w:rFonts w:cs="Arial"/>
+          <w:rtl/>
+          <w:lang w:bidi="fa-IR"/>
+        </w:rPr>
+        <w:t xml:space="preserve"> تکن</w:t>
+      </w:r>
+      <w:r>
+        <w:rPr>
+          <w:rFonts w:cs="Arial" w:hint="cs"/>
+          <w:rtl/>
+          <w:lang w:bidi="fa-IR"/>
+        </w:rPr>
+        <w:t>ی</w:t>
+      </w:r>
+      <w:r>
+        <w:rPr>
+          <w:rFonts w:cs="Arial" w:hint="eastAsia"/>
+          <w:rtl/>
+          <w:lang w:bidi="fa-IR"/>
+        </w:rPr>
+        <w:t>ک</w:t>
+      </w:r>
+      <w:r>
+        <w:rPr>
+          <w:rFonts w:cs="Arial"/>
+          <w:rtl/>
+          <w:lang w:bidi="fa-IR"/>
+        </w:rPr>
+        <w:t xml:space="preserve"> از تکرار جلوگ</w:t>
+      </w:r>
+      <w:r>
+        <w:rPr>
+          <w:rFonts w:cs="Arial" w:hint="cs"/>
+          <w:rtl/>
+          <w:lang w:bidi="fa-IR"/>
+        </w:rPr>
+        <w:t>ی</w:t>
+      </w:r>
+      <w:r>
+        <w:rPr>
+          <w:rFonts w:cs="Arial" w:hint="eastAsia"/>
+          <w:rtl/>
+          <w:lang w:bidi="fa-IR"/>
+        </w:rPr>
+        <w:t>ر</w:t>
+      </w:r>
+      <w:r>
+        <w:rPr>
+          <w:rFonts w:cs="Arial" w:hint="cs"/>
+          <w:rtl/>
+          <w:lang w:bidi="fa-IR"/>
+        </w:rPr>
+        <w:t>ی</w:t>
+      </w:r>
+      <w:r>
+        <w:rPr>
+          <w:rFonts w:cs="Arial"/>
+          <w:rtl/>
+          <w:lang w:bidi="fa-IR"/>
+        </w:rPr>
+        <w:t xml:space="preserve"> </w:t>
+      </w:r>
+      <w:r>
+        <w:rPr>
+          <w:rFonts w:cs="Arial" w:hint="cs"/>
+          <w:rtl/>
+          <w:lang w:bidi="fa-IR"/>
+        </w:rPr>
+        <w:t>کردم</w:t>
+      </w:r>
+      <w:r>
+        <w:rPr>
+          <w:rFonts w:cs="Arial" w:hint="cs"/>
+          <w:rtl/>
+          <w:lang w:bidi="fa-IR"/>
+        </w:rPr>
+        <w:t>:</w:t>
+      </w:r>
+      <w:r>
+        <w:rPr>
+          <w:rFonts w:cs="Arial" w:hint="cs"/>
+          <w:rtl/>
+          <w:lang w:bidi="fa-IR"/>
+        </w:rPr>
+        <w:t xml:space="preserve"> </w:t>
+      </w:r>
+    </w:p>
+    <w:p>
+      <w:pPr>
+        <w:jc w:val="right"/>
+        <w:rPr>
+          <w:lang w:bidi="fa-IR"/>
+        </w:rPr>
+      </w:pPr>
+      <w:r>
+        <w:rPr>
+          <w:rFonts w:cs="Arial"/>
+          <w:rtl/>
+          <w:lang w:bidi="fa-IR"/>
+        </w:rPr>
+        <w:t>تخصص</w:t>
+      </w:r>
+      <w:r>
+        <w:rPr>
+          <w:rFonts w:cs="Arial" w:hint="cs"/>
+          <w:rtl/>
+          <w:lang w:bidi="fa-IR"/>
+        </w:rPr>
+        <w:t>ی</w:t>
+      </w:r>
+      <w:r>
+        <w:rPr>
+          <w:rFonts w:cs="Arial"/>
+          <w:rtl/>
+          <w:lang w:bidi="fa-IR"/>
+        </w:rPr>
+        <w:t xml:space="preserve"> کردن وظا</w:t>
+      </w:r>
+      <w:r>
+        <w:rPr>
+          <w:rFonts w:cs="Arial" w:hint="cs"/>
+          <w:rtl/>
+          <w:lang w:bidi="fa-IR"/>
+        </w:rPr>
+        <w:t>ی</w:t>
+      </w:r>
+      <w:r>
+        <w:rPr>
+          <w:rFonts w:cs="Arial" w:hint="eastAsia"/>
+          <w:rtl/>
+          <w:lang w:bidi="fa-IR"/>
+        </w:rPr>
+        <w:t>ف</w:t>
+      </w:r>
+      <w:r>
+        <w:rPr>
+          <w:rFonts w:cs="Arial" w:hint="cs"/>
+          <w:rtl/>
+          <w:lang w:bidi="fa-IR"/>
+        </w:rPr>
+        <w:t xml:space="preserve"> </w:t>
+      </w:r>
+      <w:r>
+        <w:rPr>
+          <w:rFonts w:cs="Arial"/>
+          <w:rtl/>
+          <w:lang w:bidi="fa-IR"/>
+        </w:rPr>
+        <w:t>: عمل</w:t>
+      </w:r>
+      <w:r>
+        <w:rPr>
+          <w:rFonts w:cs="Arial" w:hint="cs"/>
+          <w:rtl/>
+          <w:lang w:bidi="fa-IR"/>
+        </w:rPr>
+        <w:t>ی</w:t>
+      </w:r>
+      <w:r>
+        <w:rPr>
+          <w:rFonts w:cs="Arial" w:hint="eastAsia"/>
+          <w:rtl/>
+          <w:lang w:bidi="fa-IR"/>
+        </w:rPr>
+        <w:t>ات</w:t>
+      </w:r>
+      <w:r>
+        <w:rPr>
+          <w:rFonts w:cs="Arial"/>
+          <w:rtl/>
+          <w:lang w:bidi="fa-IR"/>
+        </w:rPr>
+        <w:t xml:space="preserve"> خواندن و نوشتن رو</w:t>
+      </w:r>
+      <w:r>
+        <w:rPr>
+          <w:rFonts w:cs="Arial" w:hint="cs"/>
+          <w:rtl/>
+          <w:lang w:bidi="fa-IR"/>
+        </w:rPr>
+        <w:t>ی</w:t>
+      </w:r>
+      <w:r>
+        <w:rPr>
+          <w:rFonts w:cs="Arial"/>
+          <w:rtl/>
+          <w:lang w:bidi="fa-IR"/>
+        </w:rPr>
+        <w:t xml:space="preserve"> حافظه، محاسبات آمار</w:t>
+      </w:r>
+      <w:r>
+        <w:rPr>
+          <w:rFonts w:cs="Arial" w:hint="cs"/>
+          <w:rtl/>
+          <w:lang w:bidi="fa-IR"/>
+        </w:rPr>
+        <w:t>ی</w:t>
+      </w:r>
+      <w:r>
+        <w:rPr>
+          <w:rFonts w:cs="Arial"/>
+          <w:rtl/>
+          <w:lang w:bidi="fa-IR"/>
+        </w:rPr>
+        <w:t xml:space="preserve"> و رسم نمودارها هر کدام به کلاس‌ها</w:t>
+      </w:r>
+      <w:r>
+        <w:rPr>
+          <w:rFonts w:cs="Arial" w:hint="cs"/>
+          <w:rtl/>
+          <w:lang w:bidi="fa-IR"/>
+        </w:rPr>
+        <w:t>ی</w:t>
+      </w:r>
+      <w:r>
+        <w:rPr>
+          <w:rFonts w:cs="Arial"/>
+          <w:rtl/>
+          <w:lang w:bidi="fa-IR"/>
+        </w:rPr>
+        <w:t xml:space="preserve"> مجزا واگذار </w:t>
+      </w:r>
+      <w:r>
+        <w:rPr>
+          <w:rFonts w:cs="Arial" w:hint="cs"/>
+          <w:rtl/>
+          <w:lang w:bidi="fa-IR"/>
+        </w:rPr>
+        <w:t>کردم</w:t>
+      </w:r>
+      <w:r>
+        <w:rPr>
+          <w:rFonts w:cs="Arial"/>
+          <w:rtl/>
+          <w:lang w:bidi="fa-IR"/>
+        </w:rPr>
+        <w:t xml:space="preserve"> تا </w:t>
+      </w:r>
+      <w:r>
+        <w:rPr>
+          <w:rFonts w:cs="Arial" w:hint="cs"/>
+          <w:rtl/>
+          <w:lang w:bidi="fa-IR"/>
+        </w:rPr>
+        <w:t>ی</w:t>
+      </w:r>
+      <w:r>
+        <w:rPr>
+          <w:rFonts w:cs="Arial" w:hint="eastAsia"/>
+          <w:rtl/>
+          <w:lang w:bidi="fa-IR"/>
+        </w:rPr>
+        <w:t>ک</w:t>
+      </w:r>
+      <w:r>
+        <w:rPr>
+          <w:rFonts w:cs="Arial"/>
+          <w:rtl/>
+          <w:lang w:bidi="fa-IR"/>
+        </w:rPr>
+        <w:t xml:space="preserve"> کد بارها در بخش‌ها</w:t>
+      </w:r>
+      <w:r>
+        <w:rPr>
+          <w:rFonts w:cs="Arial" w:hint="cs"/>
+          <w:rtl/>
+          <w:lang w:bidi="fa-IR"/>
+        </w:rPr>
+        <w:t>ی</w:t>
+      </w:r>
+      <w:r>
+        <w:rPr>
+          <w:rFonts w:cs="Arial"/>
+          <w:rtl/>
+          <w:lang w:bidi="fa-IR"/>
+        </w:rPr>
+        <w:t xml:space="preserve"> مختلف </w:t>
+      </w:r>
+      <w:r>
+        <w:rPr>
+          <w:rFonts w:cs="Arial"/>
+          <w:color w:val="FF0000"/>
+          <w:rtl/>
+          <w:lang w:bidi="fa-IR"/>
+        </w:rPr>
+        <w:t>تکرار نشود</w:t>
+      </w:r>
+      <w:r>
+        <w:rPr>
+          <w:rFonts w:cs="Arial" w:hint="cs"/>
+          <w:rtl/>
+          <w:lang w:bidi="fa-IR"/>
+        </w:rPr>
+        <w:t xml:space="preserve"> . </w:t>
+      </w:r>
+    </w:p>
+    <w:p>
+      <w:pPr>
+        <w:jc w:val="right"/>
+        <w:rPr>
+          <w:lang w:bidi="fa-IR"/>
+        </w:rPr>
+      </w:pPr>
+      <w:r>
+        <w:rPr>
+          <w:rFonts w:cs="Arial"/>
+          <w:rtl/>
+          <w:lang w:bidi="fa-IR"/>
+        </w:rPr>
+        <w:t>حلقه‌ها</w:t>
+      </w:r>
+      <w:r>
+        <w:rPr>
+          <w:rFonts w:cs="Arial" w:hint="cs"/>
+          <w:rtl/>
+          <w:lang w:bidi="fa-IR"/>
+        </w:rPr>
+        <w:t>ی</w:t>
+      </w:r>
+      <w:r>
+        <w:rPr>
+          <w:rFonts w:cs="Arial"/>
+          <w:rtl/>
+          <w:lang w:bidi="fa-IR"/>
+        </w:rPr>
+        <w:t xml:space="preserve"> پو</w:t>
+      </w:r>
+      <w:r>
+        <w:rPr>
+          <w:rFonts w:cs="Arial" w:hint="cs"/>
+          <w:rtl/>
+          <w:lang w:bidi="fa-IR"/>
+        </w:rPr>
+        <w:t>ی</w:t>
+      </w:r>
+      <w:r>
+        <w:rPr>
+          <w:rFonts w:cs="Arial" w:hint="eastAsia"/>
+          <w:rtl/>
+          <w:lang w:bidi="fa-IR"/>
+        </w:rPr>
+        <w:t>ا</w:t>
+      </w:r>
+      <w:r>
+        <w:rPr>
+          <w:rFonts w:cs="Arial"/>
+          <w:rtl/>
+          <w:lang w:bidi="fa-IR"/>
+        </w:rPr>
+        <w:t xml:space="preserve"> در محاسبات: در بخش محاسبات همبستگ</w:t>
+      </w:r>
+      <w:r>
+        <w:rPr>
+          <w:rFonts w:cs="Arial" w:hint="cs"/>
+          <w:rtl/>
+          <w:lang w:bidi="fa-IR"/>
+        </w:rPr>
+        <w:t>ی</w:t>
+      </w:r>
+      <w:r>
+        <w:rPr>
+          <w:rFonts w:cs="Arial"/>
+          <w:rtl/>
+          <w:lang w:bidi="fa-IR"/>
+        </w:rPr>
+        <w:t xml:space="preserve"> و</w:t>
+      </w:r>
+      <w:r>
+        <w:rPr>
+          <w:rFonts w:cs="Arial" w:hint="cs"/>
+          <w:rtl/>
+          <w:lang w:bidi="fa-IR"/>
+        </w:rPr>
+        <w:t>ی</w:t>
+      </w:r>
+      <w:r>
+        <w:rPr>
+          <w:rFonts w:cs="Arial" w:hint="eastAsia"/>
+          <w:rtl/>
+          <w:lang w:bidi="fa-IR"/>
+        </w:rPr>
+        <w:t>ژگ</w:t>
+      </w:r>
+      <w:r>
+        <w:rPr>
+          <w:rFonts w:cs="Arial" w:hint="cs"/>
+          <w:rtl/>
+          <w:lang w:bidi="fa-IR"/>
+        </w:rPr>
+        <w:t>ی‌</w:t>
+      </w:r>
+      <w:r>
+        <w:rPr>
+          <w:rFonts w:cs="Arial" w:hint="eastAsia"/>
+          <w:rtl/>
+          <w:lang w:bidi="fa-IR"/>
+        </w:rPr>
+        <w:t>ها</w:t>
+      </w:r>
+      <w:r>
+        <w:rPr>
+          <w:rFonts w:cs="Arial" w:hint="cs"/>
+          <w:rtl/>
+          <w:lang w:bidi="fa-IR"/>
+        </w:rPr>
+        <w:t>ی</w:t>
+      </w:r>
+      <w:r>
+        <w:rPr>
+          <w:rFonts w:cs="Arial"/>
+          <w:rtl/>
+          <w:lang w:bidi="fa-IR"/>
+        </w:rPr>
+        <w:t xml:space="preserve"> صوت</w:t>
+      </w:r>
+      <w:r>
+        <w:rPr>
+          <w:rFonts w:cs="Arial" w:hint="cs"/>
+          <w:rtl/>
+          <w:lang w:bidi="fa-IR"/>
+        </w:rPr>
+        <w:t>ی</w:t>
+      </w:r>
+      <w:r>
+        <w:rPr>
+          <w:rFonts w:cs="Arial" w:hint="eastAsia"/>
+          <w:rtl/>
+          <w:lang w:bidi="fa-IR"/>
+        </w:rPr>
+        <w:t>،</w:t>
+      </w:r>
+      <w:r>
+        <w:rPr>
+          <w:rFonts w:cs="Arial"/>
+          <w:rtl/>
+          <w:lang w:bidi="fa-IR"/>
+        </w:rPr>
+        <w:t xml:space="preserve"> به جا</w:t>
+      </w:r>
+      <w:r>
+        <w:rPr>
+          <w:rFonts w:cs="Arial" w:hint="cs"/>
+          <w:rtl/>
+          <w:lang w:bidi="fa-IR"/>
+        </w:rPr>
+        <w:t>ی</w:t>
+      </w:r>
+      <w:r>
+        <w:rPr>
+          <w:rFonts w:cs="Arial"/>
+          <w:rtl/>
+          <w:lang w:bidi="fa-IR"/>
+        </w:rPr>
+        <w:t xml:space="preserve"> نوشتن فرمول‌ها</w:t>
+      </w:r>
+      <w:r>
+        <w:rPr>
+          <w:rFonts w:cs="Arial" w:hint="cs"/>
+          <w:rtl/>
+          <w:lang w:bidi="fa-IR"/>
+        </w:rPr>
+        <w:t>ی</w:t>
+      </w:r>
+      <w:r>
+        <w:rPr>
+          <w:rFonts w:cs="Arial"/>
+          <w:rtl/>
+          <w:lang w:bidi="fa-IR"/>
+        </w:rPr>
+        <w:t xml:space="preserve"> تکرار</w:t>
+      </w:r>
+      <w:r>
+        <w:rPr>
+          <w:rFonts w:cs="Arial" w:hint="cs"/>
+          <w:rtl/>
+          <w:lang w:bidi="fa-IR"/>
+        </w:rPr>
+        <w:t>ی</w:t>
+      </w:r>
+      <w:r>
+        <w:rPr>
+          <w:rFonts w:cs="Arial"/>
+          <w:rtl/>
+          <w:lang w:bidi="fa-IR"/>
+        </w:rPr>
+        <w:t xml:space="preserve"> برا</w:t>
+      </w:r>
+      <w:r>
+        <w:rPr>
+          <w:rFonts w:cs="Arial" w:hint="cs"/>
+          <w:rtl/>
+          <w:lang w:bidi="fa-IR"/>
+        </w:rPr>
+        <w:t>ی</w:t>
+      </w:r>
+      <w:r>
+        <w:rPr>
+          <w:rFonts w:cs="Arial"/>
+          <w:rtl/>
+          <w:lang w:bidi="fa-IR"/>
+        </w:rPr>
+        <w:t xml:space="preserve"> تک‌تک جفت‌و</w:t>
+      </w:r>
+      <w:r>
+        <w:rPr>
+          <w:rFonts w:cs="Arial" w:hint="cs"/>
+          <w:rtl/>
+          <w:lang w:bidi="fa-IR"/>
+        </w:rPr>
+        <w:t>ی</w:t>
+      </w:r>
+      <w:r>
+        <w:rPr>
+          <w:rFonts w:cs="Arial" w:hint="eastAsia"/>
+          <w:rtl/>
+          <w:lang w:bidi="fa-IR"/>
+        </w:rPr>
+        <w:t>ژگ</w:t>
+      </w:r>
+      <w:r>
+        <w:rPr>
+          <w:rFonts w:cs="Arial" w:hint="cs"/>
+          <w:rtl/>
+          <w:lang w:bidi="fa-IR"/>
+        </w:rPr>
+        <w:t>ی‌</w:t>
+      </w:r>
+      <w:r>
+        <w:rPr>
+          <w:rFonts w:cs="Arial" w:hint="eastAsia"/>
+          <w:rtl/>
+          <w:lang w:bidi="fa-IR"/>
+        </w:rPr>
+        <w:t>ها،</w:t>
+      </w:r>
+      <w:r>
+        <w:rPr>
+          <w:rFonts w:cs="Arial"/>
+          <w:rtl/>
+          <w:lang w:bidi="fa-IR"/>
+        </w:rPr>
+        <w:t xml:space="preserve"> از </w:t>
+      </w:r>
+      <w:r>
+        <w:rPr>
+          <w:rFonts w:cs="Arial"/>
+          <w:color w:val="FF0000"/>
+          <w:rtl/>
+          <w:lang w:bidi="fa-IR"/>
+        </w:rPr>
+        <w:t>حلقه‌ها</w:t>
+      </w:r>
+      <w:r>
+        <w:rPr>
+          <w:rFonts w:cs="Arial" w:hint="cs"/>
+          <w:color w:val="FF0000"/>
+          <w:rtl/>
+          <w:lang w:bidi="fa-IR"/>
+        </w:rPr>
+        <w:t>ی</w:t>
+      </w:r>
+      <w:r>
+        <w:rPr>
+          <w:rFonts w:cs="Arial"/>
+          <w:color w:val="FF0000"/>
+          <w:rtl/>
+          <w:lang w:bidi="fa-IR"/>
+        </w:rPr>
+        <w:t xml:space="preserve"> </w:t>
+      </w:r>
+      <w:r>
+        <w:rPr>
+          <w:rFonts w:cs="Arial" w:hint="cs"/>
+          <w:color w:val="FF0000"/>
+          <w:rtl/>
+          <w:lang w:bidi="fa-IR"/>
+        </w:rPr>
+        <w:t>تو در تو</w:t>
+      </w:r>
+      <w:r>
+        <w:rPr>
+          <w:rFonts w:cs="Arial"/>
+          <w:color w:val="FF0000"/>
+          <w:rtl/>
+          <w:lang w:bidi="fa-IR"/>
+        </w:rPr>
+        <w:t xml:space="preserve"> </w:t>
+      </w:r>
+      <w:r>
+        <w:rPr>
+          <w:rFonts w:cs="Arial"/>
+          <w:rtl/>
+          <w:lang w:bidi="fa-IR"/>
+        </w:rPr>
+        <w:t>رو</w:t>
+      </w:r>
+      <w:r>
+        <w:rPr>
+          <w:rFonts w:cs="Arial" w:hint="cs"/>
+          <w:rtl/>
+          <w:lang w:bidi="fa-IR"/>
+        </w:rPr>
+        <w:t>ی</w:t>
+      </w:r>
+      <w:r>
+        <w:rPr>
+          <w:rFonts w:cs="Arial"/>
+          <w:rtl/>
+          <w:lang w:bidi="fa-IR"/>
+        </w:rPr>
+        <w:t xml:space="preserve"> ل</w:t>
+      </w:r>
+      <w:r>
+        <w:rPr>
+          <w:rFonts w:cs="Arial" w:hint="cs"/>
+          <w:rtl/>
+          <w:lang w:bidi="fa-IR"/>
+        </w:rPr>
+        <w:t>ی</w:t>
+      </w:r>
+      <w:r>
+        <w:rPr>
+          <w:rFonts w:cs="Arial" w:hint="eastAsia"/>
+          <w:rtl/>
+          <w:lang w:bidi="fa-IR"/>
+        </w:rPr>
+        <w:t>ست</w:t>
+      </w:r>
+      <w:r>
+        <w:rPr>
+          <w:rFonts w:cs="Arial"/>
+          <w:rtl/>
+          <w:lang w:bidi="fa-IR"/>
+        </w:rPr>
+        <w:t xml:space="preserve"> و</w:t>
+      </w:r>
+      <w:r>
+        <w:rPr>
+          <w:rFonts w:cs="Arial" w:hint="cs"/>
+          <w:rtl/>
+          <w:lang w:bidi="fa-IR"/>
+        </w:rPr>
+        <w:t>ی</w:t>
+      </w:r>
+      <w:r>
+        <w:rPr>
+          <w:rFonts w:cs="Arial" w:hint="eastAsia"/>
+          <w:rtl/>
+          <w:lang w:bidi="fa-IR"/>
+        </w:rPr>
+        <w:t>ژگ</w:t>
+      </w:r>
+      <w:r>
+        <w:rPr>
+          <w:rFonts w:cs="Arial" w:hint="cs"/>
+          <w:rtl/>
+          <w:lang w:bidi="fa-IR"/>
+        </w:rPr>
+        <w:t>ی‌</w:t>
+      </w:r>
+      <w:r>
+        <w:rPr>
+          <w:rFonts w:cs="Arial" w:hint="eastAsia"/>
+          <w:rtl/>
+          <w:lang w:bidi="fa-IR"/>
+        </w:rPr>
+        <w:t>ها</w:t>
+      </w:r>
+      <w:r>
+        <w:rPr>
+          <w:rFonts w:cs="Arial"/>
+          <w:rtl/>
+          <w:lang w:bidi="fa-IR"/>
+        </w:rPr>
+        <w:t xml:space="preserve"> استفاده </w:t>
+      </w:r>
+      <w:r>
+        <w:rPr>
+          <w:rFonts w:cs="Arial" w:hint="cs"/>
+          <w:rtl/>
+          <w:lang w:bidi="fa-IR"/>
+        </w:rPr>
+        <w:t>کردم</w:t>
+      </w:r>
+      <w:r>
+        <w:rPr>
+          <w:rFonts w:cs="Arial"/>
+          <w:rtl/>
+          <w:lang w:bidi="fa-IR"/>
+        </w:rPr>
+        <w:t>. ا</w:t>
+      </w:r>
+      <w:r>
+        <w:rPr>
+          <w:rFonts w:cs="Arial" w:hint="cs"/>
+          <w:rtl/>
+          <w:lang w:bidi="fa-IR"/>
+        </w:rPr>
+        <w:t>ی</w:t>
+      </w:r>
+      <w:r>
+        <w:rPr>
+          <w:rFonts w:cs="Arial" w:hint="eastAsia"/>
+          <w:rtl/>
+          <w:lang w:bidi="fa-IR"/>
+        </w:rPr>
+        <w:t>ن</w:t>
+      </w:r>
+      <w:r>
+        <w:rPr>
+          <w:rFonts w:cs="Arial"/>
+          <w:rtl/>
+          <w:lang w:bidi="fa-IR"/>
+        </w:rPr>
+        <w:t xml:space="preserve"> کار باعث شد </w:t>
+      </w:r>
+      <w:r>
+        <w:rPr>
+          <w:rFonts w:cs="Arial"/>
+          <w:color w:val="FF0000"/>
+          <w:rtl/>
+          <w:lang w:bidi="fa-IR"/>
+        </w:rPr>
+        <w:t>محاسبات تمام شاخص‌ها</w:t>
+      </w:r>
+      <w:r>
+        <w:rPr>
+          <w:rFonts w:cs="Arial"/>
+          <w:rtl/>
+          <w:lang w:bidi="fa-IR"/>
+        </w:rPr>
+        <w:t xml:space="preserve"> تنها در چند خط کوتاه و پو</w:t>
+      </w:r>
+      <w:r>
+        <w:rPr>
+          <w:rFonts w:cs="Arial" w:hint="cs"/>
+          <w:rtl/>
+          <w:lang w:bidi="fa-IR"/>
+        </w:rPr>
+        <w:t>ی</w:t>
+      </w:r>
+      <w:r>
+        <w:rPr>
+          <w:rFonts w:cs="Arial" w:hint="eastAsia"/>
+          <w:rtl/>
+          <w:lang w:bidi="fa-IR"/>
+        </w:rPr>
+        <w:t>ا</w:t>
+      </w:r>
+      <w:r>
+        <w:rPr>
+          <w:rFonts w:cs="Arial"/>
+          <w:rtl/>
+          <w:lang w:bidi="fa-IR"/>
+        </w:rPr>
+        <w:t xml:space="preserve"> انجام شود</w:t>
+      </w:r>
+      <w:r>
+        <w:rPr>
+          <w:rFonts w:hint="cs"/>
+          <w:rtl/>
+          <w:lang w:bidi="fa-IR"/>
+        </w:rPr>
+        <w:t xml:space="preserve"> . </w:t>
+      </w:r>
+    </w:p>
+    <w:p>
+      <w:pPr>
+        <w:rPr>
+          <w:lang w:bidi="fa-IR"/>
+        </w:rPr>
+      </w:pPr>
+    </w:p>
+    <w:p>
+      <w:pPr>
+        <w:rPr>
+          <w:rtl/>
+          <w:lang w:bidi="fa-IR"/>
+        </w:rPr>
+      </w:pPr>
+    </w:p>
+    <w:p>
+      <w:pPr>
+        <w:rPr>
+          <w:lang w:bidi="fa-IR"/>
+        </w:rPr>
+      </w:pPr>
+      <w:r>
+        <w:rPr>
+          <w:rFonts w:hint="cs"/>
+          <w:rtl/>
+          <w:lang w:bidi="fa-IR"/>
+        </w:rPr>
+        <w:t>.........................................................................................................................................................</w:t>
+      </w:r>
     </w:p>
     <w:p>
       <w:pPr>
@@ -3523,6 +7501,14 @@
         </w:rPr>
         <w:t>با تشکر</w:t>
       </w:r>
+      <w:r>
+        <w:rPr>
+          <w:rFonts w:hint="cs"/>
+          <w:rtl/>
+          <w:lang w:bidi="fa-IR"/>
+        </w:rPr>
+        <w:t xml:space="preserve"> و سپاس</w:t>
+      </w:r>
     </w:p>
     <w:p>
       <w:pPr>
@@ -3539,6 +7525,14 @@
           <w:lang w:bidi="fa-IR"/>
         </w:rPr>
         <w:t xml:space="preserve">امین امانی </w:t>
+      </w:r>
+      <w:r>
+        <w:rPr>
+          <w:rFonts w:hint="cs"/>
+          <w:rtl/>
+          <w:lang w:bidi="fa-IR"/>
+        </w:rPr>
+        <w:t>404442076</w:t>
       </w:r>
     </w:p>
     <w:p>

</xml_diff>